<commit_message>
build(dist): rebuild CD1/CD2 submission final docx — stale since 01aad57
CD sources updated in 12c8c76 (P8 status fix) and ad3aec9 (P7/ICRV references).
- CD1_submission_final.docx: 73KB→57KB (same content, reference template update)
- CD2_submission_final.docx: 57KB→790KB (now includes hinh_2_1/hinh_2_2 figures)

Rebuilt using --resource-path=. from chuyen_de/cd2/ for figure inclusion.

https://claude.ai/code/session_01GMFmEtt6FYiJ4MKzBNCLqb
</commit_message>
<xml_diff>
--- a/dist/submission_packages/cd2/CD2_submission_final.docx
+++ b/dist/submission_packages/cd2/CD2_submission_final.docx
@@ -1,1284 +1,8 @@
 
 <file path=word/document.xml><?xml version="1.0" encoding="utf-8"?>
-<w:document xmlns:wpc="http://schemas.microsoft.com/office/word/2010/wordprocessingCanvas" xmlns:mc="http://schemas.openxmlformats.org/markup-compatibility/2006" xmlns:o="urn:schemas-microsoft-com:office:office" xmlns:r="http://schemas.openxmlformats.org/officeDocument/2006/relationships" xmlns:m="http://schemas.openxmlformats.org/officeDocument/2006/math" xmlns:v="urn:schemas-microsoft-com:vml" xmlns:wp14="http://schemas.microsoft.com/office/word/2010/wordprocessingDrawing" xmlns:wp="http://schemas.openxmlformats.org/drawingml/2006/wordprocessingDrawing" xmlns:w="http://schemas.openxmlformats.org/wordprocessingml/2006/main" xmlns:w14="http://schemas.microsoft.com/office/word/2010/wordml" xmlns:w10="urn:schemas-microsoft-com:office:word" xmlns:w15="http://schemas.microsoft.com/office/word/2012/wordml" xmlns:wpg="http://schemas.microsoft.com/office/word/2010/wordprocessingGroup" xmlns:wpi="http://schemas.microsoft.com/office/word/2010/wordprocessingInk" xmlns:wne="http://schemas.microsoft.com/office/word/2006/wordml" xmlns:wps="http://schemas.microsoft.com/office/word/2010/wordprocessingShape" xmlns:wpsCustomData="http://www.wps.cn/officeDocument/2013/wpsCustomData" mc:Ignorable="w14 w15 wp14">
+<w:document xmlns:w="http://schemas.openxmlformats.org/wordprocessingml/2006/main" xmlns:m="http://schemas.openxmlformats.org/officeDocument/2006/math" xmlns:r="http://schemas.openxmlformats.org/officeDocument/2006/relationships" xmlns:o="urn:schemas-microsoft-com:office:office" xmlns:v="urn:schemas-microsoft-com:vml" xmlns:w10="urn:schemas-microsoft-com:office:word" xmlns:a="http://schemas.openxmlformats.org/drawingml/2006/main" xmlns:pic="http://schemas.openxmlformats.org/drawingml/2006/picture" xmlns:wp="http://schemas.openxmlformats.org/drawingml/2006/wordprocessingDrawing">
   <w:body>
-    <w:tbl>
-      <w:tblPr>
-        <w:tblStyle w:val="3"/>
-        <w:tblW w:w="9627" w:type="dxa"/>
-        <w:tblInd w:w="108" w:type="dxa"/>
-        <w:tblBorders>
-          <w:top w:val="single" w:color="auto" w:sz="4" w:space="0"/>
-          <w:left w:val="single" w:color="auto" w:sz="4" w:space="0"/>
-          <w:bottom w:val="single" w:color="auto" w:sz="4" w:space="0"/>
-          <w:right w:val="single" w:color="auto" w:sz="4" w:space="0"/>
-          <w:insideH w:val="single" w:color="auto" w:sz="4" w:space="0"/>
-          <w:insideV w:val="single" w:color="auto" w:sz="4" w:space="0"/>
-        </w:tblBorders>
-        <w:tblLayout w:type="autofit"/>
-        <w:tblCellMar>
-          <w:top w:w="0" w:type="dxa"/>
-          <w:left w:w="108" w:type="dxa"/>
-          <w:bottom w:w="0" w:type="dxa"/>
-          <w:right w:w="108" w:type="dxa"/>
-        </w:tblCellMar>
-      </w:tblPr>
-      <w:tblGrid>
-        <w:gridCol w:w="9627"/>
-      </w:tblGrid>
-      <w:tr>
-        <w:tblPrEx>
-          <w:tblBorders>
-            <w:top w:val="single" w:color="auto" w:sz="4" w:space="0"/>
-            <w:left w:val="single" w:color="auto" w:sz="4" w:space="0"/>
-            <w:bottom w:val="single" w:color="auto" w:sz="4" w:space="0"/>
-            <w:right w:val="single" w:color="auto" w:sz="4" w:space="0"/>
-            <w:insideH w:val="single" w:color="auto" w:sz="4" w:space="0"/>
-            <w:insideV w:val="single" w:color="auto" w:sz="4" w:space="0"/>
-          </w:tblBorders>
-          <w:tblCellMar>
-            <w:top w:w="0" w:type="dxa"/>
-            <w:left w:w="108" w:type="dxa"/>
-            <w:bottom w:w="0" w:type="dxa"/>
-            <w:right w:w="108" w:type="dxa"/>
-          </w:tblCellMar>
-        </w:tblPrEx>
-        <w:trPr>
-          <w:trHeight w:val="13989" w:hRule="atLeast"/>
-        </w:trPr>
-        <w:tc>
-          <w:tcPr>
-            <w:tcW w:w="9627" w:type="dxa"/>
-            <w:tcBorders>
-              <w:top w:val="thinThickSmallGap" w:color="auto" w:sz="24" w:space="0"/>
-              <w:left w:val="thinThickSmallGap" w:color="auto" w:sz="24" w:space="0"/>
-              <w:bottom w:val="thickThinSmallGap" w:color="auto" w:sz="24" w:space="0"/>
-              <w:right w:val="thickThinSmallGap" w:color="auto" w:sz="24" w:space="0"/>
-            </w:tcBorders>
-            <w:noWrap w:val="0"/>
-            <w:vAlign w:val="top"/>
-          </w:tcPr>
-          <w:p>
-            <w:pPr>
-              <w:spacing w:line="240" w:lineRule="auto"/>
-              <w:rPr>
-                <w:rFonts w:ascii="Times New Roman" w:hAnsi="Times New Roman" w:cs="Times New Roman"/>
-                <w:b/>
-                <w:sz w:val="32"/>
-                <w:szCs w:val="32"/>
-                <w:lang w:val="nl-NL"/>
-              </w:rPr>
-            </w:pPr>
-          </w:p>
-          <w:p>
-            <w:pPr>
-              <w:spacing w:after="0" w:line="240" w:lineRule="auto"/>
-              <w:jc w:val="center"/>
-              <w:rPr>
-                <w:rFonts w:ascii="Times New Roman" w:hAnsi="Times New Roman" w:cs="Times New Roman"/>
-                <w:sz w:val="26"/>
-                <w:szCs w:val="26"/>
-              </w:rPr>
-            </w:pPr>
-            <w:r>
-              <w:rPr>
-                <w:rFonts w:ascii="Times New Roman" w:hAnsi="Times New Roman" w:cs="Times New Roman"/>
-                <w:sz w:val="26"/>
-                <w:szCs w:val="26"/>
-              </w:rPr>
-              <w:t>BỘ GIÁO DỤC VÀ ĐÀO TẠO</w:t>
-            </w:r>
-          </w:p>
-          <w:p>
-            <w:pPr>
-              <w:spacing w:after="0" w:line="240" w:lineRule="auto"/>
-              <w:jc w:val="center"/>
-              <w:rPr>
-                <w:rFonts w:ascii="Times New Roman" w:hAnsi="Times New Roman" w:cs="Times New Roman"/>
-                <w:b/>
-                <w:sz w:val="26"/>
-                <w:szCs w:val="26"/>
-              </w:rPr>
-            </w:pPr>
-            <w:r>
-              <w:rPr>
-                <w:rFonts w:ascii="Times New Roman" w:hAnsi="Times New Roman" w:cs="Times New Roman"/>
-                <w:b/>
-                <w:sz w:val="26"/>
-                <w:szCs w:val="26"/>
-              </w:rPr>
-              <w:t>ĐẠI HỌC CẦN THƠ</w:t>
-            </w:r>
-          </w:p>
-          <w:p>
-            <w:pPr>
-              <w:keepNext/>
-              <w:spacing w:line="240" w:lineRule="auto"/>
-              <w:ind w:left="360"/>
-              <w:jc w:val="center"/>
-              <w:rPr>
-                <w:rFonts w:ascii="Times New Roman" w:hAnsi="Times New Roman" w:cs="Times New Roman"/>
-                <w:b/>
-                <w:bCs/>
-                <w:sz w:val="26"/>
-                <w:szCs w:val="26"/>
-              </w:rPr>
-            </w:pPr>
-          </w:p>
-          <w:p>
-            <w:pPr>
-              <w:keepNext/>
-              <w:spacing w:line="240" w:lineRule="auto"/>
-              <w:ind w:left="360"/>
-              <w:jc w:val="center"/>
-              <w:rPr>
-                <w:rFonts w:ascii="Times New Roman" w:hAnsi="Times New Roman" w:cs="Times New Roman"/>
-                <w:b/>
-                <w:bCs/>
-                <w:sz w:val="26"/>
-                <w:szCs w:val="26"/>
-              </w:rPr>
-            </w:pPr>
-          </w:p>
-          <w:p>
-            <w:pPr>
-              <w:keepNext/>
-              <w:spacing w:line="240" w:lineRule="auto"/>
-              <w:ind w:left="0" w:leftChars="0" w:firstLine="0" w:firstLineChars="0"/>
-              <w:jc w:val="both"/>
-              <w:rPr>
-                <w:rFonts w:ascii="Times New Roman" w:hAnsi="Times New Roman" w:cs="Times New Roman"/>
-                <w:b/>
-                <w:bCs/>
-                <w:sz w:val="26"/>
-                <w:szCs w:val="26"/>
-              </w:rPr>
-            </w:pPr>
-          </w:p>
-          <w:p>
-            <w:pPr>
-              <w:spacing w:after="0" w:line="240" w:lineRule="auto"/>
-              <w:ind w:left="360"/>
-              <w:jc w:val="center"/>
-              <w:rPr>
-                <w:rFonts w:ascii="Times New Roman" w:hAnsi="Times New Roman" w:cs="Times New Roman"/>
-                <w:i/>
-              </w:rPr>
-            </w:pPr>
-            <w:r>
-              <w:rPr>
-                <w:rFonts w:ascii="Times New Roman" w:hAnsi="Times New Roman" w:cs="Times New Roman"/>
-                <w:b/>
-                <w:sz w:val="28"/>
-              </w:rPr>
-              <w:t>ĐỖ THÙY HƯƠNG</w:t>
-            </w:r>
-          </w:p>
-          <w:p>
-            <w:pPr>
-              <w:keepNext/>
-              <w:spacing w:line="240" w:lineRule="auto"/>
-              <w:ind w:left="360"/>
-              <w:jc w:val="center"/>
-              <w:rPr>
-                <w:rFonts w:ascii="Times New Roman" w:hAnsi="Times New Roman" w:cs="Times New Roman"/>
-                <w:b/>
-                <w:bCs/>
-                <w:szCs w:val="26"/>
-              </w:rPr>
-            </w:pPr>
-          </w:p>
-          <w:p>
-            <w:pPr>
-              <w:keepNext/>
-              <w:spacing w:line="240" w:lineRule="auto"/>
-              <w:ind w:left="360"/>
-              <w:jc w:val="center"/>
-              <w:rPr>
-                <w:rFonts w:ascii="Times New Roman" w:hAnsi="Times New Roman" w:cs="Times New Roman"/>
-                <w:b/>
-                <w:bCs/>
-                <w:szCs w:val="26"/>
-              </w:rPr>
-            </w:pPr>
-          </w:p>
-          <w:p>
-            <w:pPr>
-              <w:keepNext/>
-              <w:spacing w:line="240" w:lineRule="auto"/>
-              <w:ind w:left="360"/>
-              <w:jc w:val="center"/>
-              <w:rPr>
-                <w:rFonts w:ascii="Times New Roman" w:hAnsi="Times New Roman" w:cs="Times New Roman"/>
-                <w:b/>
-                <w:bCs/>
-                <w:szCs w:val="26"/>
-              </w:rPr>
-            </w:pPr>
-          </w:p>
-          <w:p>
-            <w:pPr>
-              <w:keepNext/>
-              <w:spacing w:line="240" w:lineRule="auto"/>
-              <w:ind w:left="360"/>
-              <w:jc w:val="center"/>
-              <w:rPr>
-                <w:rFonts w:hint="default" w:ascii="Times New Roman" w:hAnsi="Times New Roman" w:cs="Times New Roman"/>
-                <w:b/>
-                <w:bCs/>
-                <w:sz w:val="39"/>
-                <w:szCs w:val="39"/>
-                <w:lang w:val="en-US"/>
-              </w:rPr>
-            </w:pPr>
-            <w:r>
-              <w:rPr>
-                <w:rFonts w:hint="default" w:cs="Times New Roman"/>
-                <w:b/>
-                <w:sz w:val="39"/>
-                <w:szCs w:val="39"/>
-                <w:highlight w:val="none"/>
-                <w:lang w:val="en-US"/>
-              </w:rPr>
-              <w:t xml:space="preserve">THỰC TRẠNG VỀ HIỆU QUẢ HOẠT ĐỘNG KINH DOANH CỦA </w:t>
-            </w:r>
-            <w:r>
-              <w:rPr>
-                <w:rFonts w:hint="default" w:cs="Times New Roman"/>
-                <w:b/>
-                <w:sz w:val="39"/>
-                <w:szCs w:val="39"/>
-                <w:highlight w:val="none"/>
-                <w:lang w:val="vi-VN"/>
-              </w:rPr>
-              <w:t xml:space="preserve">CÁC </w:t>
-            </w:r>
-            <w:bookmarkStart w:id="0" w:name="_GoBack"/>
-            <w:bookmarkEnd w:id="0"/>
-            <w:r>
-              <w:rPr>
-                <w:rFonts w:hint="default" w:cs="Times New Roman"/>
-                <w:b/>
-                <w:sz w:val="39"/>
-                <w:szCs w:val="39"/>
-                <w:highlight w:val="none"/>
-                <w:lang w:val="en-US"/>
-              </w:rPr>
-              <w:t>DOANH NGHIỆP Ở CHÂU Á</w:t>
-            </w:r>
-          </w:p>
-          <w:p>
-            <w:pPr>
-              <w:keepNext/>
-              <w:spacing w:line="240" w:lineRule="auto"/>
-              <w:ind w:left="360"/>
-              <w:jc w:val="center"/>
-              <w:rPr>
-                <w:rFonts w:ascii="Times New Roman" w:hAnsi="Times New Roman" w:cs="Times New Roman"/>
-                <w:b/>
-                <w:bCs/>
-                <w:szCs w:val="26"/>
-              </w:rPr>
-            </w:pPr>
-          </w:p>
-          <w:p>
-            <w:pPr>
-              <w:keepNext/>
-              <w:spacing w:line="240" w:lineRule="auto"/>
-              <w:ind w:left="360"/>
-              <w:jc w:val="center"/>
-              <w:rPr>
-                <w:rFonts w:ascii="Times New Roman" w:hAnsi="Times New Roman" w:cs="Times New Roman"/>
-                <w:b/>
-                <w:bCs/>
-                <w:szCs w:val="26"/>
-              </w:rPr>
-            </w:pPr>
-          </w:p>
-          <w:p>
-            <w:pPr>
-              <w:keepNext/>
-              <w:spacing w:line="240" w:lineRule="auto"/>
-              <w:ind w:left="360"/>
-              <w:jc w:val="center"/>
-              <w:rPr>
-                <w:rFonts w:ascii="Times New Roman" w:hAnsi="Times New Roman" w:cs="Times New Roman"/>
-                <w:b/>
-                <w:bCs/>
-                <w:szCs w:val="26"/>
-              </w:rPr>
-            </w:pPr>
-          </w:p>
-          <w:p>
-            <w:pPr>
-              <w:spacing w:after="0" w:line="240" w:lineRule="auto"/>
-              <w:ind w:left="-426" w:right="-397"/>
-              <w:jc w:val="center"/>
-              <w:rPr>
-                <w:rFonts w:hint="default" w:cs="Times New Roman"/>
-                <w:b/>
-                <w:sz w:val="28"/>
-                <w:lang w:val="en-US"/>
-              </w:rPr>
-            </w:pPr>
-            <w:r>
-              <w:rPr>
-                <w:rFonts w:hint="default" w:cs="Times New Roman"/>
-                <w:b/>
-                <w:sz w:val="28"/>
-                <w:lang w:val="en-US"/>
-              </w:rPr>
-              <w:t>CHUYÊN ĐỀ 1</w:t>
-            </w:r>
-          </w:p>
-          <w:p>
-            <w:pPr>
-              <w:spacing w:after="0" w:line="240" w:lineRule="auto"/>
-              <w:ind w:left="-426" w:right="-397"/>
-              <w:jc w:val="center"/>
-              <w:rPr>
-                <w:rFonts w:ascii="Times New Roman" w:hAnsi="Times New Roman" w:cs="Times New Roman"/>
-                <w:i/>
-                <w:sz w:val="26"/>
-                <w:szCs w:val="26"/>
-              </w:rPr>
-            </w:pPr>
-            <w:r>
-              <w:rPr>
-                <w:rFonts w:ascii="Times New Roman" w:hAnsi="Times New Roman" w:cs="Times New Roman"/>
-                <w:b/>
-                <w:sz w:val="28"/>
-              </w:rPr>
-              <w:t>NGÀNH QUẢN TRỊ KINH DOANH</w:t>
-            </w:r>
-          </w:p>
-          <w:p>
-            <w:pPr>
-              <w:spacing w:after="0" w:line="240" w:lineRule="auto"/>
-              <w:ind w:left="-426" w:right="-397"/>
-              <w:jc w:val="center"/>
-              <w:rPr>
-                <w:rFonts w:ascii="Times New Roman" w:hAnsi="Times New Roman" w:cs="Times New Roman"/>
-                <w:i/>
-                <w:sz w:val="26"/>
-                <w:szCs w:val="26"/>
-              </w:rPr>
-            </w:pPr>
-            <w:r>
-              <w:rPr>
-                <w:rFonts w:hint="default" w:ascii="Times New Roman" w:hAnsi="Times New Roman" w:cs="Times New Roman"/>
-                <w:b/>
-                <w:sz w:val="28"/>
-                <w:lang w:val="en-US"/>
-              </w:rPr>
-              <w:t xml:space="preserve">   </w:t>
-            </w:r>
-            <w:r>
-              <w:rPr>
-                <w:rFonts w:ascii="Times New Roman" w:hAnsi="Times New Roman" w:cs="Times New Roman"/>
-                <w:b/>
-                <w:sz w:val="28"/>
-              </w:rPr>
-              <w:t>MÃ SỐ 9340101</w:t>
-            </w:r>
-          </w:p>
-          <w:p>
-            <w:pPr>
-              <w:pStyle w:val="4"/>
-              <w:keepNext/>
-              <w:spacing w:before="120" w:line="240" w:lineRule="auto"/>
-              <w:ind w:left="360" w:firstLine="360"/>
-              <w:jc w:val="center"/>
-              <w:rPr>
-                <w:rFonts w:ascii="Times New Roman" w:hAnsi="Times New Roman" w:cs="Times New Roman"/>
-              </w:rPr>
-            </w:pPr>
-          </w:p>
-          <w:p>
-            <w:pPr>
-              <w:keepNext/>
-              <w:spacing w:line="240" w:lineRule="auto"/>
-              <w:ind w:left="360"/>
-              <w:jc w:val="center"/>
-              <w:rPr>
-                <w:rFonts w:ascii="Times New Roman" w:hAnsi="Times New Roman" w:cs="Times New Roman"/>
-                <w:b/>
-                <w:bCs/>
-                <w:szCs w:val="26"/>
-              </w:rPr>
-            </w:pPr>
-          </w:p>
-          <w:p>
-            <w:pPr>
-              <w:keepNext/>
-              <w:spacing w:line="240" w:lineRule="auto"/>
-              <w:ind w:left="360"/>
-              <w:jc w:val="center"/>
-              <w:rPr>
-                <w:rFonts w:ascii="Times New Roman" w:hAnsi="Times New Roman" w:cs="Times New Roman"/>
-                <w:b/>
-                <w:bCs/>
-                <w:szCs w:val="26"/>
-              </w:rPr>
-            </w:pPr>
-          </w:p>
-          <w:p>
-            <w:pPr>
-              <w:keepNext/>
-              <w:spacing w:line="240" w:lineRule="auto"/>
-              <w:ind w:left="360"/>
-              <w:rPr>
-                <w:rFonts w:ascii="Times New Roman" w:hAnsi="Times New Roman" w:cs="Times New Roman"/>
-                <w:sz w:val="25"/>
-                <w:szCs w:val="25"/>
-              </w:rPr>
-            </w:pPr>
-            <w:r>
-              <w:rPr>
-                <w:rFonts w:ascii="Times New Roman" w:hAnsi="Times New Roman" w:cs="Times New Roman"/>
-                <w:b/>
-                <w:bCs/>
-                <w:sz w:val="25"/>
-                <w:szCs w:val="25"/>
-              </w:rPr>
-              <w:t>NGƯỜI HƯỚNG DẪN, ĐƠN VỊ CÔNG TÁC</w:t>
-            </w:r>
-          </w:p>
-          <w:p>
-            <w:pPr>
-              <w:keepNext/>
-              <w:spacing w:line="240" w:lineRule="auto"/>
-              <w:ind w:left="360" w:right="-514"/>
-              <w:rPr>
-                <w:rFonts w:ascii="Times New Roman" w:hAnsi="Times New Roman" w:cs="Times New Roman"/>
-                <w:sz w:val="25"/>
-                <w:szCs w:val="25"/>
-              </w:rPr>
-            </w:pPr>
-            <w:r>
-              <w:rPr>
-                <w:rFonts w:ascii="Times New Roman" w:hAnsi="Times New Roman" w:cs="Times New Roman"/>
-                <w:b/>
-                <w:bCs/>
-                <w:sz w:val="25"/>
-                <w:szCs w:val="25"/>
-              </w:rPr>
-              <w:t xml:space="preserve">TS. </w:t>
-            </w:r>
-            <w:r>
-              <w:rPr>
-                <w:rFonts w:hint="default" w:cs="Times New Roman"/>
-                <w:b/>
-                <w:bCs/>
-                <w:sz w:val="25"/>
-                <w:szCs w:val="25"/>
-                <w:lang w:val="en-US"/>
-              </w:rPr>
-              <w:t>NGUYỄN MINH CẢNH</w:t>
-            </w:r>
-            <w:r>
-              <w:rPr>
-                <w:rFonts w:ascii="Times New Roman" w:hAnsi="Times New Roman" w:cs="Times New Roman"/>
-                <w:b/>
-                <w:bCs/>
-                <w:sz w:val="25"/>
-                <w:szCs w:val="25"/>
-              </w:rPr>
-              <w:t>, TRƯỜNG KINH TẾ, ĐẠI HỌC CẦN THƠ</w:t>
-            </w:r>
-            <w:r>
-              <w:rPr>
-                <w:rFonts w:ascii="Times New Roman" w:hAnsi="Times New Roman" w:cs="Times New Roman"/>
-                <w:sz w:val="25"/>
-                <w:szCs w:val="25"/>
-              </w:rPr>
-              <w:t xml:space="preserve"> </w:t>
-            </w:r>
-          </w:p>
-          <w:p>
-            <w:pPr>
-              <w:keepNext/>
-              <w:spacing w:line="240" w:lineRule="auto"/>
-              <w:ind w:left="360"/>
-              <w:jc w:val="center"/>
-              <w:rPr>
-                <w:rFonts w:ascii="Times New Roman" w:hAnsi="Times New Roman" w:cs="Times New Roman"/>
-                <w:b/>
-                <w:bCs/>
-                <w:szCs w:val="26"/>
-              </w:rPr>
-            </w:pPr>
-          </w:p>
-          <w:p>
-            <w:pPr>
-              <w:pStyle w:val="4"/>
-              <w:keepNext/>
-              <w:spacing w:before="120" w:line="240" w:lineRule="auto"/>
-              <w:ind w:left="0" w:leftChars="0" w:firstLine="0" w:firstLineChars="0"/>
-              <w:jc w:val="both"/>
-              <w:rPr>
-                <w:rFonts w:ascii="Times New Roman" w:hAnsi="Times New Roman" w:cs="Times New Roman"/>
-                <w:b/>
-                <w:sz w:val="28"/>
-              </w:rPr>
-            </w:pPr>
-          </w:p>
-          <w:p>
-            <w:pPr>
-              <w:pStyle w:val="4"/>
-              <w:keepNext/>
-              <w:spacing w:before="120" w:line="240" w:lineRule="auto"/>
-              <w:ind w:left="360" w:firstLine="360"/>
-              <w:jc w:val="center"/>
-              <w:rPr>
-                <w:rFonts w:ascii="Times New Roman" w:hAnsi="Times New Roman" w:cs="Times New Roman"/>
-                <w:b/>
-                <w:sz w:val="28"/>
-              </w:rPr>
-            </w:pPr>
-          </w:p>
-          <w:p>
-            <w:pPr>
-              <w:pStyle w:val="4"/>
-              <w:keepNext/>
-              <w:spacing w:before="120" w:line="240" w:lineRule="auto"/>
-              <w:ind w:left="360" w:firstLine="360"/>
-              <w:jc w:val="both"/>
-              <w:rPr>
-                <w:rFonts w:ascii="Times New Roman" w:hAnsi="Times New Roman" w:cs="Times New Roman"/>
-                <w:b/>
-                <w:sz w:val="28"/>
-              </w:rPr>
-            </w:pPr>
-          </w:p>
-          <w:p>
-            <w:pPr>
-              <w:pStyle w:val="4"/>
-              <w:keepNext/>
-              <w:spacing w:before="120" w:line="240" w:lineRule="auto"/>
-              <w:ind w:left="360" w:firstLine="360"/>
-              <w:jc w:val="both"/>
-              <w:rPr>
-                <w:rFonts w:ascii="Times New Roman" w:hAnsi="Times New Roman" w:cs="Times New Roman"/>
-                <w:b/>
-                <w:sz w:val="28"/>
-              </w:rPr>
-            </w:pPr>
-          </w:p>
-          <w:p>
-            <w:pPr>
-              <w:pStyle w:val="4"/>
-              <w:keepNext/>
-              <w:spacing w:before="120" w:line="240" w:lineRule="auto"/>
-              <w:ind w:left="360" w:firstLine="360"/>
-              <w:jc w:val="both"/>
-              <w:rPr>
-                <w:rFonts w:ascii="Times New Roman" w:hAnsi="Times New Roman" w:cs="Times New Roman"/>
-                <w:b/>
-                <w:sz w:val="28"/>
-              </w:rPr>
-            </w:pPr>
-          </w:p>
-          <w:p>
-            <w:pPr>
-              <w:pStyle w:val="4"/>
-              <w:keepNext/>
-              <w:spacing w:before="120" w:line="240" w:lineRule="auto"/>
-              <w:ind w:left="0" w:leftChars="0" w:firstLine="0" w:firstLineChars="0"/>
-              <w:jc w:val="center"/>
-              <w:rPr>
-                <w:rFonts w:hint="default" w:ascii="Times New Roman" w:hAnsi="Times New Roman" w:cs="Times New Roman"/>
-                <w:lang w:val="en-US"/>
-              </w:rPr>
-            </w:pPr>
-            <w:r>
-              <w:rPr>
-                <w:rFonts w:ascii="Times New Roman" w:hAnsi="Times New Roman" w:cs="Times New Roman"/>
-                <w:b/>
-                <w:sz w:val="28"/>
-              </w:rPr>
-              <w:t>NĂM 202</w:t>
-            </w:r>
-            <w:r>
-              <w:rPr>
-                <w:rFonts w:hint="default" w:cs="Times New Roman"/>
-                <w:b/>
-                <w:sz w:val="28"/>
-                <w:lang w:val="en-US"/>
-              </w:rPr>
-              <w:t>5</w:t>
-            </w:r>
-          </w:p>
-          <w:p>
-            <w:pPr>
-              <w:spacing w:before="120" w:after="0" w:line="240" w:lineRule="auto"/>
-              <w:ind w:left="360"/>
-              <w:jc w:val="center"/>
-              <w:rPr>
-                <w:rFonts w:ascii="Times New Roman" w:hAnsi="Times New Roman" w:cs="Times New Roman"/>
-                <w:b/>
-                <w:sz w:val="28"/>
-                <w:szCs w:val="28"/>
-              </w:rPr>
-            </w:pPr>
-          </w:p>
-        </w:tc>
-      </w:tr>
-    </w:tbl>
-    <w:p>
-      <w:pPr>
-        <w:ind w:left="0" w:leftChars="0" w:firstLine="0" w:firstLineChars="0"/>
-        <w:rPr>
-          <w:rFonts w:hint="default"/>
-          <w:lang w:val="en-US"/>
-        </w:rPr>
-      </w:pPr>
-    </w:p>
-    <w:p>
-      <w:r>
-        <w:br w:type="page"/>
-      </w:r>
-    </w:p>
-    <w:tbl>
-      <w:tblPr>
-        <w:tblStyle w:val="3"/>
-        <w:tblW w:w="9627" w:type="dxa"/>
-        <w:tblInd w:w="108" w:type="dxa"/>
-        <w:tblBorders>
-          <w:top w:val="single" w:color="auto" w:sz="4" w:space="0"/>
-          <w:left w:val="single" w:color="auto" w:sz="4" w:space="0"/>
-          <w:bottom w:val="single" w:color="auto" w:sz="4" w:space="0"/>
-          <w:right w:val="single" w:color="auto" w:sz="4" w:space="0"/>
-          <w:insideH w:val="single" w:color="auto" w:sz="4" w:space="0"/>
-          <w:insideV w:val="single" w:color="auto" w:sz="4" w:space="0"/>
-        </w:tblBorders>
-        <w:tblLayout w:type="autofit"/>
-        <w:tblCellMar>
-          <w:top w:w="0" w:type="dxa"/>
-          <w:left w:w="108" w:type="dxa"/>
-          <w:bottom w:w="0" w:type="dxa"/>
-          <w:right w:w="108" w:type="dxa"/>
-        </w:tblCellMar>
-      </w:tblPr>
-      <w:tblGrid>
-        <w:gridCol w:w="9627"/>
-      </w:tblGrid>
-      <w:tr>
-        <w:tblPrEx>
-          <w:tblBorders>
-            <w:top w:val="single" w:color="auto" w:sz="4" w:space="0"/>
-            <w:left w:val="single" w:color="auto" w:sz="4" w:space="0"/>
-            <w:bottom w:val="single" w:color="auto" w:sz="4" w:space="0"/>
-            <w:right w:val="single" w:color="auto" w:sz="4" w:space="0"/>
-            <w:insideH w:val="single" w:color="auto" w:sz="4" w:space="0"/>
-            <w:insideV w:val="single" w:color="auto" w:sz="4" w:space="0"/>
-          </w:tblBorders>
-          <w:tblCellMar>
-            <w:top w:w="0" w:type="dxa"/>
-            <w:left w:w="108" w:type="dxa"/>
-            <w:bottom w:w="0" w:type="dxa"/>
-            <w:right w:w="108" w:type="dxa"/>
-          </w:tblCellMar>
-        </w:tblPrEx>
-        <w:trPr>
-          <w:trHeight w:val="13989" w:hRule="atLeast"/>
-        </w:trPr>
-        <w:tc>
-          <w:tcPr>
-            <w:tcW w:w="9627" w:type="dxa"/>
-            <w:tcBorders>
-              <w:top w:val="thinThickSmallGap" w:color="auto" w:sz="24" w:space="0"/>
-              <w:left w:val="thinThickSmallGap" w:color="auto" w:sz="24" w:space="0"/>
-              <w:bottom w:val="thickThinSmallGap" w:color="auto" w:sz="24" w:space="0"/>
-              <w:right w:val="thickThinSmallGap" w:color="auto" w:sz="24" w:space="0"/>
-            </w:tcBorders>
-            <w:noWrap w:val="0"/>
-            <w:vAlign w:val="top"/>
-          </w:tcPr>
-          <w:p>
-            <w:pPr>
-              <w:spacing w:line="240" w:lineRule="auto"/>
-              <w:rPr>
-                <w:rFonts w:ascii="Times New Roman" w:hAnsi="Times New Roman" w:cs="Times New Roman"/>
-                <w:b/>
-                <w:sz w:val="28"/>
-                <w:szCs w:val="28"/>
-                <w:lang w:val="nl-NL"/>
-              </w:rPr>
-            </w:pPr>
-          </w:p>
-          <w:p>
-            <w:pPr>
-              <w:spacing w:after="0" w:line="240" w:lineRule="auto"/>
-              <w:jc w:val="center"/>
-              <w:rPr>
-                <w:rFonts w:ascii="Times New Roman" w:hAnsi="Times New Roman" w:cs="Times New Roman"/>
-                <w:b w:val="0"/>
-                <w:bCs w:val="0"/>
-                <w:sz w:val="28"/>
-                <w:szCs w:val="28"/>
-              </w:rPr>
-            </w:pPr>
-            <w:r>
-              <w:rPr>
-                <w:rFonts w:ascii="Times New Roman" w:hAnsi="Times New Roman" w:cs="Times New Roman"/>
-                <w:b w:val="0"/>
-                <w:bCs w:val="0"/>
-                <w:sz w:val="28"/>
-                <w:szCs w:val="28"/>
-              </w:rPr>
-              <w:t>BỘ GIÁO DỤC VÀ ĐÀO TẠO</w:t>
-            </w:r>
-          </w:p>
-          <w:p>
-            <w:pPr>
-              <w:spacing w:after="0" w:line="240" w:lineRule="auto"/>
-              <w:jc w:val="center"/>
-              <w:rPr>
-                <w:rFonts w:ascii="Times New Roman" w:hAnsi="Times New Roman" w:cs="Times New Roman"/>
-                <w:b/>
-                <w:bCs/>
-                <w:sz w:val="28"/>
-                <w:szCs w:val="28"/>
-              </w:rPr>
-            </w:pPr>
-            <w:r>
-              <w:rPr>
-                <w:rFonts w:ascii="Times New Roman" w:hAnsi="Times New Roman" w:cs="Times New Roman"/>
-                <w:b/>
-                <w:bCs/>
-                <w:sz w:val="28"/>
-                <w:szCs w:val="28"/>
-              </w:rPr>
-              <w:t xml:space="preserve">ĐẠI </w:t>
-            </w:r>
-            <w:r>
-              <w:rPr>
-                <w:rFonts w:hint="default" w:cs="Times New Roman"/>
-                <w:b/>
-                <w:bCs/>
-                <w:sz w:val="28"/>
-                <w:szCs w:val="28"/>
-                <w:lang w:val="vi-VN"/>
-              </w:rPr>
-              <w:t>H</w:t>
-            </w:r>
-            <w:r>
-              <w:rPr>
-                <w:rFonts w:ascii="Times New Roman" w:hAnsi="Times New Roman" w:cs="Times New Roman"/>
-                <w:b/>
-                <w:bCs/>
-                <w:sz w:val="28"/>
-                <w:szCs w:val="28"/>
-              </w:rPr>
-              <w:t>ỌC CẦN THƠ</w:t>
-            </w:r>
-          </w:p>
-          <w:p>
-            <w:pPr>
-              <w:keepNext/>
-              <w:spacing w:line="240" w:lineRule="auto"/>
-              <w:ind w:left="360"/>
-              <w:jc w:val="center"/>
-              <w:rPr>
-                <w:rFonts w:ascii="Times New Roman" w:hAnsi="Times New Roman" w:cs="Times New Roman"/>
-                <w:b/>
-                <w:bCs/>
-                <w:sz w:val="26"/>
-                <w:szCs w:val="26"/>
-              </w:rPr>
-            </w:pPr>
-          </w:p>
-          <w:p>
-            <w:pPr>
-              <w:keepNext/>
-              <w:spacing w:line="240" w:lineRule="auto"/>
-              <w:ind w:left="360"/>
-              <w:jc w:val="center"/>
-              <w:rPr>
-                <w:rFonts w:ascii="Times New Roman" w:hAnsi="Times New Roman" w:cs="Times New Roman"/>
-                <w:b/>
-                <w:bCs/>
-                <w:sz w:val="26"/>
-                <w:szCs w:val="26"/>
-              </w:rPr>
-            </w:pPr>
-          </w:p>
-          <w:p>
-            <w:pPr>
-              <w:keepNext/>
-              <w:spacing w:line="240" w:lineRule="auto"/>
-              <w:ind w:left="0" w:leftChars="0" w:firstLine="0" w:firstLineChars="0"/>
-              <w:jc w:val="center"/>
-              <w:rPr>
-                <w:rFonts w:ascii="Times New Roman" w:hAnsi="Times New Roman" w:cs="Times New Roman"/>
-                <w:b/>
-                <w:bCs/>
-                <w:sz w:val="28"/>
-                <w:szCs w:val="28"/>
-              </w:rPr>
-            </w:pPr>
-          </w:p>
-          <w:p>
-            <w:pPr>
-              <w:spacing w:after="0" w:line="240" w:lineRule="auto"/>
-              <w:ind w:left="360"/>
-              <w:jc w:val="center"/>
-              <w:rPr>
-                <w:rFonts w:ascii="Times New Roman" w:hAnsi="Times New Roman" w:cs="Times New Roman"/>
-                <w:i/>
-                <w:sz w:val="28"/>
-                <w:szCs w:val="28"/>
-              </w:rPr>
-            </w:pPr>
-            <w:r>
-              <w:rPr>
-                <w:rFonts w:ascii="Times New Roman" w:hAnsi="Times New Roman" w:cs="Times New Roman"/>
-                <w:b/>
-                <w:sz w:val="28"/>
-                <w:szCs w:val="28"/>
-              </w:rPr>
-              <w:t>ĐỖ THÙY HƯƠNG</w:t>
-            </w:r>
-          </w:p>
-          <w:p>
-            <w:pPr>
-              <w:keepNext/>
-              <w:spacing w:line="240" w:lineRule="auto"/>
-              <w:ind w:left="360"/>
-              <w:jc w:val="center"/>
-              <w:rPr>
-                <w:rFonts w:hint="default" w:ascii="Times New Roman" w:hAnsi="Times New Roman" w:cs="Times New Roman"/>
-                <w:b/>
-                <w:bCs/>
-                <w:sz w:val="28"/>
-                <w:szCs w:val="28"/>
-                <w:lang w:val="en-US"/>
-              </w:rPr>
-            </w:pPr>
-            <w:r>
-              <w:rPr>
-                <w:rFonts w:hint="default" w:cs="Times New Roman"/>
-                <w:b/>
-                <w:bCs/>
-                <w:sz w:val="28"/>
-                <w:szCs w:val="28"/>
-                <w:lang w:val="en-US"/>
-              </w:rPr>
-              <w:t>MÃ SỐ NCS: P1323001</w:t>
-            </w:r>
-          </w:p>
-          <w:p>
-            <w:pPr>
-              <w:keepNext/>
-              <w:spacing w:line="240" w:lineRule="auto"/>
-              <w:ind w:left="360"/>
-              <w:jc w:val="center"/>
-              <w:rPr>
-                <w:rFonts w:ascii="Times New Roman" w:hAnsi="Times New Roman" w:cs="Times New Roman"/>
-                <w:b/>
-                <w:bCs/>
-                <w:szCs w:val="26"/>
-              </w:rPr>
-            </w:pPr>
-          </w:p>
-          <w:p>
-            <w:pPr>
-              <w:keepNext/>
-              <w:spacing w:line="240" w:lineRule="auto"/>
-              <w:ind w:left="0" w:leftChars="0" w:firstLine="0" w:firstLineChars="0"/>
-              <w:jc w:val="both"/>
-              <w:rPr>
-                <w:rFonts w:hint="default" w:cs="Times New Roman"/>
-                <w:b/>
-                <w:bCs/>
-                <w:sz w:val="40"/>
-                <w:szCs w:val="40"/>
-                <w:lang w:val="en-US"/>
-              </w:rPr>
-            </w:pPr>
-          </w:p>
-          <w:p>
-            <w:pPr>
-              <w:keepNext/>
-              <w:spacing w:line="240" w:lineRule="auto"/>
-              <w:ind w:left="360"/>
-              <w:jc w:val="center"/>
-              <w:rPr>
-                <w:rFonts w:hint="default" w:ascii="Times New Roman" w:hAnsi="Times New Roman" w:cs="Times New Roman"/>
-                <w:b/>
-                <w:bCs/>
-                <w:sz w:val="39"/>
-                <w:szCs w:val="39"/>
-                <w:lang w:val="en-US"/>
-              </w:rPr>
-            </w:pPr>
-            <w:r>
-              <w:rPr>
-                <w:rFonts w:hint="default" w:cs="Times New Roman"/>
-                <w:b/>
-                <w:sz w:val="39"/>
-                <w:szCs w:val="39"/>
-                <w:highlight w:val="none"/>
-                <w:lang w:val="en-US"/>
-              </w:rPr>
-              <w:t xml:space="preserve">THỰC TRẠNG VỀ HIỆU QUẢ HOẠT ĐỘNG KINH DOANH CỦA </w:t>
-            </w:r>
-            <w:r>
-              <w:rPr>
-                <w:rFonts w:hint="default" w:cs="Times New Roman"/>
-                <w:b/>
-                <w:sz w:val="39"/>
-                <w:szCs w:val="39"/>
-                <w:highlight w:val="none"/>
-                <w:lang w:val="vi-VN"/>
-              </w:rPr>
-              <w:t xml:space="preserve">CÁC </w:t>
-            </w:r>
-            <w:r>
-              <w:rPr>
-                <w:rFonts w:hint="default" w:cs="Times New Roman"/>
-                <w:b/>
-                <w:sz w:val="39"/>
-                <w:szCs w:val="39"/>
-                <w:highlight w:val="none"/>
-                <w:lang w:val="en-US"/>
-              </w:rPr>
-              <w:t>DOANH NGHIỆP Ở CHÂU Á</w:t>
-            </w:r>
-          </w:p>
-          <w:p>
-            <w:pPr>
-              <w:keepNext/>
-              <w:spacing w:line="240" w:lineRule="auto"/>
-              <w:jc w:val="both"/>
-              <w:rPr>
-                <w:rFonts w:ascii="Times New Roman" w:hAnsi="Times New Roman" w:cs="Times New Roman"/>
-                <w:b/>
-                <w:bCs/>
-                <w:sz w:val="39"/>
-                <w:szCs w:val="39"/>
-              </w:rPr>
-            </w:pPr>
-          </w:p>
-          <w:p>
-            <w:pPr>
-              <w:keepNext/>
-              <w:spacing w:line="240" w:lineRule="auto"/>
-              <w:ind w:left="0" w:leftChars="0" w:firstLine="0" w:firstLineChars="0"/>
-              <w:jc w:val="both"/>
-              <w:rPr>
-                <w:rFonts w:ascii="Times New Roman" w:hAnsi="Times New Roman" w:cs="Times New Roman"/>
-                <w:b/>
-                <w:bCs/>
-                <w:sz w:val="28"/>
-                <w:szCs w:val="28"/>
-              </w:rPr>
-            </w:pPr>
-          </w:p>
-          <w:p>
-            <w:pPr>
-              <w:keepNext/>
-              <w:spacing w:line="240" w:lineRule="auto"/>
-              <w:ind w:left="0" w:leftChars="0" w:firstLine="0" w:firstLineChars="0"/>
-              <w:jc w:val="both"/>
-              <w:rPr>
-                <w:rFonts w:ascii="Times New Roman" w:hAnsi="Times New Roman" w:cs="Times New Roman"/>
-                <w:b/>
-                <w:bCs/>
-                <w:sz w:val="28"/>
-                <w:szCs w:val="28"/>
-              </w:rPr>
-            </w:pPr>
-          </w:p>
-          <w:p>
-            <w:pPr>
-              <w:spacing w:after="0" w:line="240" w:lineRule="auto"/>
-              <w:ind w:left="-426" w:right="-397"/>
-              <w:jc w:val="center"/>
-              <w:rPr>
-                <w:rFonts w:hint="default" w:cs="Times New Roman"/>
-                <w:b/>
-                <w:sz w:val="28"/>
-                <w:szCs w:val="28"/>
-                <w:lang w:val="en-US"/>
-              </w:rPr>
-            </w:pPr>
-            <w:r>
-              <w:rPr>
-                <w:rFonts w:hint="default" w:cs="Times New Roman"/>
-                <w:b/>
-                <w:sz w:val="28"/>
-                <w:szCs w:val="28"/>
-                <w:lang w:val="en-US"/>
-              </w:rPr>
-              <w:t>CHUYÊN ĐỀ 1</w:t>
-            </w:r>
-          </w:p>
-          <w:p>
-            <w:pPr>
-              <w:spacing w:after="0" w:line="240" w:lineRule="auto"/>
-              <w:ind w:left="-426" w:right="-397"/>
-              <w:jc w:val="center"/>
-              <w:rPr>
-                <w:rFonts w:ascii="Times New Roman" w:hAnsi="Times New Roman" w:cs="Times New Roman"/>
-                <w:i/>
-                <w:sz w:val="28"/>
-                <w:szCs w:val="28"/>
-              </w:rPr>
-            </w:pPr>
-            <w:r>
-              <w:rPr>
-                <w:rFonts w:hint="default" w:cs="Times New Roman"/>
-                <w:b/>
-                <w:sz w:val="28"/>
-                <w:szCs w:val="28"/>
-                <w:lang w:val="en-US"/>
-              </w:rPr>
-              <w:t xml:space="preserve">CHUYÊN </w:t>
-            </w:r>
-            <w:r>
-              <w:rPr>
-                <w:rFonts w:ascii="Times New Roman" w:hAnsi="Times New Roman" w:cs="Times New Roman"/>
-                <w:b/>
-                <w:sz w:val="28"/>
-                <w:szCs w:val="28"/>
-              </w:rPr>
-              <w:t>NGÀNH QUẢN TRỊ KINH DOANH</w:t>
-            </w:r>
-          </w:p>
-          <w:p>
-            <w:pPr>
-              <w:spacing w:after="0" w:line="240" w:lineRule="auto"/>
-              <w:ind w:left="-426" w:right="-397"/>
-              <w:jc w:val="center"/>
-              <w:rPr>
-                <w:rFonts w:ascii="Times New Roman" w:hAnsi="Times New Roman" w:cs="Times New Roman"/>
-                <w:i/>
-                <w:sz w:val="28"/>
-                <w:szCs w:val="28"/>
-              </w:rPr>
-            </w:pPr>
-            <w:r>
-              <w:rPr>
-                <w:rFonts w:ascii="Times New Roman" w:hAnsi="Times New Roman" w:cs="Times New Roman"/>
-                <w:b/>
-                <w:sz w:val="28"/>
-                <w:szCs w:val="28"/>
-              </w:rPr>
-              <w:t>MÃ SỐ 9340101</w:t>
-            </w:r>
-          </w:p>
-          <w:p>
-            <w:pPr>
-              <w:pStyle w:val="4"/>
-              <w:keepNext/>
-              <w:spacing w:before="120" w:line="240" w:lineRule="auto"/>
-              <w:ind w:left="0" w:leftChars="0" w:firstLine="0" w:firstLineChars="0"/>
-              <w:jc w:val="center"/>
-              <w:rPr>
-                <w:rFonts w:hint="default" w:ascii="Times New Roman" w:hAnsi="Times New Roman" w:cs="Times New Roman"/>
-                <w:lang w:val="en-US"/>
-              </w:rPr>
-            </w:pPr>
-          </w:p>
-          <w:p>
-            <w:pPr>
-              <w:pStyle w:val="4"/>
-              <w:keepNext/>
-              <w:spacing w:before="120" w:line="240" w:lineRule="auto"/>
-              <w:ind w:left="360" w:firstLine="360"/>
-              <w:jc w:val="center"/>
-              <w:rPr>
-                <w:rFonts w:ascii="Times New Roman" w:hAnsi="Times New Roman" w:cs="Times New Roman"/>
-              </w:rPr>
-            </w:pPr>
-          </w:p>
-          <w:p>
-            <w:pPr>
-              <w:pStyle w:val="4"/>
-              <w:keepNext/>
-              <w:spacing w:before="120" w:line="240" w:lineRule="auto"/>
-              <w:ind w:left="0" w:leftChars="0" w:firstLine="0" w:firstLineChars="0"/>
-              <w:jc w:val="center"/>
-              <w:rPr>
-                <w:rFonts w:hint="default" w:cs="Times New Roman"/>
-                <w:b/>
-                <w:bCs/>
-                <w:sz w:val="26"/>
-                <w:szCs w:val="26"/>
-                <w:lang w:val="en-US"/>
-              </w:rPr>
-            </w:pPr>
-            <w:r>
-              <w:rPr>
-                <w:rFonts w:hint="default" w:cs="Times New Roman"/>
-                <w:b/>
-                <w:bCs/>
-                <w:sz w:val="26"/>
-                <w:szCs w:val="26"/>
-                <w:lang w:val="en-US"/>
-              </w:rPr>
-              <w:t>NGƯỜI HƯỚNG DẪN</w:t>
-            </w:r>
-          </w:p>
-          <w:p>
-            <w:pPr>
-              <w:pStyle w:val="4"/>
-              <w:keepNext/>
-              <w:spacing w:before="120" w:line="240" w:lineRule="auto"/>
-              <w:ind w:left="0" w:leftChars="0" w:firstLine="0" w:firstLineChars="0"/>
-              <w:jc w:val="center"/>
-              <w:rPr>
-                <w:rFonts w:hint="default" w:cs="Times New Roman"/>
-                <w:b/>
-                <w:bCs/>
-                <w:sz w:val="26"/>
-                <w:szCs w:val="26"/>
-                <w:lang w:val="en-US"/>
-              </w:rPr>
-            </w:pPr>
-            <w:r>
-              <w:rPr>
-                <w:rFonts w:hint="default" w:cs="Times New Roman"/>
-                <w:b/>
-                <w:bCs/>
-                <w:sz w:val="26"/>
-                <w:szCs w:val="26"/>
-                <w:lang w:val="en-US"/>
-              </w:rPr>
-              <w:t>TS. NGUYỄN MINH CẢNH</w:t>
-            </w:r>
-          </w:p>
-          <w:p>
-            <w:pPr>
-              <w:pStyle w:val="4"/>
-              <w:keepNext/>
-              <w:spacing w:before="120" w:line="240" w:lineRule="auto"/>
-              <w:ind w:left="0" w:leftChars="0" w:firstLine="0" w:firstLineChars="0"/>
-              <w:jc w:val="both"/>
-              <w:rPr>
-                <w:rFonts w:ascii="Times New Roman" w:hAnsi="Times New Roman" w:cs="Times New Roman"/>
-                <w:b/>
-                <w:sz w:val="28"/>
-              </w:rPr>
-            </w:pPr>
-          </w:p>
-          <w:p>
-            <w:pPr>
-              <w:pStyle w:val="4"/>
-              <w:keepNext/>
-              <w:spacing w:before="120" w:line="240" w:lineRule="auto"/>
-              <w:ind w:left="0" w:leftChars="0" w:firstLine="0" w:firstLineChars="0"/>
-              <w:jc w:val="both"/>
-              <w:rPr>
-                <w:rFonts w:ascii="Times New Roman" w:hAnsi="Times New Roman" w:cs="Times New Roman"/>
-                <w:b/>
-                <w:sz w:val="28"/>
-              </w:rPr>
-            </w:pPr>
-          </w:p>
-          <w:p>
-            <w:pPr>
-              <w:pStyle w:val="4"/>
-              <w:keepNext/>
-              <w:spacing w:before="120" w:line="240" w:lineRule="auto"/>
-              <w:ind w:left="0" w:leftChars="0" w:firstLine="0" w:firstLineChars="0"/>
-              <w:jc w:val="center"/>
-              <w:rPr>
-                <w:rFonts w:ascii="Times New Roman" w:hAnsi="Times New Roman" w:cs="Times New Roman"/>
-                <w:b/>
-                <w:sz w:val="28"/>
-              </w:rPr>
-            </w:pPr>
-          </w:p>
-          <w:p>
-            <w:pPr>
-              <w:pStyle w:val="4"/>
-              <w:keepNext/>
-              <w:spacing w:before="120" w:line="240" w:lineRule="auto"/>
-              <w:ind w:left="0" w:leftChars="0" w:firstLine="0" w:firstLineChars="0"/>
-              <w:jc w:val="center"/>
-              <w:rPr>
-                <w:rFonts w:ascii="Times New Roman" w:hAnsi="Times New Roman" w:cs="Times New Roman"/>
-                <w:b/>
-                <w:sz w:val="28"/>
-              </w:rPr>
-            </w:pPr>
-          </w:p>
-          <w:p>
-            <w:pPr>
-              <w:pStyle w:val="4"/>
-              <w:keepNext/>
-              <w:spacing w:before="120" w:line="240" w:lineRule="auto"/>
-              <w:ind w:left="0" w:leftChars="0" w:firstLine="0" w:firstLineChars="0"/>
-              <w:jc w:val="center"/>
-              <w:rPr>
-                <w:rFonts w:ascii="Times New Roman" w:hAnsi="Times New Roman" w:cs="Times New Roman"/>
-                <w:b/>
-                <w:sz w:val="28"/>
-              </w:rPr>
-            </w:pPr>
-          </w:p>
-          <w:p>
-            <w:pPr>
-              <w:pStyle w:val="4"/>
-              <w:keepNext/>
-              <w:spacing w:before="120" w:line="240" w:lineRule="auto"/>
-              <w:ind w:left="0" w:leftChars="0" w:firstLine="0" w:firstLineChars="0"/>
-              <w:jc w:val="center"/>
-              <w:rPr>
-                <w:rFonts w:hint="default" w:ascii="Times New Roman" w:hAnsi="Times New Roman" w:cs="Times New Roman"/>
-                <w:lang w:val="en-US"/>
-              </w:rPr>
-            </w:pPr>
-            <w:r>
-              <w:rPr>
-                <w:rFonts w:ascii="Times New Roman" w:hAnsi="Times New Roman" w:cs="Times New Roman"/>
-                <w:b/>
-                <w:sz w:val="28"/>
-              </w:rPr>
-              <w:t>NĂM 202</w:t>
-            </w:r>
-            <w:r>
-              <w:rPr>
-                <w:rFonts w:hint="default" w:cs="Times New Roman"/>
-                <w:b/>
-                <w:sz w:val="28"/>
-                <w:lang w:val="en-US"/>
-              </w:rPr>
-              <w:t>5</w:t>
-            </w:r>
-          </w:p>
-          <w:p>
-            <w:pPr>
-              <w:spacing w:before="120" w:after="0" w:line="240" w:lineRule="auto"/>
-              <w:ind w:left="360"/>
-              <w:jc w:val="center"/>
-              <w:rPr>
-                <w:rFonts w:ascii="Times New Roman" w:hAnsi="Times New Roman" w:cs="Times New Roman"/>
-                <w:b/>
-                <w:sz w:val="28"/>
-                <w:szCs w:val="28"/>
-              </w:rPr>
-            </w:pPr>
-          </w:p>
-        </w:tc>
-      </w:tr>
-    </w:tbl>
-    <w:p>
-      <w:pPr>
-        <w:ind w:left="0" w:leftChars="0" w:firstLine="0" w:firstLineChars="0"/>
-      </w:pPr>
-      <w:bookmarkStart w:id="0" w:name="_GoBack"/>
-      <w:bookmarkEnd w:id="0"/>
-    </w:p>
-    <w:p>
-      <w:r>
-        <w:br w:type="page"/>
-      </w:r>
-    </w:p>
-    <w:bookmarkStart w:id="122" w:name="chuyên-đề-tiến-sĩ-số-2"/>
+    <w:bookmarkStart w:id="129" w:name="chuyên-đề-tiến-sĩ-số-2"/>
     <w:p>
       <w:pPr>
         <w:pStyle w:val="Heading1"/>
@@ -1468,15 +192,15 @@
         <w:pStyle w:val="FirstParagraph"/>
       </w:pPr>
       <w:r>
-        <w:t xml:space="preserve">Chuyên đề này xây dựng mô hình nghiên cứu lý thuyết và thực nghiệm về ảnh hưởng của quốc tế hóa đến hiệu quả hoạt động kinh doanh của các doanh nghiệp ở các quốc gia châu Á trong giai đoạn 2009–2025. Khung lý thuyết tích hợp bốn tầng — Uppsala Model (Johanson &amp; Vahlne, 1977, 2009), Resource-Based View (Barney, 1991; Wernerfelt, 1984), Institutional Theory (North, 1990; Khanna &amp; Palepu, 2010; Peng, 2003) và Upper Echelons Theory (Hambrick &amp; Mason, 1984; Hambrick, 2007) — kết hợp với Digital Capability Lens (Banalieva &amp; Dhanaraj, 2019; Verhoef et al., 2021; Stallkamp &amp; Schotter, 2021) làm nền tảng lý thuyết. Lược khảo năm dạng hàm quan hệ quốc tế hóa — hiệu quả (I→P) gồm tuyến tính, chữ U ngược, S-curve, M-curve, và forced penalty, cùng năm meta-analysis lớn giai đoạn 1980–2024, cho thấy khoảng trống thực nghiệm trong việc kiểm định đồng thời phi tuyến và điều tiết đa tầng ở châu Á. Hệ giả thuyết H1–H6 được phát triển: H1 phi tuyến dạng chữ U ngược hoặc S-curve; H2 Technological Capability Index (TCI) điều tiết tích cực; H3 Digital Adoption Index (DAI) điều tiết theo ngữ cảnh và phân biệt với TCI; H4 đặc điểm nhà quản trị điều tiết; H5 thể chế nội địa điều tiết theo gradient ICRV sáu nhóm; H6 tính không đồng nhất theo thời gian. Tám mô hình thực nghiệm M0–M7 được đặc tả, từ baseline tuyến tính đến mô hình điều tiết ba chiều cấp luận án. Chiến lược nhận dạng đa tầng và kế hoạch kiểm định độ vững toàn diện được thiết kế cho pool 101.185 doanh nghiệp ở 47 nền kinh tế châu Á và Thái Bình Dương, bao gồm 108 cặp quốc gia-năm qua 14 mốc khảo sát WBES giai đoạn 2009–2025. Bốn đóng góp chính: (i) khung tích hợp 4 tầng kết hợp Digital Capability Lens chưa có tương đương cho châu Á; (ii) tách bạch TCI và DAI theo Mô hình Năng lực số phụ thuộc bối cảnh (CDCM); (iii) mô hình M7 điều tiết ba chiều; (iv) phân loại nhánh Advanced thành tiên tiến đổi mới sáng tạo dẫn dắt (ICRV Nhóm I) và tiên tiến tài nguyên dẫn dắt (ICRV Nhóm II). Ba bản thảo thực nghiệm đồng hành — P3 Việt Nam (JABS, under review), P4 Singapore (MIR, under review), P5 Trung Quốc (IJOEM, under review) — cung cấp bằng chứng quốc gia cụ thể kiểm định H1–H6 và xác nhận tính khả nghiệm của mô hình đề xuất.</w:t>
-      </w:r>
-    </w:p>
-    <w:p>
-      <w:pPr>
-        <w:pStyle w:val="BodyText"/>
-      </w:pPr>
-      <w:r>
-        <w:t xml:space="preserve">Từ khóa: quốc tế hóa; hiệu quả hoạt động kinh doanh; châu Á; mô hình phi tuyến; điều tiết; năng lực số; thể chế; Upper Echelons; ICRV.</w:t>
+        <w:t xml:space="preserve">Chuyên đề này xây dựng mô hình nghiên cứu lý thuyết và thực nghiệm về ảnh hưởng của quốc tế hóa đến hiệu quả hoạt động kinh doanh của các doanh nghiệp ở các quốc gia châu Á trong giai đoạn 2009–2025. Khung lý thuyết tích hợp bốn tầng — Uppsala Model (Johanson &amp; Vahlne, 1977, 2009), Resource-Based View (Barney, 1991; Wernerfelt, 1984), Institutional Theory (North, 1990; Khanna &amp; Palepu, 2010; Peng, 2003) và Upper Echelons Theory (Hambrick &amp; Mason, 1984; Hambrick, 2007) — kết hợp với Foundational Digital Adoption Framework (Banalieva &amp; Dhanaraj, 2019; Verhoef et al., 2021; Stallkamp &amp; Schotter, 2021) làm nền tảng lý thuyết. Lược khảo năm dạng hàm quan hệ quốc tế hóa — hiệu quả (I→P) gồm tuyến tính, chữ U ngược, S-curve, M-curve, và forced penalty, cùng năm meta-analysis lớn giai đoạn 1980–2024, cho thấy khoảng trống thực nghiệm trong việc kiểm định đồng thời phi tuyến và điều tiết đa tầng ở châu Á. Hệ giả thuyết H1–H6 được phát triển: H1 phi tuyến dạng chữ U ngược hoặc S-curve; H2 Technological Capability Index (TCI) điều tiết tích cực; H3 Digital Adoption Index (DAI) điều tiết theo ngữ cảnh và phân biệt với TCI; H4 đặc điểm nhà quản trị điều tiết; H5 thể chế nội địa điều tiết theo gradient ICRV sáu nhóm; H6 tính không đồng nhất theo thời gian. Tám mô hình thực nghiệm M0–M7 được đặc tả, từ baseline tuyến tính đến mô hình điều tiết ba chiều cấp luận án. Chiến lược nhận dạng đa tầng và kế hoạch kiểm định độ vững toàn diện được thiết kế cho pool 101.185 doanh nghiệp ở 47 nền kinh tế châu Á và Thái Bình Dương, bao gồm 108 cặp quốc gia-năm qua 14 mốc khảo sát WBES giai đoạn 2009–2025. Bốn đóng góp chính: (i) khung tích hợp 4 tầng kết hợp Foundational Digital Adoption Framework chưa có tương đương cho châu Á; (ii) tách bạch TCI và DAI theo Mô hình Áp dụng số và Năng lực phụ thuộc bối cảnh (CDCM); (iii) mô hình M7 điều tiết ba chiều; (iv) phân loại nhánh Advanced thành tiên tiến đổi mới sáng tạo dẫn dắt (ICRV Nhóm I) và tiên tiến tài nguyên dẫn dắt (ICRV Nhóm II). Ba bản thảo thực nghiệm đồng hành — P3 Việt Nam (JABS, under review), P4 Singapore (MIR, under review), P5 Trung Quốc (IJOEM, under review) — cung cấp bằng chứng quốc gia cụ thể kiểm định H1–H6 và xác nhận tính khả nghiệm của mô hình đề xuất.</w:t>
+      </w:r>
+    </w:p>
+    <w:p>
+      <w:pPr>
+        <w:pStyle w:val="BodyText"/>
+      </w:pPr>
+      <w:r>
+        <w:t xml:space="preserve">Từ khóa: quốc tế hóa; hiệu quả hoạt động kinh doanh; châu Á; mô hình phi tuyến; điều tiết; áp dụng số; thể chế; Upper Echelons; ICRV.</w:t>
       </w:r>
     </w:p>
     <w:p>
@@ -1501,15 +225,15 @@
         <w:pStyle w:val="FirstParagraph"/>
       </w:pPr>
       <w:r>
-        <w:t xml:space="preserve">This specialty essay constructs a theoretical and empirical research model on the effect of internationalization on firm performance across Asian economies during 2009–2025. The integrated theoretical framework combines four layers — the Uppsala Model (Johanson &amp; Vahlne, 1977, 2009), the Resource-Based View (Barney, 1991; Wernerfelt, 1984), Institutional Theory (North, 1990; Khanna &amp; Palepu, 2010; Peng, 2003), and Upper Echelons Theory (Hambrick &amp; Mason, 1984; Hambrick, 2007) — together with the Digital Capability Lens (Banalieva &amp; Dhanaraj, 2019; Verhoef et al., 2021; Stallkamp &amp; Schotter, 2021). A review of five functional forms of the internationalization–performance (I→P) relationship — linear, inverted-U, S-curve, M-curve, and forced penalty — together with five major meta-analyses covering 1980–2024 reveals an empirical gap in the simultaneous testing of nonlinearity and multi-level moderation in Asia. Six hypotheses (H1–H6) are developed: H1 nonlinear inverted-U or S-curve relationship; H2 Technological Capability Index (TCI) positively moderating; H3 Digital Adoption Index (DAI) moderating contingently and distinguishable from TCI; H4 top manager characteristics moderating; H5 home-country institutions moderating along the ICRV six-regime gradient; H6 temporal heterogeneity. Eight empirical models M0–M7 are specified, from linear baseline to three-way moderation. A multi-level identification strategy and comprehensive robustness plan are designed for a pool of 101,185 firms across 47 Asian and Pacific economies, spanning 108 country-year pairs across 14 WBES survey waves (2009–2025). The four main contributions are: (i) an integrated 4-tier framework combined with the Digital Capability Lens with no equivalent for Asia; (ii) the separation of TCI and DAI within the Context-Contingent Digital Capability Model (CDCM); (iii) the M7 three-way moderation model; (iv) sub-grouping of the Advanced regime into innovation-driven (ICRV Group I) and resource-driven (ICRV Group II) types. Three companion empirical papers — P3 Vietnam (JABS, under review), P4 Singapore (MIR, under review), P5 China (IJOEM, under review) — provide country-specific evidence testing H1–H6 and validating the proposed model structure.</w:t>
-      </w:r>
-    </w:p>
-    <w:p>
-      <w:pPr>
-        <w:pStyle w:val="BodyText"/>
-      </w:pPr>
-      <w:r>
-        <w:t xml:space="preserve">Keywords: internationalization; firm performance; Asia; nonlinear models; moderation; digital capability; institutions; Upper Echelons; ICRV.</w:t>
+        <w:t xml:space="preserve">This specialty essay constructs a theoretical and empirical research model on the effect of internationalization on firm performance across Asian economies during 2009–2025. The integrated theoretical framework combines four layers — the Uppsala Model (Johanson &amp; Vahlne, 1977, 2009), the Resource-Based View (Barney, 1991; Wernerfelt, 1984), Institutional Theory (North, 1990; Khanna &amp; Palepu, 2010; Peng, 2003), and Upper Echelons Theory (Hambrick &amp; Mason, 1984; Hambrick, 2007) — together with the Foundational Digital Adoption Framework (Banalieva &amp; Dhanaraj, 2019; Verhoef et al., 2021; Stallkamp &amp; Schotter, 2021). A review of five functional forms of the internationalization–performance (I→P) relationship — linear, inverted-U, S-curve, M-curve, and forced penalty — together with five major meta-analyses covering 1980–2024 reveals an empirical gap in the simultaneous testing of nonlinearity and multi-level moderation in Asia. Six hypotheses (H1–H6) are developed: H1 nonlinear inverted-U or S-curve relationship; H2 Technological Capability Index (TCI) positively moderating; H3 Digital Adoption Index (DAI) moderating contingently and distinguishable from TCI; H4 top manager characteristics moderating; H5 home-country institutions moderating along the ICRV six-regime gradient; H6 temporal heterogeneity. Eight empirical models M0–M7 are specified, from linear baseline to three-way moderation. A multi-level identification strategy and comprehensive robustness plan are designed for a pool of 101,185 firms across 47 Asian and Pacific economies, spanning 108 country-year pairs across 14 WBES survey waves (2009–2025). The four main contributions are: (i) an integrated 4-tier framework combined with the Foundational Digital Adoption Framework with no equivalent for Asia; (ii) the separation of TCI and DAI within the Context-Contingent Digital-and-Capability Model (CDCM); (iii) the M7 three-way moderation model; (iv) sub-grouping of the Advanced regime into innovation-driven (ICRV Group I) and resource-driven (ICRV Group II) types. Three companion empirical papers — P3 Vietnam (JABS, under review), P4 Singapore (MIR, under review), P5 China (IJOEM, under review) — provide country-specific evidence testing H1–H6 and validating the proposed model structure.</w:t>
+      </w:r>
+    </w:p>
+    <w:p>
+      <w:pPr>
+        <w:pStyle w:val="BodyText"/>
+      </w:pPr>
+      <w:r>
+        <w:t xml:space="preserve">Keywords: internationalization; firm performance; Asia; nonlinear models; moderation; digital adoption; institutions; Upper Echelons; ICRV.</w:t>
       </w:r>
     </w:p>
     <w:p>
@@ -1656,7 +380,13 @@
         <w:t xml:space="preserve"> </w:t>
       </w:r>
       <w:r>
-        <w:t xml:space="preserve">2.4.2 Đề xuất</w:t>
+        <w:t xml:space="preserve">2.4.2 Hạn chế nghiên cứu</w:t>
+      </w:r>
+      <w:r>
+        <w:t xml:space="preserve"> </w:t>
+      </w:r>
+      <w:r>
+        <w:t xml:space="preserve">2.4.3 Hướng nghiên cứu tiếp theo</w:t>
       </w:r>
     </w:p>
     <w:p>
@@ -2003,7 +733,7 @@
               <w:jc w:val="left"/>
             </w:pPr>
             <w:r>
-              <w:t xml:space="preserve">Context-Contingent Digital Capability Model — Mô hình Năng lực số phụ thuộc bối cảnh</w:t>
+              <w:t xml:space="preserve">Context-Contingent Digital-and-Capability Model — Mô hình Áp dụng số và Năng lực phụ thuộc bối cảnh</w:t>
             </w:r>
           </w:p>
         </w:tc>
@@ -2823,7 +1553,7 @@
       </w:r>
     </w:p>
     <w:bookmarkEnd w:id="26"/>
-    <w:bookmarkStart w:id="84" w:name="phần-2--nội-dung-chuyên-đề"/>
+    <w:bookmarkStart w:id="90" w:name="phần-2--nội-dung-chuyên-đề"/>
     <w:p>
       <w:pPr>
         <w:pStyle w:val="Heading2"/>
@@ -2879,15 +1609,15 @@
         <w:pStyle w:val="BodyText"/>
       </w:pPr>
       <w:r>
-        <w:t xml:space="preserve">Khung lý thuyết hiện hành về quan hệ I→P còn phân tán. Các tổng quan lớn thường tập trung vào một hoặc hai khía cạnh mà ít có khung tích hợp đa tầng cho phép giải thích đầy đủ tính không đồng nhất quan sát được ở châu Á. Đặc biệt, lăng kính số (Digital Capability Lens) chỉ mới được đề xuất gần đây và chưa được tích hợp đầy đủ với bốn tầng lý thuyết kinh điển.</w:t>
-      </w:r>
-    </w:p>
-    <w:p>
-      <w:pPr>
-        <w:pStyle w:val="BodyText"/>
-      </w:pPr>
-      <w:r>
-        <w:t xml:space="preserve">Kết quả phân tích mô tả trong Chuyên đề Tiến sĩ số 1 đã cung cấp bức tranh thực trạng đa chiều dựa trên 101.185 doanh nghiệp WBES xuyên 47 nền kinh tế, làm rõ ba pattern then chốt: phân tán năng suất tăng đơn điệu theo chế độ từ Nhóm I đến Nhóm VI; tính không đồng nhất nội bộ trong nhóm Advanced; và pattern adaptation đặc trưng của các quốc đảo nhỏ Thái Bình Dương. Đồng thời, phân tích đó phát hiện CDCM — Mô hình Năng lực số phụ thuộc bối cảnh: tác động của DAI lên hiệu quả phụ thuộc vào chế độ thể chế, giai đoạn quốc tế hóa, và mức độ bão hòa số của nền kinh tế. Chuyên đề 2 này tiếp nối bằng cách xây dựng mô hình lý thuyết và thực nghiệm để giải thích cơ chế đằng sau các pattern đó.</w:t>
+        <w:t xml:space="preserve">Khung lý thuyết hiện hành về quan hệ I→P còn phân tán. Các tổng quan lớn thường tập trung vào một hoặc hai khía cạnh mà ít có khung tích hợp đa tầng cho phép giải thích đầy đủ tính không đồng nhất quan sát được ở châu Á. Đặc biệt, khung áp dụng số nền tảng (Foundational Digital Adoption Framework) chỉ mới được đề xuất gần đây và chưa được tích hợp đầy đủ với bốn tầng lý thuyết kinh điển.</w:t>
+      </w:r>
+    </w:p>
+    <w:p>
+      <w:pPr>
+        <w:pStyle w:val="BodyText"/>
+      </w:pPr>
+      <w:r>
+        <w:t xml:space="preserve">Kết quả phân tích mô tả trong Chuyên đề Tiến sĩ số 1 đã cung cấp bức tranh thực trạng đa chiều dựa trên 101.185 doanh nghiệp WBES xuyên 47 nền kinh tế, làm rõ ba pattern then chốt: phân tán năng suất tăng đơn điệu theo chế độ từ Nhóm I đến Nhóm VI; tính không đồng nhất nội bộ trong nhóm Advanced; và pattern adaptation đặc trưng của các quốc đảo nhỏ Thái Bình Dương. Đồng thời, phân tích đó phát hiện CDCM — Mô hình Áp dụng số và Năng lực phụ thuộc bối cảnh: tác động của DAI lên hiệu quả phụ thuộc vào chế độ thể chế, giai đoạn quốc tế hóa, và mức độ bão hòa số của nền kinh tế. Chuyên đề 2 này tiếp nối bằng cách xây dựng mô hình lý thuyết và thực nghiệm để giải thích cơ chế đằng sau các pattern đó.</w:t>
       </w:r>
     </w:p>
     <w:p>
@@ -2932,7 +1662,7 @@
         </w:numPr>
       </w:pPr>
       <w:r>
-        <w:t xml:space="preserve">Hệ thống hóa khung lý thuyết tích hợp 4 tầng (Uppsala, RBV, Institutional Theory, Upper Echelons) kết hợp Digital Capability Lens và CDCM.</w:t>
+        <w:t xml:space="preserve">Hệ thống hóa khung lý thuyết tích hợp 4 tầng (Uppsala, RBV, Institutional Theory, Upper Echelons) kết hợp Foundational Digital Adoption Framework và CDCM.</w:t>
       </w:r>
     </w:p>
     <w:p>
@@ -3089,7 +1819,7 @@
         <w:pStyle w:val="FirstParagraph"/>
       </w:pPr>
       <w:r>
-        <w:t xml:space="preserve">Về lý thuyết, chuyên đề đóng góp khung tích hợp 4 tầng kết hợp Digital Capability Lens — chưa có khung tương đương trong văn liệu IB cho khu vực 47 nền kinh tế bao gồm cả quốc đảo nhỏ Thái Bình Dương. CDCM làm sắc nét sự phân biệt giữa TCI như nguồn lực nâng mặt bằng và DAI như nguồn lực mở rộng tình huống.</w:t>
+        <w:t xml:space="preserve">Về lý thuyết, chuyên đề đóng góp khung tích hợp 4 tầng kết hợp Foundational Digital Adoption Framework — chưa có khung tương đương trong văn liệu IB cho khu vực 47 nền kinh tế bao gồm cả quốc đảo nhỏ Thái Bình Dương. CDCM làm sắc nét sự phân biệt giữa TCI như nguồn lực nâng mặt bằng và DAI như nguồn lực mở rộng tình huống.</w:t>
       </w:r>
     </w:p>
     <w:p>
@@ -3150,7 +1880,7 @@
       </w:r>
     </w:p>
     <w:bookmarkEnd w:id="33"/>
-    <w:bookmarkStart w:id="79" w:name="Xfadb92acae8a4d37a91981bb046b7a60d6983fb"/>
+    <w:bookmarkStart w:id="85" w:name="Xfadb92acae8a4d37a91981bb046b7a60d6983fb"/>
     <w:p>
       <w:pPr>
         <w:pStyle w:val="Heading3"/>
@@ -3640,6 +2370,18 @@
       </w:pPr>
       <w:r>
         <w:t xml:space="preserve">P3 Việt Nam (Đỗ &amp; Phan, 2026, JABS under review): Phân tích 2.958 doanh nghiệp WBES ba sóng (2009, 2015, 2023) xác nhận chữ U ngược trong cả ba sóng với kiểm định Lind–Mehlum p &lt; 0,001 (tổng hợp). Điểm uốn: 46,2% (2009), 39,3% (2015), 41,6% (2023), 39,7% (tổng hợp). P3 phân tách H1 thành hai mệnh đề: bước nhảy từ không xuất khẩu sang xuất khẩu là biên năng suất chính; trong mẫu chỉ gồm doanh nghiệp xuất khẩu, đường cong gần phẳng. TCI (b8+e6) dương bền vững (β = 0,179 tổng hợp, p &lt; 0,001); biến công cụ cho TCI nhân quả (β = 1,639, F bậc một = 22,1). DAI phụ thuộc giai đoạn — dương năm 2009 (β = 0,175), null năm 2015, có tương tác âm năm 2023 (FSTS_c×DAI_z = −0,912, p = 0,043); biến công cụ cho DAI null (β = 0,018, p = 0,942, F bậc một = 34,6) — phụ thuộc chọn lựa, không nhân quả.</w:t>
+      </w:r>
+    </w:p>
+    <w:p>
+      <w:pPr>
+        <w:pStyle w:val="BodyText"/>
+      </w:pPr>
+      <w:r>
+        <w:rPr>
+          <w:iCs/>
+          <w:i/>
+        </w:rPr>
+        <w:t xml:space="preserve">Lưu ý về đặc tả mô hình P3: P3 Vietnam sử dụng chuỗi M0–M8 riêng, trong đó M8 là mô hình đầy đủ: lnLP_it = α + β₁ FSTS_c + β₂ FSTS_c² + β₃ TCI_z + β₄ DAI_z + β₅(FSTS_c × DAI_z) + β₆(FSTS_c² × DAI_z) + γ·X + δ_s + [λ_t] + ε_it. Đặc tả đầy đủ M0–M8 và bảng định nghĩa biến được trình bày trong bản thảo P3 (§3.2–§3.3) và luận án (§4.5.1). Chuỗi M0–M7 trong Chuyên đề 2 là các mô hình cấp độ pool 47 quốc gia, khác với đặc tả cấp độ quốc gia của P3.</w:t>
       </w:r>
     </w:p>
     <w:p>
@@ -4381,13 +3123,13 @@
       </w:r>
     </w:p>
     <w:bookmarkEnd w:id="41"/>
-    <w:bookmarkStart w:id="42" w:name="digital-capability-lens-và-cdcm"/>
+    <w:bookmarkStart w:id="42" w:name="X779d21652c68b5127bf6de7b7bac06c339791f2"/>
     <w:p>
       <w:pPr>
         <w:pStyle w:val="Heading5"/>
       </w:pPr>
       <w:r>
-        <w:t xml:space="preserve">Digital Capability Lens và CDCM</w:t>
+        <w:t xml:space="preserve">Foundational Digital Adoption Framework và CDCM</w:t>
       </w:r>
     </w:p>
     <w:p>
@@ -4419,7 +3161,7 @@
         <w:pStyle w:val="BodyText"/>
       </w:pPr>
       <w:r>
-        <w:t xml:space="preserve">CDCM — Mô hình Năng lực số phụ thuộc bối cảnh — được phát hiện qua phân tích đa mẫu trong Chuyên đề Tiến sĩ số 1 cho thấy tác động của DAI lên hiệu quả không đồng nhất mà phụ thuộc đồng thời vào ba chiều ngữ cảnh.</w:t>
+        <w:t xml:space="preserve">CDCM — Mô hình Áp dụng số và Năng lực phụ thuộc bối cảnh — được phát hiện qua phân tích đa mẫu trong Chuyên đề Tiến sĩ số 1 cho thấy tác động của DAI lên hiệu quả không đồng nhất mà phụ thuộc đồng thời vào ba chiều ngữ cảnh.</w:t>
       </w:r>
     </w:p>
     <w:p>
@@ -4721,7 +3463,7 @@
               <w:jc w:val="left"/>
             </w:pPr>
             <w:r>
-              <w:t xml:space="preserve">Digital lens</w:t>
+              <w:t xml:space="preserve">Digital Adoption Lens</w:t>
             </w:r>
           </w:p>
         </w:tc>
@@ -5014,7 +3756,7 @@
         <w:pStyle w:val="BodyText"/>
       </w:pPr>
       <w:r>
-        <w:t xml:space="preserve">Lập luận tích hợp: quốc tế hóa là quyết định chiến lược theo logic Uppsala (tầng 1); kết quả phụ thuộc nguồn lực doanh nghiệp — TCI (RBV/Lall, 1992) đóng vai trò nâng mặt bằng nhân quả; được hỗ trợ bởi hạ tầng số có điều kiện — DAI (Digital Lens/Verhoef et al., 2021) là nguồn lực mở rộng tình huống theo CDCM; phản ánh đặc điểm nhà quản trị (Upper Echelons/Hambrick &amp; Mason, 1984); bị khuôn khổ bởi thể chế nội địa (Institutional Theory/North, 1990) — gradient ICRV 6 nhóm với gánh nặng tắt buộc ở quốc đảo nhỏ; và thay đổi theo bối cảnh thời gian — thiết kế ba giai đoạn.</w:t>
+        <w:t xml:space="preserve">Lập luận tích hợp: quốc tế hóa là quyết định chiến lược theo logic Uppsala (tầng 1); kết quả phụ thuộc nguồn lực doanh nghiệp — TCI (RBV/Lall, 1992) đóng vai trò nâng mặt bằng nhân quả; được hỗ trợ bởi hạ tầng số có điều kiện — DAI (Foundational Digital Adoption Framework/Verhoef et al., 2021) là nguồn lực mở rộng tình huống theo CDCM; phản ánh đặc điểm nhà quản trị (Upper Echelons/Hambrick &amp; Mason, 1984); bị khuôn khổ bởi thể chế nội địa (Institutional Theory/North, 1990) — gradient ICRV 6 nhóm với gánh nặng tắt buộc ở quốc đảo nhỏ; và thay đổi theo bối cảnh thời gian — thiết kế ba giai đoạn.</w:t>
       </w:r>
     </w:p>
     <w:p>
@@ -5027,7 +3769,7 @@
     </w:p>
     <w:bookmarkEnd w:id="43"/>
     <w:bookmarkEnd w:id="44"/>
-    <w:bookmarkStart w:id="48" w:name="X52ec1cc6dbd47f936660533e43094c590c9cc4f"/>
+    <w:bookmarkStart w:id="54" w:name="X52ec1cc6dbd47f936660533e43094c590c9cc4f"/>
     <w:p>
       <w:pPr>
         <w:pStyle w:val="Heading4"/>
@@ -5041,7 +3783,7 @@
         <w:pStyle w:val="FirstParagraph"/>
       </w:pPr>
       <w:r>
-        <w:t xml:space="preserve">Khung khái niệm được xây dựng theo quy trình năm bước (Whetten, 1989; Dubin, 1978): (1) xác định khoảng trống lý thuyết; (2) lựa chọn và biện minh lý thuyết nền; (3) phát triển giả thuyết có cơ chế nhân quả rõ ràng; (4) thiết kế sơ đồ trực quan nhất quán với hệ giả thuyết; (5) kiểm tra tính đồng nhất giữa mô hình, giả thuyết và chiến lược thực nghiệm. Mô hình kết hợp năm tầng lý thuyết — Uppsala Model, Resource-Based View, Institutional Theory, Upper Echelons Theory và Digital Capability Lens — vào một cấu trúc nhân quả kiểm định được, nhận diện rõ vai trò của từng biến:</w:t>
+        <w:t xml:space="preserve">Khung khái niệm được xây dựng theo quy trình năm bước (Whetten, 1989; Dubin, 1978): (1) xác định khoảng trống lý thuyết; (2) lựa chọn và biện minh lý thuyết nền; (3) phát triển giả thuyết có cơ chế nhân quả rõ ràng; (4) thiết kế sơ đồ trực quan nhất quán với hệ giả thuyết; (5) kiểm tra tính đồng nhất giữa mô hình, giả thuyết và chiến lược thực nghiệm. Mô hình kết hợp năm tầng lý thuyết — Uppsala Model, Resource-Based View, Institutional Theory, Upper Echelons Theory và Foundational Digital Adoption Framework — vào một cấu trúc nhân quả kiểm định được, nhận diện rõ vai trò của từng biến:</w:t>
       </w:r>
       <w:r>
         <w:t xml:space="preserve"> </w:t>
@@ -5108,7 +3850,7 @@
         <w:t xml:space="preserve">(quy mô, tuổi, sở hữu nước ngoài, sector FE, country FE, year FE).</w:t>
       </w:r>
     </w:p>
-    <w:bookmarkStart w:id="45" w:name="Xdc5423e7a0a0b2d3707e5b67f7523984c238683"/>
+    <w:bookmarkStart w:id="48" w:name="Xdc5423e7a0a0b2d3707e5b67f7523984c238683"/>
     <w:p>
       <w:pPr>
         <w:pStyle w:val="Heading5"/>
@@ -5122,7 +3864,46 @@
         <w:pStyle w:val="FirstParagraph"/>
       </w:pPr>
       <w:r>
-        <w:t xml:space="preserve">Hình 2.1: Khung khái niệm tích hợp CĐ2</w:t>
+        <w:drawing>
+          <wp:inline>
+            <wp:extent cx="5753100" cy="4009802"/>
+            <wp:effectExtent b="0" l="0" r="0" t="0"/>
+            <wp:docPr descr="Hình 2.1: Khung khái niệm tích hợp CĐ2" title="" id="46" name="Picture"/>
+            <a:graphic>
+              <a:graphicData uri="http://schemas.openxmlformats.org/drawingml/2006/picture">
+                <pic:pic>
+                  <pic:nvPicPr>
+                    <pic:cNvPr descr="figures/hinh_2_1_khung_khai_niem.png" id="47" name="Picture"/>
+                    <pic:cNvPicPr>
+                      <a:picLocks noChangeArrowheads="1" noChangeAspect="1"/>
+                    </pic:cNvPicPr>
+                  </pic:nvPicPr>
+                  <pic:blipFill>
+                    <a:blip r:embed="rId45"/>
+                    <a:stretch>
+                      <a:fillRect/>
+                    </a:stretch>
+                  </pic:blipFill>
+                  <pic:spPr bwMode="auto">
+                    <a:xfrm>
+                      <a:off x="0" y="0"/>
+                      <a:ext cx="5753100" cy="4009802"/>
+                    </a:xfrm>
+                    <a:prstGeom prst="rect">
+                      <a:avLst/>
+                    </a:prstGeom>
+                    <a:noFill/>
+                    <a:ln w="9525">
+                      <a:noFill/>
+                      <a:headEnd/>
+                      <a:tailEnd/>
+                    </a:ln>
+                  </pic:spPr>
+                </pic:pic>
+              </a:graphicData>
+            </a:graphic>
+          </wp:inline>
+        </w:drawing>
       </w:r>
     </w:p>
     <w:p>
@@ -5148,11 +3929,11 @@
         <w:pStyle w:val="BodyText"/>
       </w:pPr>
       <w:r>
-        <w:t xml:space="preserve">Mũi tên liền nét biểu thị tác động trực tiếp (H1: quan hệ phi tuyến I→P). Mũi tên đứt nét biểu thị tác động điều tiết. H1–H6 tương ứng với các giả thuyết phát triển trong §2.3.4. Biến phụ thuộc (ln(Labour Productivity)) được xác định duy nhất ở cực phải. Biến độc lập (FSTS, FSTS²_c, FSTS³_c) ở cực trái. Năm nhóm biến điều tiết phân theo hai cấp: cấp doanh nghiệp (TCI — H2, DAI — H3, đặc điểm nhà quản trị — H4) và cấp quốc gia (ICRV regime — H5, giai đoạn thời gian — H6). Biến kiểm soát (ln(emp), firm_age, foreign_own, sector/country/year FE) được đưa vào mô hình thực nghiệm nhưng không hiển thị trong sơ đồ để đơn giản hóa trình bày. Mỗi tầng lý thuyết cung cấp cơ chế nhân quả riêng biệt: Uppsala giải thích đường cong I→P; RBV biện minh cho H2; Digital Capability Lens (CDCM) biện minh cho H3; Upper Echelons biện minh cho H4; Institutional Theory biện minh cho H5. Bằng chứng neo đậu từ P3 Việt Nam, P4 Singapore và P5 Trung Quốc xác nhận tính khả nghiệm trước khi áp dụng cho toàn pool 101.185 doanh nghiệp.</w:t>
-      </w:r>
-    </w:p>
-    <w:bookmarkEnd w:id="45"/>
-    <w:bookmarkStart w:id="46" w:name="hình-22--cơ-chế-cdcm-chi-tiết"/>
+        <w:t xml:space="preserve">Mũi tên liền nét biểu thị tác động trực tiếp (H1: quan hệ phi tuyến I→P). Mũi tên đứt nét biểu thị tác động điều tiết. H1–H6 tương ứng với các giả thuyết phát triển trong §2.3.4. Biến phụ thuộc (ln(Labour Productivity)) được xác định duy nhất ở cực phải. Biến độc lập (FSTS, FSTS²_c, FSTS³_c) ở cực trái. Năm nhóm biến điều tiết phân theo hai cấp: cấp doanh nghiệp (TCI — H2, DAI — H3, đặc điểm nhà quản trị — H4) và cấp quốc gia (ICRV regime — H5, giai đoạn thời gian — H6). Biến kiểm soát (ln(emp), firm_age, foreign_own, sector/country/year FE) được đưa vào mô hình thực nghiệm nhưng không hiển thị trong sơ đồ để đơn giản hóa trình bày. Mỗi tầng lý thuyết cung cấp cơ chế nhân quả riêng biệt: Uppsala giải thích đường cong I→P; RBV biện minh cho H2; Foundational Digital Adoption Framework (CDCM) biện minh cho H3; Upper Echelons biện minh cho H4; Institutional Theory biện minh cho H5. Bằng chứng neo đậu từ P3 Việt Nam, P4 Singapore và P5 Trung Quốc xác nhận tính khả nghiệm trước khi áp dụng cho toàn pool 101.185 doanh nghiệp.</w:t>
+      </w:r>
+    </w:p>
+    <w:bookmarkEnd w:id="48"/>
+    <w:bookmarkStart w:id="52" w:name="hình-22--cơ-chế-cdcm-chi-tiết"/>
     <w:p>
       <w:pPr>
         <w:pStyle w:val="Heading5"/>
@@ -5166,7 +3947,46 @@
         <w:pStyle w:val="FirstParagraph"/>
       </w:pPr>
       <w:r>
-        <w:t xml:space="preserve">Hình 2.2: Cơ chế CDCM theo ba nhóm ICRV</w:t>
+        <w:drawing>
+          <wp:inline>
+            <wp:extent cx="5753100" cy="2573755"/>
+            <wp:effectExtent b="0" l="0" r="0" t="0"/>
+            <wp:docPr descr="Hình 2.2: Cơ chế CDCM theo ba nhóm ICRV" title="" id="50" name="Picture"/>
+            <a:graphic>
+              <a:graphicData uri="http://schemas.openxmlformats.org/drawingml/2006/picture">
+                <pic:pic>
+                  <pic:nvPicPr>
+                    <pic:cNvPr descr="figures/hinh_2_2_cdcm_detail.png" id="51" name="Picture"/>
+                    <pic:cNvPicPr>
+                      <a:picLocks noChangeArrowheads="1" noChangeAspect="1"/>
+                    </pic:cNvPicPr>
+                  </pic:nvPicPr>
+                  <pic:blipFill>
+                    <a:blip r:embed="rId49"/>
+                    <a:stretch>
+                      <a:fillRect/>
+                    </a:stretch>
+                  </pic:blipFill>
+                  <pic:spPr bwMode="auto">
+                    <a:xfrm>
+                      <a:off x="0" y="0"/>
+                      <a:ext cx="5753100" cy="2573755"/>
+                    </a:xfrm>
+                    <a:prstGeom prst="rect">
+                      <a:avLst/>
+                    </a:prstGeom>
+                    <a:noFill/>
+                    <a:ln w="9525">
+                      <a:noFill/>
+                      <a:headEnd/>
+                      <a:tailEnd/>
+                    </a:ln>
+                  </pic:spPr>
+                </pic:pic>
+              </a:graphicData>
+            </a:graphic>
+          </wp:inline>
+        </w:drawing>
       </w:r>
     </w:p>
     <w:p>
@@ -5184,7 +4004,7 @@
         <w:t xml:space="preserve"> </w:t>
       </w:r>
       <w:r>
-        <w:t xml:space="preserve">Cơ chế Context-Contingent Digital Capability Model (CDCM) theo ba nhóm ICRV đại diện.</w:t>
+        <w:t xml:space="preserve">Cơ chế Context-Contingent Digital-and-Capability Model (CDCM) theo ba nhóm ICRV đại diện.</w:t>
       </w:r>
     </w:p>
     <w:p>
@@ -5208,11 +4028,11 @@
         <w:t xml:space="preserve"> </w:t>
       </w:r>
       <w:r>
-        <w:t xml:space="preserve">(context-contingent resource) — vai trò của DAI trong quan hệ I→P thay đổi theo regime thể chế và mức bão hòa số của nền kinh tế. Nhóm I (Singapore — Advanced I, bão hòa số cao): DAI Tier-1+2 vận hành như nguồn lực khuếch đại tình huống — tác động chỉ xuất hiện khi cường độ xuất khẩu đạt ngưỡng cao (FSTS²×DAI = +3,119; P4). Nhóm IV (Việt Nam — cận biên trên, bão hòa số thấp; tương đương "Frontier V" trong hệ 5 nhóm P3/P6): DAI Tier-1 là ràng buộc đo lường; tác động dương theo OLS nhưng biến mất sau hiệu chỉnh nội sinh biến công cụ (β = 0,018, p = 0,942; P3). Nhóm III (Trung Quốc — Upper-Middle/Emerging transition, bão hòa số trung bình): DAI Tier-1 phổ biến &gt;60% — mất khả năng phân biệt, giữ như biến kiểm soát không phải biến điều tiết (P5). Cơ chế này giải thích tại sao kết quả "DAI null" và "DAI dương" đều nhất quán với lý thuyết CDCM — khác nhau ở điều kiện bối cảnh, không mâu thuẫn về lý thuyết nền tảng.</w:t>
-      </w:r>
-    </w:p>
-    <w:bookmarkEnd w:id="46"/>
-    <w:bookmarkStart w:id="47" w:name="bảng-24--mapping-biến-đầy-đủ"/>
+        <w:t xml:space="preserve">(context-contingent resource) — vai trò của DAI trong quan hệ I→P thay đổi theo regime thể chế và mức bão hòa số của nền kinh tế. Nhóm I (Singapore — Advanced I, bão hòa số cao): DAI Tier-1+2 vận hành như nguồn lực khuếch đại tình huống — tác động chỉ xuất hiện khi cường độ xuất khẩu đạt ngưỡng cao (FSTS²×DAI = +3,119; P4). Nhóm IV (Việt Nam — Lower_mid_transition, bão hòa số thấp; Nhóm IV trong cả hệ 5 nhóm P6 lẫn hệ 6 nhóm CD2): DAI Tier-1 là ràng buộc đo lường; tác động dương theo OLS nhưng biến mất sau hiệu chỉnh nội sinh biến công cụ (β = 0,018, p = 0,942; P3). Nhóm III (Trung Quốc — Upper-Middle/Emerging transition, bão hòa số trung bình): DAI Tier-1 phổ biến &gt;60% — mất khả năng phân biệt, giữ như biến kiểm soát không phải biến điều tiết (P5). Cơ chế này giải thích tại sao kết quả "DAI null" và "DAI dương" đều nhất quán với lý thuyết CDCM — khác nhau ở điều kiện bối cảnh, không mâu thuẫn về lý thuyết nền tảng.</w:t>
+      </w:r>
+    </w:p>
+    <w:bookmarkEnd w:id="52"/>
+    <w:bookmarkStart w:id="53" w:name="bảng-24--mapping-biến-đầy-đủ"/>
     <w:p>
       <w:pPr>
         <w:pStyle w:val="Heading5"/>
@@ -6514,9 +5334,9 @@
         <w:t xml:space="preserve">Ghi chú đo lường: TCI là tổng hợp formative từ: chứng nhận ISO (b8=1), R&amp;D (h8=1), đổi mới sản phẩm (h1=1), công nghệ nước ngoài có bản quyền (e6=1). Yêu cầu ≥3/4 items không thiếu; z-chuẩn hóa trong mỗi sóng. DAI_z_full (Tier 1+2): z-mean(c22b + k33 + k38) chỉ có trong schema BEE (2019 trở đi). DAI_z_tier1 (Tier 1): z-mean(c22b) có xuyên tất cả schema. FSTS được tính trung tâm theo mean trong mỗi ô quốc gia-sóng trước khi tính FSTS² để giảm đa cộng tuyến.</w:t>
       </w:r>
     </w:p>
-    <w:bookmarkEnd w:id="47"/>
-    <w:bookmarkEnd w:id="48"/>
-    <w:bookmarkStart w:id="57" w:name="X06e1038a517412390e729f6b4e28e81b8d64800"/>
+    <w:bookmarkEnd w:id="53"/>
+    <w:bookmarkEnd w:id="54"/>
+    <w:bookmarkStart w:id="63" w:name="X06e1038a517412390e729f6b4e28e81b8d64800"/>
     <w:p>
       <w:pPr>
         <w:pStyle w:val="Heading4"/>
@@ -6525,7 +5345,7 @@
         <w:t xml:space="preserve">2.3.4 Hệ giả thuyết nghiên cứu (H1–H6)</w:t>
       </w:r>
     </w:p>
-    <w:bookmarkStart w:id="49" w:name="tổng-quan-và-logic-phát-triển-giả-thuyết"/>
+    <w:bookmarkStart w:id="55" w:name="tổng-quan-và-logic-phát-triển-giả-thuyết"/>
     <w:p>
       <w:pPr>
         <w:pStyle w:val="Heading5"/>
@@ -6550,8 +5370,8 @@
         <w:t xml:space="preserve">H1–H3 và H5 là xác nhận (dấu rõ, ≥2 bằng chứng neo đậu từ P3/P4/P5). H4 và H6 là hỗn hợp xác nhận/khám phá (hướng rõ nhưng magnitude khám phá).</w:t>
       </w:r>
     </w:p>
-    <w:bookmarkEnd w:id="49"/>
-    <w:bookmarkStart w:id="50" w:name="h1--phi-tuyến-trong-quan-hệ-ip"/>
+    <w:bookmarkEnd w:id="55"/>
+    <w:bookmarkStart w:id="56" w:name="h1--phi-tuyến-trong-quan-hệ-ip"/>
     <w:p>
       <w:pPr>
         <w:pStyle w:val="Heading5"/>
@@ -6608,8 +5428,8 @@
         <w:t xml:space="preserve">H1b (biên cường độ — gần phẳng): Trong mẫu chỉ gồm doanh nghiệp xuất khẩu, đường cong I→P gần phẳng — tức là sau khi đã xuất khẩu, việc tăng cường độ tiếp theo không tạo thêm nhiều lợi ích năng suất nếu không có TCI và DAI đủ mạnh.</w:t>
       </w:r>
     </w:p>
-    <w:bookmarkEnd w:id="50"/>
-    <w:bookmarkStart w:id="51" w:name="h2--tci-điều-tiết-tích-cực-nâng-mặt-bằng"/>
+    <w:bookmarkEnd w:id="56"/>
+    <w:bookmarkStart w:id="57" w:name="h2--tci-điều-tiết-tích-cực-nâng-mặt-bằng"/>
     <w:p>
       <w:pPr>
         <w:pStyle w:val="Heading5"/>
@@ -6642,8 +5462,8 @@
         <w:t xml:space="preserve">H2: Technological Capability Index (TCI) có mối quan hệ dương trực tiếp với hiệu quả doanh nghiệp (β(TCI) &gt; 0) và nâng mặt bằng ln(LP) của toàn bộ đường cong I→P (hiệu ứng nâng mặt bằng). Tác động điều tiết của TCI lên độ cong của đường cong là câu hỏi thực nghiệm mở và được kiểm định như H2 khám phá trong M3.</w:t>
       </w:r>
     </w:p>
-    <w:bookmarkEnd w:id="51"/>
-    <w:bookmarkStart w:id="52" w:name="h3--dai-điều-tiết-theo-ngữ-cảnh-cdcm"/>
+    <w:bookmarkEnd w:id="57"/>
+    <w:bookmarkStart w:id="58" w:name="h3--dai-điều-tiết-theo-ngữ-cảnh-cdcm"/>
     <w:p>
       <w:pPr>
         <w:pStyle w:val="Heading5"/>
@@ -7155,8 +5975,8 @@
         <w:t xml:space="preserve">H3: Digital Adoption Index (DAI) không hoạt động như một phần thưởng năng suất đồng nhất mà như một nguồn lực mở rộng tình huống theo CDCM: tác động của DAI lên ln(LP) phụ thuộc vào chế độ thể chế (ICRV), mức FSTS, và mức độ bão hòa số. Cụ thể: (a) β(FSTS²×DAI) &gt; 0 trong Nhóm I; (b) tác động DAI yếu hoặc phụ thuộc chọn lựa trong Nhóm IV; (c) TCI và DAI là hai cấu trúc phân biệt và không thể thay thế nhau.</w:t>
       </w:r>
     </w:p>
-    <w:bookmarkEnd w:id="52"/>
-    <w:bookmarkStart w:id="53" w:name="h4--đặc-điểm-nhà-quản-trị-điều-tiết"/>
+    <w:bookmarkEnd w:id="58"/>
+    <w:bookmarkStart w:id="59" w:name="h4--đặc-điểm-nhà-quản-trị-điều-tiết"/>
     <w:p>
       <w:pPr>
         <w:pStyle w:val="Heading5"/>
@@ -7189,8 +6009,8 @@
         <w:t xml:space="preserve">Phạm vi kiểm định: do WBES không đo trực tiếp kinh nghiệm quốc tế mà chỉ đo tổng số năm kinh nghiệm, H4 được kiểm định với biến đại diện. Kết quả là chỉ báo, không phải kiểm định trực tiếp cơ chế Upper Echelons — một hạn chế cần thừa nhận rõ.</w:t>
       </w:r>
     </w:p>
-    <w:bookmarkEnd w:id="53"/>
-    <w:bookmarkStart w:id="54" w:name="h5--thể-chế-icrv-điều-tiết-theo-gradient"/>
+    <w:bookmarkEnd w:id="59"/>
+    <w:bookmarkStart w:id="60" w:name="h5--thể-chế-icrv-điều-tiết-theo-gradient"/>
     <w:p>
       <w:pPr>
         <w:pStyle w:val="Heading5"/>
@@ -7505,8 +6325,8 @@
         <w:t xml:space="preserve">H5: Hiệu ứng điều tiết của chế độ thể chế (ICRV) lên quan hệ I→P có dạng gradient: cùng một mức FSTS, doanh nghiệp ở Nhóm I đạt hiệu quả cao nhất; gradient giảm dần qua Nhóm II → III → IV → V; Nhóm VI có pattern gánh nặng tắt buộc. Điểm uốn tăng đơn điệu theo gradient từ Nhóm VI đến Nhóm I.</w:t>
       </w:r>
     </w:p>
-    <w:bookmarkEnd w:id="54"/>
-    <w:bookmarkStart w:id="55" w:name="h6--tính-không-đồng-nhất-theo-thời-gian"/>
+    <w:bookmarkEnd w:id="60"/>
+    <w:bookmarkStart w:id="61" w:name="h6--tính-không-đồng-nhất-theo-thời-gian"/>
     <w:p>
       <w:pPr>
         <w:pStyle w:val="Heading5"/>
@@ -7539,8 +6359,8 @@
         <w:t xml:space="preserve">H6: Tác động của quốc tế hóa lên hiệu quả doanh nghiệp thể hiện tính không đồng nhất theo thời gian: β(FSTS×Year_bucket) và β(FSTS²×Year_bucket) khác nhau có ý nghĩa thống kê giữa ba giai đoạn 2009–2012, 2013–2017, và 2018–2025. Cụ thể: tác động TCI tăng cường theo thời gian; tác động DAI biến thiên theo giai đoạn; điểm uốn có thể dịch chuyển trong một số nhóm ICRV nhưng ổn định trong các nhóm khác.</w:t>
       </w:r>
     </w:p>
-    <w:bookmarkEnd w:id="55"/>
-    <w:bookmarkStart w:id="56" w:name="tổng-hợp-hệ-giả-thuyết"/>
+    <w:bookmarkEnd w:id="61"/>
+    <w:bookmarkStart w:id="62" w:name="tổng-hợp-hệ-giả-thuyết"/>
     <w:p>
       <w:pPr>
         <w:pStyle w:val="Heading5"/>
@@ -7830,7 +6650,7 @@
               <w:jc w:val="left"/>
             </w:pPr>
             <w:r>
-              <w:t xml:space="preserve">CDCM × Digital lens</w:t>
+              <w:t xml:space="preserve">CDCM × Digital Adoption Lens</w:t>
             </w:r>
           </w:p>
         </w:tc>
@@ -8110,9 +6930,9 @@
         <w:t xml:space="preserve">Tích hợp cả sáu giả thuyết trong M7 (điều tiết ba chiều) cho phép kiểm định xem TCI và DAI là bổ sung (β(TCI×DAI×FSTS) &gt; 0) hay thay thế (β &lt; 0) trong điều tiết I→P ở Nhóm I — câu hỏi chưa được trả lời trong bất kỳ nghiên cứu I→P nào trước đây.</w:t>
       </w:r>
     </w:p>
-    <w:bookmarkEnd w:id="56"/>
-    <w:bookmarkEnd w:id="57"/>
-    <w:bookmarkStart w:id="68" w:name="Xddbf6d90ba3605bd9c97fdd0a837b1ed2b589e3"/>
+    <w:bookmarkEnd w:id="62"/>
+    <w:bookmarkEnd w:id="63"/>
+    <w:bookmarkStart w:id="74" w:name="Xddbf6d90ba3605bd9c97fdd0a837b1ed2b589e3"/>
     <w:p>
       <w:pPr>
         <w:pStyle w:val="Heading4"/>
@@ -8121,7 +6941,7 @@
         <w:t xml:space="preserve">2.3.5 Thiết kế mô hình thực nghiệm (M0–M7)</w:t>
       </w:r>
     </w:p>
-    <w:bookmarkStart w:id="58" w:name="nguyên-tắc-đặc-tả"/>
+    <w:bookmarkStart w:id="64" w:name="nguyên-tắc-đặc-tả"/>
     <w:p>
       <w:pPr>
         <w:pStyle w:val="Heading5"/>
@@ -8146,8 +6966,8 @@
         <w:t xml:space="preserve">Tiêu chí lựa chọn mô hình: ΔR² &gt; 0,01 để thêm biến điều tiết; ΔAIC &lt; −2 ủng hộ mô hình phức tạp hơn; ΔBIC &lt; −10 là bằng chứng mạnh; F-test p &lt; 0,05 để thêm khối biến. M7 được báo cáo nếu ΔAIC(M7 vs M4+M3 kết hợp) &lt; −2 VÀ F-test p &lt; 0,05.</w:t>
       </w:r>
     </w:p>
-    <w:bookmarkEnd w:id="58"/>
-    <w:bookmarkStart w:id="59" w:name="m0--baseline-tuyến-tính"/>
+    <w:bookmarkEnd w:id="64"/>
+    <w:bookmarkStart w:id="65" w:name="m0--baseline-tuyến-tính"/>
     <w:p>
       <w:pPr>
         <w:pStyle w:val="Heading5"/>
@@ -8202,8 +7022,8 @@
         <w:t xml:space="preserve">Hạn chế: không nắm bắt được phi tuyến tính — cung cấp ước lượng cận dưới cho tác động quốc tế hóa.</w:t>
       </w:r>
     </w:p>
-    <w:bookmarkEnd w:id="59"/>
-    <w:bookmarkStart w:id="60" w:name="X47a362c1312a55af0e7fdcd5a1b0398406d4027"/>
+    <w:bookmarkEnd w:id="65"/>
+    <w:bookmarkStart w:id="66" w:name="X47a362c1312a55af0e7fdcd5a1b0398406d4027"/>
     <w:p>
       <w:pPr>
         <w:pStyle w:val="Heading5"/>
@@ -8274,8 +7094,8 @@
         <w:t xml:space="preserve">Kiểm định bổ sung: Lind–Mehlum (2010) để xác nhận chữ U ngược thực sự.</w:t>
       </w:r>
     </w:p>
-    <w:bookmarkEnd w:id="60"/>
-    <w:bookmarkStart w:id="61" w:name="m2--s-curve-bậc-ba-kiểm-định-h1-đầy-đủ"/>
+    <w:bookmarkEnd w:id="66"/>
+    <w:bookmarkStart w:id="67" w:name="m2--s-curve-bậc-ba-kiểm-định-h1-đầy-đủ"/>
     <w:p>
       <w:pPr>
         <w:pStyle w:val="Heading5"/>
@@ -8350,8 +7170,8 @@
         <w:t xml:space="preserve">Lựa chọn mô hình: so sánh M1 và M2 bằng AIC, BIC, và F-test β₃ = 0.</w:t>
       </w:r>
     </w:p>
-    <w:bookmarkEnd w:id="61"/>
-    <w:bookmarkStart w:id="62" w:name="m3---điều-tiết-tci-kiểm-định-h2"/>
+    <w:bookmarkEnd w:id="67"/>
+    <w:bookmarkStart w:id="68" w:name="m3---điều-tiết-tci-kiểm-định-h2"/>
     <w:p>
       <w:pPr>
         <w:pStyle w:val="Heading5"/>
@@ -8458,8 +7278,8 @@
         <w:t xml:space="preserve">Kiểm định: F-test (β₄ = β₅ = 0) = kiểm định joint moderation; nếu p &gt; 0,10 → TCI là nâng mặt bằng thuần túy.</w:t>
       </w:r>
     </w:p>
-    <w:bookmarkEnd w:id="62"/>
-    <w:bookmarkStart w:id="63" w:name="m4---điều-tiết-dai-kiểm-định-h3"/>
+    <w:bookmarkEnd w:id="68"/>
+    <w:bookmarkStart w:id="69" w:name="m4---điều-tiết-dai-kiểm-định-h3"/>
     <w:p>
       <w:pPr>
         <w:pStyle w:val="Heading5"/>
@@ -8556,8 +7376,8 @@
         <w:t xml:space="preserve">Lưu ý IV: trong mẫu con Nhóm IV, nếu có biến công cụ hợp lệ, chạy 2SLS để phân biệt DAI nhân quả vs. phụ thuộc chọn lựa.</w:t>
       </w:r>
     </w:p>
-    <w:bookmarkEnd w:id="63"/>
-    <w:bookmarkStart w:id="64" w:name="m5---điều-tiết-nhà-quản-trị-kiểm-định-h4"/>
+    <w:bookmarkEnd w:id="69"/>
+    <w:bookmarkStart w:id="70" w:name="m5---điều-tiết-nhà-quản-trị-kiểm-định-h4"/>
     <w:p>
       <w:pPr>
         <w:pStyle w:val="Heading5"/>
@@ -8638,8 +7458,8 @@
         <w:t xml:space="preserve">Kỳ vọng: β₄(FSTS×exp_manager) &gt; 0.</w:t>
       </w:r>
     </w:p>
-    <w:bookmarkEnd w:id="64"/>
-    <w:bookmarkStart w:id="65" w:name="m6---chế-độ-thể-chế-icrv-kiểm-định-h5"/>
+    <w:bookmarkEnd w:id="70"/>
+    <w:bookmarkStart w:id="71" w:name="m6---chế-độ-thể-chế-icrv-kiểm-định-h5"/>
     <w:p>
       <w:pPr>
         <w:pStyle w:val="Heading5"/>
@@ -8772,8 +7592,8 @@
         <w:t xml:space="preserve">Lưu ý: Country FE bị omit trong M6 do ICRV_j là biến cấp quốc gia bất biến theo thời gian — thay bằng Year FE + Region FE (6 vùng).</w:t>
       </w:r>
     </w:p>
-    <w:bookmarkEnd w:id="65"/>
-    <w:bookmarkStart w:id="66" w:name="X6b4e30438e556ccb1a096b5b5260c191a2952a4"/>
+    <w:bookmarkEnd w:id="71"/>
+    <w:bookmarkStart w:id="72" w:name="X6b4e30438e556ccb1a096b5b5260c191a2952a4"/>
     <w:p>
       <w:pPr>
         <w:pStyle w:val="Heading5"/>
@@ -9242,8 +8062,8 @@
         <w:t xml:space="preserve">Yêu cầu mẫu: với k = 13 tham số trọng tâm + controls, n ≥ 5.000 cần thiết cho power &gt; 0,80 tại f² = 0,02 — dễ dàng đáp ứng với pool 101.185.</w:t>
       </w:r>
     </w:p>
-    <w:bookmarkEnd w:id="66"/>
-    <w:bookmarkStart w:id="67" w:name="bảng-tổng-hợp-mô-hình"/>
+    <w:bookmarkEnd w:id="72"/>
+    <w:bookmarkStart w:id="73" w:name="bảng-tổng-hợp-mô-hình"/>
     <w:p>
       <w:pPr>
         <w:pStyle w:val="Heading5"/>
@@ -9727,9 +8547,9 @@
         </w:tc>
       </w:tr>
     </w:tbl>
-    <w:bookmarkEnd w:id="67"/>
-    <w:bookmarkEnd w:id="68"/>
-    <w:bookmarkStart w:id="73" w:name="Xe1509b929c4d29ab07808a468654fc0b0b85d99"/>
+    <w:bookmarkEnd w:id="73"/>
+    <w:bookmarkEnd w:id="74"/>
+    <w:bookmarkStart w:id="79" w:name="Xe1509b929c4d29ab07808a468654fc0b0b85d99"/>
     <w:p>
       <w:pPr>
         <w:pStyle w:val="Heading4"/>
@@ -9738,7 +8558,7 @@
         <w:t xml:space="preserve">2.3.6 Dữ liệu và chiến lược nhận dạng nhân quả</w:t>
       </w:r>
     </w:p>
-    <w:bookmarkStart w:id="69" w:name="nguồn-dữ-liệu-và-cấu-trúc-pool"/>
+    <w:bookmarkStart w:id="75" w:name="nguồn-dữ-liệu-và-cấu-trúc-pool"/>
     <w:p>
       <w:pPr>
         <w:pStyle w:val="Heading5"/>
@@ -10181,7 +9001,7 @@
               <w:jc w:val="left"/>
             </w:pPr>
             <w:r>
-              <w:t xml:space="preserve">Fiji, PNG, Solomon Islands, Tonga, Vanuatu, Samoa, Kiribati</w:t>
+              <w:t xml:space="preserve">Fiji, Kiribati, Papua New Guinea, Samoa, Solomon Islands, Tonga, Vanuatu</w:t>
             </w:r>
           </w:p>
         </w:tc>
@@ -10294,11 +9114,38 @@
         <w:pStyle w:val="BodyText"/>
       </w:pPr>
       <w:r>
+        <w:rPr>
+          <w:iCs/>
+          <w:i/>
+        </w:rPr>
+        <w:t xml:space="preserve">Ghi chú về trọng số khảo sát:</w:t>
+      </w:r>
+      <w:r>
+        <w:t xml:space="preserve"> </w:t>
+      </w:r>
+      <w:r>
+        <w:t xml:space="preserve">Chuyên đề không áp dụng trọng số mẫu WBES (</w:t>
+      </w:r>
+      <w:r>
+        <w:rPr>
+          <w:rStyle w:val="VerbatimChar"/>
+        </w:rPr>
+        <w:t xml:space="preserve">wt_final</w:t>
+      </w:r>
+      <w:r>
+        <w:t xml:space="preserve">) trong các mô hình hồi quy vì ba lý do. Thứ nhất, mục tiêu phân tích là xác định hệ số quan hệ I→P tại cấp doanh nghiệp (conditional on observables), không phải ước lượng thống kê mô tả đại diện tổng thể. Thứ hai, hai chiều fixed effects (quốc gia × năm) đã hấp thụ phần lớn biến thiên liên quan đến thiết kế lấy mẫu phân tầng. Thứ ba, tích hợp trọng số mẫu vào mô hình fixed effects không đồng nhất gây phức tạp ước lượng mà không đem lại cải thiện tính hợp lệ nội tại (Solon et al., 2015). Phân tích độ nhạy với trọng số được đề xuất như kiểm định tương lai (xem §2.4.2) để xác nhận tính vững của kết quả so với mẫu không có trọng số.</w:t>
+      </w:r>
+    </w:p>
+    <w:p>
+      <w:pPr>
+        <w:pStyle w:val="BodyText"/>
+      </w:pPr>
+      <w:r>
         <w:t xml:space="preserve">Giao thức hòa hợp bao gồm: crosswalk biến giữa ba schema; xử lý giá trị thiếu; loại bỏ ngoại lệ tại phân vị 1/99; chuyển đổi doanh thu về PPP USD 2017.</w:t>
       </w:r>
     </w:p>
-    <w:bookmarkEnd w:id="69"/>
-    <w:bookmarkStart w:id="70" w:name="đo-lường-biến-chi-tiết"/>
+    <w:bookmarkEnd w:id="75"/>
+    <w:bookmarkStart w:id="76" w:name="đo-lường-biến-chi-tiết"/>
     <w:p>
       <w:pPr>
         <w:pStyle w:val="Heading5"/>
@@ -11091,8 +9938,8 @@
         <w:t xml:space="preserve">Chiến lược đo lường DAI: sử dụng DAI_z_full làm biến chính trong mẫu con BEE; DAI_z_tier1 cho so sánh xuyên schema và kiểm định độ vững.</w:t>
       </w:r>
     </w:p>
-    <w:bookmarkEnd w:id="70"/>
-    <w:bookmarkStart w:id="71" w:name="phân-loại-icrv-6-nhóm"/>
+    <w:bookmarkEnd w:id="76"/>
+    <w:bookmarkStart w:id="77" w:name="phân-loại-icrv-6-nhóm"/>
     <w:p>
       <w:pPr>
         <w:pStyle w:val="Heading5"/>
@@ -11470,7 +10317,7 @@
               <w:jc w:val="left"/>
             </w:pPr>
             <w:r>
-              <w:t xml:space="preserve">Fiji, Papua New Guinea, Solomon Islands, Tonga, Vanuatu, Samoa, Kiribati</w:t>
+              <w:t xml:space="preserve">Fiji, Kiribati, Papua New Guinea, Samoa, Solomon Islands, Tonga, Vanuatu</w:t>
             </w:r>
           </w:p>
         </w:tc>
@@ -11483,6 +10330,16 @@
       <w:r>
         <w:t xml:space="preserve">Tổng: 5 + 5 + 6 + 7 + 17 + 7 = 47 nền kinh tế.</w:t>
       </w:r>
+      <w:r>
+        <w:t xml:space="preserve"> </w:t>
+      </w:r>
+      <w:r>
+        <w:rPr>
+          <w:iCs/>
+          <w:i/>
+        </w:rPr>
+        <w:t xml:space="preserve">(Ghi chú: phân tích P8 dùng bộ lọc WBES SIDS_small gồm 9 nước, bao gồm thêm Comoros và Timor-Leste không có trong khung ICRV lý thuyết.)</w:t>
+      </w:r>
     </w:p>
     <w:p>
       <w:pPr>
@@ -11492,8 +10349,8 @@
         <w:t xml:space="preserve">Phân loại dựa trên GNI/người PPP (trung bình 2020–2024, World Bank), Chỉ số Đổi mới Sáng tạo Toàn cầu (WIPO GII), và tỉ trọng doanh thu tài nguyên (IMF Fiscal Monitor). Tất cả 47 nền kinh tế không thay đổi nhóm ICRV trong giai đoạn 2009–2025 (ngưỡng kiểm tra: chuyển nhóm nếu GNI/người vượt ngưỡng ±15% trong ≥3 năm liên tiếp — không có trường hợp nào).</w:t>
       </w:r>
     </w:p>
-    <w:bookmarkEnd w:id="71"/>
-    <w:bookmarkStart w:id="72" w:name="chiến-lược-nhận-dạng-nhân-quả"/>
+    <w:bookmarkEnd w:id="77"/>
+    <w:bookmarkStart w:id="78" w:name="chiến-lược-nhận-dạng-nhân-quả"/>
     <w:p>
       <w:pPr>
         <w:pStyle w:val="Heading5"/>
@@ -11712,9 +10569,9 @@
         <w:t xml:space="preserve">Tầng 4 — Nhân rộng mẫu con: Pool đủ lớn (101.185) cho phép chạy M0–M7 riêng cho từng nhóm ICRV (Nhóm I: ~6.500; Nhóm IV: ~28.000) để kiểm định tính không đồng nhất.</w:t>
       </w:r>
     </w:p>
-    <w:bookmarkEnd w:id="72"/>
-    <w:bookmarkEnd w:id="73"/>
-    <w:bookmarkStart w:id="74" w:name="X784a621f97d84d1234604adf730450e02e3ef35"/>
+    <w:bookmarkEnd w:id="78"/>
+    <w:bookmarkEnd w:id="79"/>
+    <w:bookmarkStart w:id="80" w:name="X784a621f97d84d1234604adf730450e02e3ef35"/>
     <w:p>
       <w:pPr>
         <w:pStyle w:val="Heading4"/>
@@ -12122,8 +10979,8 @@
         <w:t xml:space="preserve">Quy trình báo cáo: nếu ≥4/6 nhóm R1–R6 cho kết quả nhất quán với chuẩn (dấu đúng, p &lt; 0,10), kết quả được coi là "xác nhận mạnh". Nếu chỉ 2–3/6 nhóm nhất quán, kết quả là "hỗ trợ có điều kiện". Nếu &lt; 2/6 nhóm nhất quán, kết quả cần tái xem xét và không được tuyên bố giả thuyết được xác nhận.</w:t>
       </w:r>
     </w:p>
-    <w:bookmarkEnd w:id="74"/>
-    <w:bookmarkStart w:id="78" w:name="X0dab72e42c14670f7b3d769166e27ff618c9551"/>
+    <w:bookmarkEnd w:id="80"/>
+    <w:bookmarkStart w:id="84" w:name="X0dab72e42c14670f7b3d769166e27ff618c9551"/>
     <w:p>
       <w:pPr>
         <w:pStyle w:val="Heading4"/>
@@ -12132,7 +10989,7 @@
         <w:t xml:space="preserve">2.3.8 Thảo luận: đóng góp lý thuyết và thực tiễn</w:t>
       </w:r>
     </w:p>
-    <w:bookmarkStart w:id="75" w:name="đóng-góp-lý-thuyết"/>
+    <w:bookmarkStart w:id="81" w:name="đóng-góp-lý-thuyết"/>
     <w:p>
       <w:pPr>
         <w:pStyle w:val="Heading5"/>
@@ -12146,15 +11003,15 @@
         <w:pStyle w:val="FirstParagraph"/>
       </w:pPr>
       <w:r>
-        <w:t xml:space="preserve">Đóng góp 1: Khung tích hợp 4 tầng + Digital Capability Lens cho châu Á. Không có khung tương đương trong văn liệu IB cho khu vực 47 nền kinh tế bao gồm cả quốc đảo nhỏ Thái Bình Dương. Khung tích hợp Uppsala + RBV + Institutional Theory + Upper Echelons + Digital Capability Lens cho phép giải thích đồng thời tính không đồng nhất quan sát được — điều mà các mô hình đơn lý thuyết không làm được.</w:t>
-      </w:r>
-    </w:p>
-    <w:p>
-      <w:pPr>
-        <w:pStyle w:val="BodyText"/>
-      </w:pPr>
-      <w:r>
-        <w:t xml:space="preserve">Đóng góp 2: CDCM — Hình thức hóa Mô hình Năng lực số phụ thuộc bối cảnh. CDCM được phát hiện trong phân tích mô tả Chuyên đề Tiến sĩ số 1 và được làm sắc nét trong chuyên đề này qua H3: DAI là nguồn lực mở rộng tình huống (không phải phần thưởng đồng nhất), với tác động phụ thuộc ba chiều ngữ cảnh (chế độ × mức FSTS × bão hòa số). CDCM lấp đầy khoảng trống tại giao điểm của lý thuyết IB số và lý thuyết thể chế — chưa có trong văn liệu.</w:t>
+        <w:t xml:space="preserve">Đóng góp 1: Khung tích hợp 4 tầng + Foundational Digital Adoption Framework cho châu Á. Không có khung tương đương trong văn liệu IB cho khu vực 47 nền kinh tế bao gồm cả quốc đảo nhỏ Thái Bình Dương. Khung tích hợp Uppsala + RBV + Institutional Theory + Upper Echelons + Foundational Digital Adoption Framework cho phép giải thích đồng thời tính không đồng nhất quan sát được — điều mà các mô hình đơn lý thuyết không làm được.</w:t>
+      </w:r>
+    </w:p>
+    <w:p>
+      <w:pPr>
+        <w:pStyle w:val="BodyText"/>
+      </w:pPr>
+      <w:r>
+        <w:t xml:space="preserve">Đóng góp 2: CDCM — Hình thức hóa Mô hình Áp dụng số và Năng lực phụ thuộc bối cảnh. CDCM được phát hiện trong phân tích mô tả Chuyên đề Tiến sĩ số 1 và được làm sắc nét trong chuyên đề này qua H3: DAI là nguồn lực mở rộng tình huống (không phải phần thưởng đồng nhất), với tác động phụ thuộc ba chiều ngữ cảnh (chế độ × mức FSTS × bão hòa số). CDCM lấp đầy khoảng trống tại giao điểm của lý thuyết IB số và lý thuyết thể chế — chưa có trong văn liệu.</w:t>
       </w:r>
     </w:p>
     <w:p>
@@ -12173,8 +11030,8 @@
         <w:t xml:space="preserve">Đóng góp 4: Giả thuyết gánh nặng tắt buộc trong khung I→P. Dạng hàm forced penalty (SIDS Nhóm VI) được tích hợp vào H5 như trường hợp cực đoan của gradient thể chế — SIDS không có chữ U ngược điển hình do quốc tế hóa bắt buộc (Briguglio, 1995). Tích hợp này mở rộng văn liệu I→P từ châu Á lục địa sang các quốc đảo nhỏ Thái Bình Dương.</w:t>
       </w:r>
     </w:p>
-    <w:bookmarkEnd w:id="75"/>
-    <w:bookmarkStart w:id="76" w:name="đóng-góp-về-mô-hình-và-phương-pháp"/>
+    <w:bookmarkEnd w:id="81"/>
+    <w:bookmarkStart w:id="82" w:name="đóng-góp-về-mô-hình-và-phương-pháp"/>
     <w:p>
       <w:pPr>
         <w:pStyle w:val="Heading5"/>
@@ -12215,8 +11072,8 @@
         <w:t xml:space="preserve">Đóng góp 8: Thiết kế giai đoạn thời gian ba giai đoạn. Phân chia 14 sóng WBES thành ba giai đoạn (2009–12 / 2013–17 / 2018–25) và kiểm định tương tác FSTS×Year_bucket là thiết kế chưa được áp dụng trong văn liệu I→P cho châu Á. Bằng chứng từ P3 Việt Nam và P5 Trung Quốc neo đậu kỳ vọng thực nghiệm.</w:t>
       </w:r>
     </w:p>
-    <w:bookmarkEnd w:id="76"/>
-    <w:bookmarkStart w:id="77" w:name="hàm-ý-chính-sách"/>
+    <w:bookmarkEnd w:id="82"/>
+    <w:bookmarkStart w:id="83" w:name="hàm-ý-chính-sách"/>
     <w:p>
       <w:pPr>
         <w:pStyle w:val="Heading5"/>
@@ -12296,10 +11153,10 @@
         </w:pict>
       </w:r>
     </w:p>
-    <w:bookmarkEnd w:id="77"/>
-    <w:bookmarkEnd w:id="78"/>
-    <w:bookmarkEnd w:id="79"/>
-    <w:bookmarkStart w:id="83" w:name="X3e03e0a730be87d669f079340c35b479d0b1a1b"/>
+    <w:bookmarkEnd w:id="83"/>
+    <w:bookmarkEnd w:id="84"/>
+    <w:bookmarkEnd w:id="85"/>
+    <w:bookmarkStart w:id="89" w:name="X3e03e0a730be87d669f079340c35b479d0b1a1b"/>
     <w:p>
       <w:pPr>
         <w:pStyle w:val="Heading3"/>
@@ -12308,7 +11165,7 @@
         <w:t xml:space="preserve">2.4 Kết luận và đề xuất</w:t>
       </w:r>
     </w:p>
-    <w:bookmarkStart w:id="80" w:name="X2348ba230572cbe65b0d5b739c22f4e83186482"/>
+    <w:bookmarkStart w:id="86" w:name="X2348ba230572cbe65b0d5b739c22f4e83186482"/>
     <w:p>
       <w:pPr>
         <w:pStyle w:val="Heading4"/>
@@ -12322,7 +11179,7 @@
         <w:pStyle w:val="FirstParagraph"/>
       </w:pPr>
       <w:r>
-        <w:t xml:space="preserve">Chuyên đề này xây dựng một mô hình nghiên cứu toàn diện về quan hệ quốc tế hóa → hiệu quả (I→P) cho châu Á và Thái Bình Dương. Mô hình tích hợp năm tầng lý thuyết — Uppsala, RBV, Institutional Theory, Upper Echelons, Digital Capability Lens — vào tám mô hình thực nghiệm M0–M7 có thể kiểm định trên pool 101.185 doanh nghiệp WBES xuyên 47 nền kinh tế và 108 cặp quốc gia-năm. Hệ giả thuyết H1–H6 được phát triển có neo đậu thực nghiệm từ ba bản thảo đồng hành (P3 Việt Nam, P4 Singapore, P5 Trung Quốc) — xác nhận tính khả nghiệm của khung đề xuất trước khi áp dụng cho toàn pool.</w:t>
+        <w:t xml:space="preserve">Chuyên đề này xây dựng một mô hình nghiên cứu toàn diện về quan hệ quốc tế hóa → hiệu quả (I→P) cho châu Á và Thái Bình Dương. Mô hình tích hợp năm tầng lý thuyết — Uppsala, RBV, Institutional Theory, Upper Echelons, Foundational Digital Adoption Framework — vào tám mô hình thực nghiệm M0–M7 có thể kiểm định trên pool 101.185 doanh nghiệp WBES xuyên 47 nền kinh tế và 108 cặp quốc gia-năm. Hệ giả thuyết H1–H6 được phát triển có neo đậu thực nghiệm từ ba bản thảo đồng hành (P3 Việt Nam, P4 Singapore, P5 Trung Quốc) — xác nhận tính khả nghiệm của khung đề xuất trước khi áp dụng cho toàn pool.</w:t>
       </w:r>
     </w:p>
     <w:p>
@@ -12349,8 +11206,8 @@
         <w:t xml:space="preserve">Thông điệp chính sách cốt lõi: không có một công thức duy nhất cho quốc tế hóa thành công — chế độ thể chế, năng lực công nghệ nội tại, và mức độ số hóa cùng quyết định hiệu quả của chiến lược xuất khẩu. Chính sách và chiến lược doanh nghiệp cần được hiệu chỉnh theo vị trí trên bản đồ ICRV.</w:t>
       </w:r>
     </w:p>
-    <w:bookmarkEnd w:id="80"/>
-    <w:bookmarkStart w:id="81" w:name="Xd817586c1cd13f8a893b8cdf4a29f85d5fe00a8"/>
+    <w:bookmarkEnd w:id="86"/>
+    <w:bookmarkStart w:id="87" w:name="Xd817586c1cd13f8a893b8cdf4a29f85d5fe00a8"/>
     <w:p>
       <w:pPr>
         <w:pStyle w:val="Heading4"/>
@@ -12522,8 +11379,8 @@
         </w:pict>
       </w:r>
     </w:p>
-    <w:bookmarkEnd w:id="81"/>
-    <w:bookmarkStart w:id="82" w:name="Xc14c8adf4a1440a86a0b4da5fa92c77edd50b1b"/>
+    <w:bookmarkEnd w:id="87"/>
+    <w:bookmarkStart w:id="88" w:name="Xc14c8adf4a1440a86a0b4da5fa92c77edd50b1b"/>
     <w:p>
       <w:pPr>
         <w:pStyle w:val="Heading4"/>
@@ -12555,7 +11412,7 @@
         <w:t xml:space="preserve"> </w:t>
       </w:r>
       <w:r>
-        <w:t xml:space="preserve">Mở rộng ICBEF 2025 baseline (Đỗ &amp; Phan, 2024, k=113) lên k≈235 với hệ thống tìm kiếm PRISMA 2020 trên Web of Science + Scopus (1977–2026). Ba biến điều tiết mới chưa được kiểm định trong bất kỳ meta-analysis I→P nào: (i) cDAI — mức độ số hóa cấp quốc gia khuếch đại lợi ích quốc tế hóa; (ii) ICRV 5 nhóm cho châu Á-Thái Bình Dương thay vì phân loại toàn cầu thô trong Marano et al. (2016); (iii) DPL phase — phân chia dữ liệu theo trước/trong/sau bước ngoặt số 2009. Kết quả meta-analytic sẽ xác nhận hoặc bác bỏ gradient ICRV trong H5 trên cơ sở dữ liệu xuyên nghiên cứu. Hướng này lấp đầy khoảng trống P6 từ bằng chứng kép: thiếu Tier-2 DAI (P3 Vietnam) và thiếu hội tụ cấu trúc (P5 China).</w:t>
+        <w:t xml:space="preserve">Mở rộng ICBEF 2025 baseline (Đỗ &amp; Phan, 2024, k=113) lên k≈235 với hệ thống tìm kiếm PRISMA 2020 trên Web of Science + Scopus (1977–2026). Ba biến điều tiết mới chưa được kiểm định trong bất kỳ meta-analysis I→P nào: (i) cDAI — mức độ số hóa cấp quốc gia khuếch đại lợi ích quốc tế hóa; (ii) ICRV 6 nhóm cho châu Á-Thái Bình Dương thay vì phân loại toàn cầu thô trong Marano et al. (2016); (iii) DPL phase — phân chia dữ liệu theo trước/trong/sau bước ngoặt số 2009. Kết quả meta-analytic sẽ xác nhận hoặc bác bỏ gradient ICRV trong H5 trên cơ sở dữ liệu xuyên nghiên cứu. Hướng này lấp đầy khoảng trống P6 từ bằng chứng kép: thiếu Tier-2 DAI (P3 Vietnam) và thiếu hội tụ cấu trúc (P5 China).</w:t>
       </w:r>
     </w:p>
     <w:p>
@@ -12567,31 +11424,47 @@
           <w:bCs/>
           <w:b/>
         </w:rPr>
-        <w:t xml:space="preserve">Hướng 2 — P7: Kiểm định H1–H6 toàn pool 25 nền kinh tế đại diện (IJOEM hoặc JWB):</w:t>
-      </w:r>
-      <w:r>
-        <w:t xml:space="preserve"> </w:t>
-      </w:r>
-      <w:r>
-        <w:t xml:space="preserve">Áp dụng M0–M7 cho mẫu con 25 nền kinh tế đại diện từ tất cả 6 nhóm ICRV — kiểm định toàn bộ H1–H6 đồng thời trên dữ liệu hòa hợp với country và year fixed effects. Trọng tâm là mô hình M7 điều tiết ba chiều (FSTS × TCI × ICRV regime): liệu hiệu ứng nâng mặt bằng TCI (H2) và nguồn lực tình huống DAI (H3) có được gradient hóa theo chế độ thể chế như CDCM dự đoán không? P3 (Nhóm IV, DAI IV null), P4 (Nhóm I, DAI amplification) và P5 (Nhóm III, null moderation) cung cấp neo đậu cross-context cho dự đoán này.</w:t>
-      </w:r>
-    </w:p>
-    <w:p>
-      <w:pPr>
-        <w:pStyle w:val="BodyText"/>
-      </w:pPr>
+        <w:t xml:space="preserve">Hướng 2 — P7: Kiểm định H1–H6 toàn pool 49 nền kinh tế (JIBS, under revision):</w:t>
+      </w:r>
+      <w:r>
+        <w:t xml:space="preserve"> </w:t>
+      </w:r>
+      <w:r>
+        <w:t xml:space="preserve">P7 đã hoàn thành — N=84,910–91,982 doanh nghiệp, 49 nền kinh tế châu Á và Thái Bình Dương, 102 country-year waves, 6 nhóm ICRV. Kết quả xác nhận: H1 (phi tuyến) TP≈36%; H2 TCI level effect β≈+0.344 (p&lt;.05); H3 DAI universal level effect β=+0.155 (p&lt;.001) + cả hai curvature interactions; H5 ICRV gradient — TP</w:t>
+      </w:r>
+      <w:r>
+        <w:t xml:space="preserve"> </w:t>
+      </w:r>
       <w:r>
         <w:rPr>
           <w:bCs/>
           <w:b/>
         </w:rPr>
-        <w:t xml:space="preserve">Hướng 3 — P8: SIDS Thái Bình Dương — gánh nặng tắt buộc (World Development hoặc Pacific Economic Bulletin):</w:t>
-      </w:r>
-      <w:r>
-        <w:t xml:space="preserve"> </w:t>
-      </w:r>
-      <w:r>
-        <w:t xml:space="preserve">Nghiên cứu chuyên biệt cho 7 SIDS (Nhóm VI: Fiji, PNG, Solomon Islands, Tonga, Vanuatu, Samoa, Kiribati) kiểm định giả thuyết gánh nặng tắt buộc (Briguglio, 1995; Bertram, 2006): phải quốc tế hóa để sinh tồn dù điều kiện thể chế không hỗ trợ → r(FSTS, logLP) âm cấu trúc. Khoảng trống H1b trong CD2 (điểm uốn &lt; 10% FSTS hoặc hàm giảm đơn điệu ở SIDS) cần bằng chứng cấp doanh nghiệp trực tiếp.</w:t>
+        <w:t xml:space="preserve">giảm</w:t>
+      </w:r>
+      <w:r>
+        <w:t xml:space="preserve"> </w:t>
+      </w:r>
+      <w:r>
+        <w:t xml:space="preserve">từ SIDS/Frontier (~55%) xuống Advanced Innovation (~28%); DAI×ICRV p=.012 (digital shield strongest khi thể chế yếu). P3 (Nhóm IV), P4 (Nhóm I), P5 (Nhóm III) cung cấp neo đậu cross-context đã được xác nhận bởi pooled 49-economy results.</w:t>
+      </w:r>
+    </w:p>
+    <w:p>
+      <w:pPr>
+        <w:pStyle w:val="BodyText"/>
+      </w:pPr>
+      <w:r>
+        <w:rPr>
+          <w:bCs/>
+          <w:b/>
+        </w:rPr>
+        <w:t xml:space="preserve">Hướng 3 — P8: SIDS Thái Bình Dương — gánh nặng tắt buộc (World Development, under revision):</w:t>
+      </w:r>
+      <w:r>
+        <w:t xml:space="preserve"> </w:t>
+      </w:r>
+      <w:r>
+        <w:t xml:space="preserve">P8 đã hoàn thành — N=1.469 doanh nghiệp, 9 nước SIDS (Nhóm VI ICRV: Fiji, Kiribati, PNG, Samoa, Solomon Islands, Tonga, Vanuatu + Comoros + Timor-Leste), β(FSTS_c)=−0,404* xác nhận Forced Internationalization Penalty: quan hệ âm đơn điệu không có turning point, nhất quán với giả thuyết gánh nặng tắt buộc (Briguglio, 1995; Bertram, 2006). Khoảng trống H1b trong CD2 đã được lấp đầy bởi P8.</w:t>
       </w:r>
     </w:p>
     <w:p>
@@ -12637,10 +11510,10 @@
         </w:pict>
       </w:r>
     </w:p>
-    <w:bookmarkEnd w:id="82"/>
-    <w:bookmarkEnd w:id="83"/>
-    <w:bookmarkEnd w:id="84"/>
-    <w:bookmarkStart w:id="117" w:name="tài-liệu-tham-khảo"/>
+    <w:bookmarkEnd w:id="88"/>
+    <w:bookmarkEnd w:id="89"/>
+    <w:bookmarkEnd w:id="90"/>
+    <w:bookmarkStart w:id="124" w:name="tài-liệu-tham-khảo"/>
     <w:p>
       <w:pPr>
         <w:pStyle w:val="Heading2"/>
@@ -12693,7 +11566,7 @@
       <w:r>
         <w:t xml:space="preserve"> </w:t>
       </w:r>
-      <w:hyperlink r:id="rId85">
+      <w:hyperlink r:id="rId91">
         <w:r>
           <w:rPr>
             <w:rStyle w:val="Hyperlink"/>
@@ -12725,7 +11598,7 @@
       <w:r>
         <w:t xml:space="preserve"> </w:t>
       </w:r>
-      <w:hyperlink r:id="rId86">
+      <w:hyperlink r:id="rId92">
         <w:r>
           <w:rPr>
             <w:rStyle w:val="Hyperlink"/>
@@ -12799,7 +11672,7 @@
       <w:r>
         <w:t xml:space="preserve"> </w:t>
       </w:r>
-      <w:hyperlink r:id="rId87">
+      <w:hyperlink r:id="rId93">
         <w:r>
           <w:rPr>
             <w:rStyle w:val="Hyperlink"/>
@@ -12852,7 +11725,7 @@
       <w:r>
         <w:t xml:space="preserve"> </w:t>
       </w:r>
-      <w:hyperlink r:id="rId88">
+      <w:hyperlink r:id="rId94">
         <w:r>
           <w:rPr>
             <w:rStyle w:val="Hyperlink"/>
@@ -12884,7 +11757,7 @@
       <w:r>
         <w:t xml:space="preserve"> </w:t>
       </w:r>
-      <w:hyperlink r:id="rId89">
+      <w:hyperlink r:id="rId95">
         <w:r>
           <w:rPr>
             <w:rStyle w:val="Hyperlink"/>
@@ -12916,7 +11789,7 @@
       <w:r>
         <w:t xml:space="preserve"> </w:t>
       </w:r>
-      <w:hyperlink r:id="rId90">
+      <w:hyperlink r:id="rId96">
         <w:r>
           <w:rPr>
             <w:rStyle w:val="Hyperlink"/>
@@ -12948,7 +11821,7 @@
       <w:r>
         <w:t xml:space="preserve"> </w:t>
       </w:r>
-      <w:hyperlink r:id="rId91">
+      <w:hyperlink r:id="rId97">
         <w:r>
           <w:rPr>
             <w:rStyle w:val="Hyperlink"/>
@@ -12980,7 +11853,7 @@
       <w:r>
         <w:t xml:space="preserve"> </w:t>
       </w:r>
-      <w:hyperlink r:id="rId92">
+      <w:hyperlink r:id="rId98">
         <w:r>
           <w:rPr>
             <w:rStyle w:val="Hyperlink"/>
@@ -13033,7 +11906,7 @@
       <w:r>
         <w:t xml:space="preserve"> </w:t>
       </w:r>
-      <w:hyperlink r:id="rId93">
+      <w:hyperlink r:id="rId99">
         <w:r>
           <w:rPr>
             <w:rStyle w:val="Hyperlink"/>
@@ -13202,7 +12075,7 @@
       <w:r>
         <w:t xml:space="preserve"> </w:t>
       </w:r>
-      <w:hyperlink r:id="rId94">
+      <w:hyperlink r:id="rId100">
         <w:r>
           <w:rPr>
             <w:rStyle w:val="Hyperlink"/>
@@ -13258,7 +12131,7 @@
       <w:r>
         <w:t xml:space="preserve"> </w:t>
       </w:r>
-      <w:hyperlink r:id="rId95">
+      <w:hyperlink r:id="rId101">
         <w:r>
           <w:rPr>
             <w:rStyle w:val="Hyperlink"/>
@@ -13290,7 +12163,7 @@
       <w:r>
         <w:t xml:space="preserve"> </w:t>
       </w:r>
-      <w:hyperlink r:id="rId96">
+      <w:hyperlink r:id="rId102">
         <w:r>
           <w:rPr>
             <w:rStyle w:val="Hyperlink"/>
@@ -13322,7 +12195,7 @@
       <w:r>
         <w:t xml:space="preserve"> </w:t>
       </w:r>
-      <w:hyperlink r:id="rId97">
+      <w:hyperlink r:id="rId103">
         <w:r>
           <w:rPr>
             <w:rStyle w:val="Hyperlink"/>
@@ -13375,7 +12248,7 @@
       <w:r>
         <w:t xml:space="preserve"> </w:t>
       </w:r>
-      <w:hyperlink r:id="rId98">
+      <w:hyperlink r:id="rId104">
         <w:r>
           <w:rPr>
             <w:rStyle w:val="Hyperlink"/>
@@ -13407,7 +12280,7 @@
       <w:r>
         <w:t xml:space="preserve"> </w:t>
       </w:r>
-      <w:hyperlink r:id="rId99">
+      <w:hyperlink r:id="rId105">
         <w:r>
           <w:rPr>
             <w:rStyle w:val="Hyperlink"/>
@@ -13439,7 +12312,7 @@
       <w:r>
         <w:t xml:space="preserve"> </w:t>
       </w:r>
-      <w:hyperlink r:id="rId100">
+      <w:hyperlink r:id="rId106">
         <w:r>
           <w:rPr>
             <w:rStyle w:val="Hyperlink"/>
@@ -13492,7 +12365,7 @@
       <w:r>
         <w:t xml:space="preserve"> </w:t>
       </w:r>
-      <w:hyperlink r:id="rId101">
+      <w:hyperlink r:id="rId107">
         <w:r>
           <w:rPr>
             <w:rStyle w:val="Hyperlink"/>
@@ -13545,7 +12418,7 @@
       <w:r>
         <w:t xml:space="preserve"> </w:t>
       </w:r>
-      <w:hyperlink r:id="rId102">
+      <w:hyperlink r:id="rId108">
         <w:r>
           <w:rPr>
             <w:rStyle w:val="Hyperlink"/>
@@ -13598,7 +12471,7 @@
       <w:r>
         <w:t xml:space="preserve"> </w:t>
       </w:r>
-      <w:hyperlink r:id="rId103">
+      <w:hyperlink r:id="rId109">
         <w:r>
           <w:rPr>
             <w:rStyle w:val="Hyperlink"/>
@@ -13630,7 +12503,7 @@
       <w:r>
         <w:t xml:space="preserve"> </w:t>
       </w:r>
-      <w:hyperlink r:id="rId104">
+      <w:hyperlink r:id="rId110">
         <w:r>
           <w:rPr>
             <w:rStyle w:val="Hyperlink"/>
@@ -13662,7 +12535,7 @@
       <w:r>
         <w:t xml:space="preserve"> </w:t>
       </w:r>
-      <w:hyperlink r:id="rId105">
+      <w:hyperlink r:id="rId111">
         <w:r>
           <w:rPr>
             <w:rStyle w:val="Hyperlink"/>
@@ -13752,7 +12625,7 @@
       <w:r>
         <w:t xml:space="preserve"> </w:t>
       </w:r>
-      <w:hyperlink r:id="rId106">
+      <w:hyperlink r:id="rId112">
         <w:r>
           <w:rPr>
             <w:rStyle w:val="Hyperlink"/>
@@ -13847,7 +12720,7 @@
       <w:r>
         <w:t xml:space="preserve"> </w:t>
       </w:r>
-      <w:hyperlink r:id="rId107">
+      <w:hyperlink r:id="rId113">
         <w:r>
           <w:rPr>
             <w:rStyle w:val="Hyperlink"/>
@@ -13879,7 +12752,7 @@
       <w:r>
         <w:t xml:space="preserve"> </w:t>
       </w:r>
-      <w:hyperlink r:id="rId108">
+      <w:hyperlink r:id="rId114">
         <w:r>
           <w:rPr>
             <w:rStyle w:val="Hyperlink"/>
@@ -13911,7 +12784,7 @@
       <w:r>
         <w:t xml:space="preserve"> </w:t>
       </w:r>
-      <w:hyperlink r:id="rId109">
+      <w:hyperlink r:id="rId115">
         <w:r>
           <w:rPr>
             <w:rStyle w:val="Hyperlink"/>
@@ -13943,7 +12816,7 @@
       <w:r>
         <w:t xml:space="preserve"> </w:t>
       </w:r>
-      <w:hyperlink r:id="rId110">
+      <w:hyperlink r:id="rId116">
         <w:r>
           <w:rPr>
             <w:rStyle w:val="Hyperlink"/>
@@ -13975,7 +12848,7 @@
       <w:r>
         <w:t xml:space="preserve"> </w:t>
       </w:r>
-      <w:hyperlink r:id="rId111">
+      <w:hyperlink r:id="rId117">
         <w:r>
           <w:rPr>
             <w:rStyle w:val="Hyperlink"/>
@@ -14031,6 +12904,38 @@
         <w:pStyle w:val="BodyText"/>
       </w:pPr>
       <w:r>
+        <w:t xml:space="preserve">Solon, G., Haider, S. J., &amp; Wooldridge, J. M. (2015). What are we weighting for?</w:t>
+      </w:r>
+      <w:r>
+        <w:t xml:space="preserve"> </w:t>
+      </w:r>
+      <w:r>
+        <w:rPr>
+          <w:iCs/>
+          <w:i/>
+        </w:rPr>
+        <w:t xml:space="preserve">Journal of Human Resources, 50</w:t>
+      </w:r>
+      <w:r>
+        <w:t xml:space="preserve">(2), 301–316.</w:t>
+      </w:r>
+      <w:r>
+        <w:t xml:space="preserve"> </w:t>
+      </w:r>
+      <w:hyperlink r:id="rId118">
+        <w:r>
+          <w:rPr>
+            <w:rStyle w:val="Hyperlink"/>
+          </w:rPr>
+          <w:t xml:space="preserve">https://doi.org/10.3368/jhr.50.2.301</w:t>
+        </w:r>
+      </w:hyperlink>
+    </w:p>
+    <w:p>
+      <w:pPr>
+        <w:pStyle w:val="BodyText"/>
+      </w:pPr>
+      <w:r>
         <w:t xml:space="preserve">Stallkamp, M., &amp; Schotter, A. P. J. (2021). Platforms without borders? The international strategies of digital platform firms.</w:t>
       </w:r>
       <w:r>
@@ -14049,7 +12954,7 @@
       <w:r>
         <w:t xml:space="preserve"> </w:t>
       </w:r>
-      <w:hyperlink r:id="rId112">
+      <w:hyperlink r:id="rId119">
         <w:r>
           <w:rPr>
             <w:rStyle w:val="Hyperlink"/>
@@ -14123,7 +13028,7 @@
       <w:r>
         <w:t xml:space="preserve"> </w:t>
       </w:r>
-      <w:hyperlink r:id="rId113">
+      <w:hyperlink r:id="rId120">
         <w:r>
           <w:rPr>
             <w:rStyle w:val="Hyperlink"/>
@@ -14155,7 +13060,7 @@
       <w:r>
         <w:t xml:space="preserve"> </w:t>
       </w:r>
-      <w:hyperlink r:id="rId114">
+      <w:hyperlink r:id="rId121">
         <w:r>
           <w:rPr>
             <w:rStyle w:val="Hyperlink"/>
@@ -14211,7 +13116,7 @@
       <w:r>
         <w:t xml:space="preserve"> </w:t>
       </w:r>
-      <w:hyperlink r:id="rId115">
+      <w:hyperlink r:id="rId122">
         <w:r>
           <w:rPr>
             <w:rStyle w:val="Hyperlink"/>
@@ -14243,7 +13148,7 @@
       <w:r>
         <w:t xml:space="preserve"> </w:t>
       </w:r>
-      <w:hyperlink r:id="rId116">
+      <w:hyperlink r:id="rId123">
         <w:r>
           <w:rPr>
             <w:rStyle w:val="Hyperlink"/>
@@ -14304,8 +13209,8 @@
         </w:pict>
       </w:r>
     </w:p>
-    <w:bookmarkEnd w:id="117"/>
-    <w:bookmarkStart w:id="121" w:name="phụ-lục"/>
+    <w:bookmarkEnd w:id="124"/>
+    <w:bookmarkStart w:id="128" w:name="phụ-lục"/>
     <w:p>
       <w:pPr>
         <w:pStyle w:val="Heading2"/>
@@ -14314,7 +13219,7 @@
         <w:t xml:space="preserve">PHỤ LỤC</w:t>
       </w:r>
     </w:p>
-    <w:bookmarkStart w:id="118" w:name="X2ea52842c06e0496eaa899ccd5db2777360b638"/>
+    <w:bookmarkStart w:id="125" w:name="X2ea52842c06e0496eaa899ccd5db2777360b638"/>
     <w:p>
       <w:pPr>
         <w:pStyle w:val="Heading3"/>
@@ -14404,7 +13309,17 @@
         <w:t xml:space="preserve"> </w:t>
       </w:r>
       <w:r>
-        <w:t xml:space="preserve">Fiji, Papua New Guinea, Solomon Islands, Tonga, Vanuatu, Samoa, Kiribati.</w:t>
+        <w:t xml:space="preserve">Fiji, Kiribati, Papua New Guinea, Samoa, Solomon Islands, Tonga, Vanuatu.</w:t>
+      </w:r>
+      <w:r>
+        <w:t xml:space="preserve"> </w:t>
+      </w:r>
+      <w:r>
+        <w:rPr>
+          <w:iCs/>
+          <w:i/>
+        </w:rPr>
+        <w:t xml:space="preserve">(Ghi chú: phân tích P8 dùng bộ lọc WBES SIDS_small gồm 9 nước, bổ sung thêm Comoros và Timor-Leste.)</w:t>
       </w:r>
     </w:p>
     <w:p>
@@ -14415,8 +13330,8 @@
         <w:t xml:space="preserve">Tổng: 5 + 5 + 6 + 7 + 17 + 7 = 47 nền kinh tế.</w:t>
       </w:r>
     </w:p>
-    <w:bookmarkEnd w:id="118"/>
-    <w:bookmarkStart w:id="119" w:name="phụ-lục-b--tóm-tắt-ba-bản-thảo-đồng-hành"/>
+    <w:bookmarkEnd w:id="125"/>
+    <w:bookmarkStart w:id="126" w:name="phụ-lục-b--tóm-tắt-ba-bản-thảo-đồng-hành"/>
     <w:p>
       <w:pPr>
         <w:pStyle w:val="Heading3"/>
@@ -14449,8 +13364,8 @@
         <w:t xml:space="preserve">P5 — Trung Quốc (IJOEM, under review): Đỗ, T. H., &amp; Phan, A. T. (2026). Phân tích 4.559 doanh nghiệp WBES hai sóng 2012/2024. Kết quả chính: chữ U ngược bền vững cấu trúc — điểm uốn 49,4% (2012), 47,2% (2024), Paternoster FSTS² p = 0,545 (không có sự khác biệt đáng kể); TCI tăng cường theo thời gian (+0,260 → +0,426, Paternoster p = 0,011).</w:t>
       </w:r>
     </w:p>
-    <w:bookmarkEnd w:id="119"/>
-    <w:bookmarkStart w:id="120" w:name="phụ-lục-c--quy-ước-báo-cáo-thống-kê"/>
+    <w:bookmarkEnd w:id="126"/>
+    <w:bookmarkStart w:id="127" w:name="phụ-lục-c--quy-ước-báo-cáo-thống-kê"/>
     <w:p>
       <w:pPr>
         <w:pStyle w:val="Heading3"/>
@@ -14483,419 +13398,1123 @@
         <w:t xml:space="preserve">Kiểm định Paternoster: báo cáo z-statistic và p-value hai chiều cho so sánh hệ số giữa hai nhóm hoặc hai giai đoạn.</w:t>
       </w:r>
     </w:p>
-    <w:bookmarkEnd w:id="120"/>
-    <w:bookmarkEnd w:id="121"/>
-    <w:bookmarkEnd w:id="122"/>
+    <w:bookmarkEnd w:id="127"/>
+    <w:bookmarkEnd w:id="128"/>
+    <w:bookmarkEnd w:id="129"/>
     <w:sectPr>
-      <w:pgSz w:w="11906" w:h="16838"/>
-      <w:pgMar w:top="1440" w:right="1800" w:bottom="1440" w:left="1800" w:header="720" w:footer="720" w:gutter="0"/>
-      <w:cols w:space="720" w:num="1"/>
-      <w:docGrid w:linePitch="360" w:charSpace="0"/>
+      <w:pgSz w:h="16838" w:w="11906"/>
+      <w:pgMar w:bottom="1134" w:left="1701" w:right="1134" w:top="1134"/>
     </w:sectPr>
   </w:body>
 </w:document>
 </file>
 
-<file path=word/endnotes.xml><?xml version="1.0" encoding="utf-8"?>
-<w:endnotes xmlns:wpc="http://schemas.microsoft.com/office/word/2010/wordprocessingCanvas" xmlns:mc="http://schemas.openxmlformats.org/markup-compatibility/2006" xmlns:o="urn:schemas-microsoft-com:office:office" xmlns:r="http://schemas.openxmlformats.org/officeDocument/2006/relationships" xmlns:m="http://schemas.openxmlformats.org/officeDocument/2006/math" xmlns:v="urn:schemas-microsoft-com:vml" xmlns:wp14="http://schemas.microsoft.com/office/word/2010/wordprocessingDrawing" xmlns:wp="http://schemas.openxmlformats.org/drawingml/2006/wordprocessingDrawing" xmlns:w="http://schemas.openxmlformats.org/wordprocessingml/2006/main" xmlns:w14="http://schemas.microsoft.com/office/word/2010/wordml" xmlns:w15="http://schemas.microsoft.com/office/word/2012/wordml" xmlns:w10="urn:schemas-microsoft-com:office:word" xmlns:wpg="http://schemas.microsoft.com/office/word/2010/wordprocessingGroup" xmlns:wpi="http://schemas.microsoft.com/office/word/2010/wordprocessingInk" xmlns:wne="http://schemas.microsoft.com/office/word/2006/wordml" xmlns:wps="http://schemas.microsoft.com/office/word/2010/wordprocessingShape" xmlns:wpsCustomData="http://www.wps.cn/officeDocument/2013/wpsCustomData" mc:Ignorable="w14 w15 wp14">
-  <w:endnote w:type="separator" w:id="0">
-    <w:p>
-      <w:pPr>
-        <w:spacing w:line="240" w:lineRule="auto"/>
-      </w:pPr>
-      <w:r>
-        <w:separator/>
-      </w:r>
-    </w:p>
-  </w:endnote>
-  <w:endnote w:type="continuationSeparator" w:id="1">
-    <w:p>
-      <w:pPr>
-        <w:spacing w:line="240" w:lineRule="auto"/>
-      </w:pPr>
-      <w:r>
-        <w:continuationSeparator/>
-      </w:r>
-    </w:p>
-  </w:endnote>
-</w:endnotes>
+<file path=word/comments.xml><?xml version="1.0" encoding="utf-8"?>
+<w:comments xmlns:w="http://schemas.openxmlformats.org/wordprocessingml/2006/main" xmlns:m="http://schemas.openxmlformats.org/officeDocument/2006/math" xmlns:r="http://schemas.openxmlformats.org/officeDocument/2006/relationships" xmlns:o="urn:schemas-microsoft-com:office:office" xmlns:v="urn:schemas-microsoft-com:vml" xmlns:w10="urn:schemas-microsoft-com:office:word" xmlns:a="http://schemas.openxmlformats.org/drawingml/2006/main" xmlns:pic="http://schemas.openxmlformats.org/drawingml/2006/picture" xmlns:wp="http://schemas.openxmlformats.org/drawingml/2006/wordprocessingDrawing"/>
 </file>
 
 <file path=word/footnotes.xml><?xml version="1.0" encoding="utf-8"?>
-<w:footnotes xmlns:wpc="http://schemas.microsoft.com/office/word/2010/wordprocessingCanvas" xmlns:mc="http://schemas.openxmlformats.org/markup-compatibility/2006" xmlns:o="urn:schemas-microsoft-com:office:office" xmlns:r="http://schemas.openxmlformats.org/officeDocument/2006/relationships" xmlns:m="http://schemas.openxmlformats.org/officeDocument/2006/math" xmlns:v="urn:schemas-microsoft-com:vml" xmlns:wp14="http://schemas.microsoft.com/office/word/2010/wordprocessingDrawing" xmlns:wp="http://schemas.openxmlformats.org/drawingml/2006/wordprocessingDrawing" xmlns:w="http://schemas.openxmlformats.org/wordprocessingml/2006/main" xmlns:w14="http://schemas.microsoft.com/office/word/2010/wordml" xmlns:w15="http://schemas.microsoft.com/office/word/2012/wordml" xmlns:w10="urn:schemas-microsoft-com:office:word" xmlns:wpg="http://schemas.microsoft.com/office/word/2010/wordprocessingGroup" xmlns:wpi="http://schemas.microsoft.com/office/word/2010/wordprocessingInk" xmlns:wne="http://schemas.microsoft.com/office/word/2006/wordml" xmlns:wps="http://schemas.microsoft.com/office/word/2010/wordprocessingShape" xmlns:wpsCustomData="http://www.wps.cn/officeDocument/2013/wpsCustomData" mc:Ignorable="w14 w15 wp14">
-  <w:footnote w:type="separator" w:id="0">
-    <w:p>
-      <w:pPr>
-        <w:spacing w:before="0" w:after="0" w:line="276" w:lineRule="auto"/>
-      </w:pPr>
+<w:footnotes xmlns:w="http://schemas.openxmlformats.org/wordprocessingml/2006/main" xmlns:m="http://schemas.openxmlformats.org/officeDocument/2006/math" xmlns:r="http://schemas.openxmlformats.org/officeDocument/2006/relationships" xmlns:o="urn:schemas-microsoft-com:office:office" xmlns:v="urn:schemas-microsoft-com:vml" xmlns:w10="urn:schemas-microsoft-com:office:word" xmlns:a="http://schemas.openxmlformats.org/drawingml/2006/main" xmlns:pic="http://schemas.openxmlformats.org/drawingml/2006/picture" xmlns:wp="http://schemas.openxmlformats.org/drawingml/2006/wordprocessingDrawing">
+  <w:footnote w:type="continuationSeparator" w:id="0">
+    <w:p>
+      <w:r>
+        <w:continuationSeparator/>
+      </w:r>
+    </w:p>
+  </w:footnote>
+  <w:footnote w:type="separator" w:id="-1">
+    <w:p>
       <w:r>
         <w:separator/>
-      </w:r>
-    </w:p>
-  </w:footnote>
-  <w:footnote w:type="continuationSeparator" w:id="1">
-    <w:p>
-      <w:pPr>
-        <w:spacing w:before="0" w:after="0" w:line="276" w:lineRule="auto"/>
-      </w:pPr>
-      <w:r>
-        <w:continuationSeparator/>
       </w:r>
     </w:p>
   </w:footnote>
 </w:footnotes>
 </file>
 
+<file path=word/numbering.xml><?xml version="1.0" encoding="utf-8"?>
+<w:numbering xmlns:w="http://schemas.openxmlformats.org/wordprocessingml/2006/main">
+  <w:abstractNum w:abstractNumId="990">
+    <w:nsid w:val="A990"/>
+    <w:multiLevelType w:val="multilevel"/>
+    <w:lvl w:ilvl="0">
+      <w:numFmt w:val="bullet"/>
+      <w:lvlText w:val=" "/>
+      <w:lvlJc w:val="left"/>
+      <w:pPr>
+        <w:ind w:left="720" w:hanging="480"/>
+      </w:pPr>
+    </w:lvl>
+    <w:lvl w:ilvl="1">
+      <w:numFmt w:val="bullet"/>
+      <w:lvlText w:val=" "/>
+      <w:lvlJc w:val="left"/>
+      <w:pPr>
+        <w:ind w:left="1440" w:hanging="480"/>
+      </w:pPr>
+    </w:lvl>
+    <w:lvl w:ilvl="2">
+      <w:numFmt w:val="bullet"/>
+      <w:lvlText w:val=" "/>
+      <w:lvlJc w:val="left"/>
+      <w:pPr>
+        <w:ind w:left="2160" w:hanging="480"/>
+      </w:pPr>
+    </w:lvl>
+    <w:lvl w:ilvl="3">
+      <w:numFmt w:val="bullet"/>
+      <w:lvlText w:val=" "/>
+      <w:lvlJc w:val="left"/>
+      <w:pPr>
+        <w:ind w:left="2880" w:hanging="480"/>
+      </w:pPr>
+    </w:lvl>
+    <w:lvl w:ilvl="4">
+      <w:numFmt w:val="bullet"/>
+      <w:lvlText w:val=" "/>
+      <w:lvlJc w:val="left"/>
+      <w:pPr>
+        <w:ind w:left="3600" w:hanging="480"/>
+      </w:pPr>
+    </w:lvl>
+    <w:lvl w:ilvl="5">
+      <w:numFmt w:val="bullet"/>
+      <w:lvlText w:val=" "/>
+      <w:lvlJc w:val="left"/>
+      <w:pPr>
+        <w:ind w:left="4320" w:hanging="480"/>
+      </w:pPr>
+    </w:lvl>
+    <w:lvl w:ilvl="6">
+      <w:numFmt w:val="bullet"/>
+      <w:lvlText w:val=" "/>
+      <w:lvlJc w:val="left"/>
+      <w:pPr>
+        <w:ind w:left="5040" w:hanging="480"/>
+      </w:pPr>
+    </w:lvl>
+    <w:lvl w:ilvl="7">
+      <w:numFmt w:val="bullet"/>
+      <w:lvlText w:val=" "/>
+      <w:lvlJc w:val="left"/>
+      <w:pPr>
+        <w:ind w:left="5760" w:hanging="480"/>
+      </w:pPr>
+    </w:lvl>
+    <w:lvl w:ilvl="8">
+      <w:numFmt w:val="bullet"/>
+      <w:lvlText w:val=" "/>
+      <w:lvlJc w:val="left"/>
+      <w:pPr>
+        <w:ind w:left="6480" w:hanging="480"/>
+      </w:pPr>
+    </w:lvl>
+  </w:abstractNum>
+  <w:abstractNum w:abstractNumId="99411">
+    <w:nsid w:val="A99411"/>
+    <w:multiLevelType w:val="multilevel"/>
+    <w:lvl w:ilvl="0">
+      <w:start w:val="1"/>
+      <w:numFmt w:val="decimal"/>
+      <w:lvlText w:val="%1."/>
+      <w:lvlJc w:val="left"/>
+      <w:pPr>
+        <w:ind w:left="720" w:hanging="480"/>
+      </w:pPr>
+    </w:lvl>
+    <w:lvl w:ilvl="1">
+      <w:start w:val="1"/>
+      <w:numFmt w:val="decimal"/>
+      <w:lvlText w:val="%2."/>
+      <w:lvlJc w:val="left"/>
+      <w:pPr>
+        <w:ind w:left="1440" w:hanging="480"/>
+      </w:pPr>
+    </w:lvl>
+    <w:lvl w:ilvl="2">
+      <w:start w:val="1"/>
+      <w:numFmt w:val="decimal"/>
+      <w:lvlText w:val="%3."/>
+      <w:lvlJc w:val="left"/>
+      <w:pPr>
+        <w:ind w:left="2160" w:hanging="480"/>
+      </w:pPr>
+    </w:lvl>
+    <w:lvl w:ilvl="3">
+      <w:start w:val="1"/>
+      <w:numFmt w:val="decimal"/>
+      <w:lvlText w:val="%4."/>
+      <w:lvlJc w:val="left"/>
+      <w:pPr>
+        <w:ind w:left="2880" w:hanging="480"/>
+      </w:pPr>
+    </w:lvl>
+    <w:lvl w:ilvl="4">
+      <w:start w:val="1"/>
+      <w:numFmt w:val="decimal"/>
+      <w:lvlText w:val="%5."/>
+      <w:lvlJc w:val="left"/>
+      <w:pPr>
+        <w:ind w:left="3600" w:hanging="480"/>
+      </w:pPr>
+    </w:lvl>
+    <w:lvl w:ilvl="5">
+      <w:start w:val="1"/>
+      <w:numFmt w:val="decimal"/>
+      <w:lvlText w:val="%6."/>
+      <w:lvlJc w:val="left"/>
+      <w:pPr>
+        <w:ind w:left="4320" w:hanging="480"/>
+      </w:pPr>
+    </w:lvl>
+    <w:lvl w:ilvl="6">
+      <w:start w:val="1"/>
+      <w:numFmt w:val="decimal"/>
+      <w:lvlText w:val="%7."/>
+      <w:lvlJc w:val="left"/>
+      <w:pPr>
+        <w:ind w:left="5040" w:hanging="480"/>
+      </w:pPr>
+    </w:lvl>
+    <w:lvl w:ilvl="7">
+      <w:start w:val="1"/>
+      <w:numFmt w:val="decimal"/>
+      <w:lvlText w:val="%8."/>
+      <w:lvlJc w:val="left"/>
+      <w:pPr>
+        <w:ind w:left="5760" w:hanging="480"/>
+      </w:pPr>
+    </w:lvl>
+    <w:lvl w:ilvl="8">
+      <w:start w:val="1"/>
+      <w:numFmt w:val="decimal"/>
+      <w:lvlText w:val="%9."/>
+      <w:lvlJc w:val="left"/>
+      <w:pPr>
+        <w:ind w:left="6480" w:hanging="480"/>
+      </w:pPr>
+    </w:lvl>
+  </w:abstractNum>
+  <w:num w:numId="1000">
+    <w:abstractNumId w:val="990"/>
+  </w:num>
+  <w:num w:numId="1001">
+    <w:abstractNumId w:val="99411"/>
+    <w:lvlOverride w:ilvl="0">
+      <w:startOverride w:val="1"/>
+    </w:lvlOverride>
+    <w:lvlOverride w:ilvl="1">
+      <w:startOverride w:val="1"/>
+    </w:lvlOverride>
+    <w:lvlOverride w:ilvl="2">
+      <w:startOverride w:val="1"/>
+    </w:lvlOverride>
+    <w:lvlOverride w:ilvl="3">
+      <w:startOverride w:val="1"/>
+    </w:lvlOverride>
+    <w:lvlOverride w:ilvl="4">
+      <w:startOverride w:val="1"/>
+    </w:lvlOverride>
+    <w:lvlOverride w:ilvl="5">
+      <w:startOverride w:val="1"/>
+    </w:lvlOverride>
+    <w:lvlOverride w:ilvl="6">
+      <w:startOverride w:val="1"/>
+    </w:lvlOverride>
+    <w:lvlOverride w:ilvl="7">
+      <w:startOverride w:val="1"/>
+    </w:lvlOverride>
+    <w:lvlOverride w:ilvl="8">
+      <w:startOverride w:val="1"/>
+    </w:lvlOverride>
+  </w:num>
+</w:numbering>
+</file>
+
 <file path=word/styles.xml><?xml version="1.0" encoding="utf-8"?>
-<w:styles xmlns:mc="http://schemas.openxmlformats.org/markup-compatibility/2006" xmlns:o="urn:schemas-microsoft-com:office:office" xmlns:r="http://schemas.openxmlformats.org/officeDocument/2006/relationships" xmlns:m="http://schemas.openxmlformats.org/officeDocument/2006/math" xmlns:v="urn:schemas-microsoft-com:vml" xmlns:w="http://schemas.openxmlformats.org/wordprocessingml/2006/main" xmlns:w14="http://schemas.microsoft.com/office/word/2010/wordml" xmlns:w10="urn:schemas-microsoft-com:office:word" xmlns:sl="http://schemas.openxmlformats.org/schemaLibrary/2006/main" xmlns:wpsCustomData="http://www.wps.cn/officeDocument/2013/wpsCustomData" mc:Ignorable="w14">
+<w:styles xmlns:r="http://schemas.openxmlformats.org/officeDocument/2006/relationships" xmlns:w="http://schemas.openxmlformats.org/wordprocessingml/2006/main">
   <w:docDefaults>
     <w:rPrDefault>
       <w:rPr>
-        <w:rFonts w:asciiTheme="minorHAnsi" w:hAnsiTheme="minorHAnsi" w:eastAsiaTheme="minorEastAsia" w:cstheme="minorBidi"/>
+        <w:rFonts w:asciiTheme="minorHAnsi" w:cstheme="minorBidi" w:eastAsiaTheme="minorHAnsi" w:hAnsiTheme="minorHAnsi"/>
+        <w:sz w:val="24"/>
+        <w:szCs w:val="24"/>
+        <w:lang w:bidi="ar-SA" w:eastAsia="en-US" w:val="en-US"/>
       </w:rPr>
     </w:rPrDefault>
-    <w:pPrDefault/>
+    <w:pPrDefault>
+      <w:pPr>
+        <w:spacing w:after="200"/>
+      </w:pPr>
+    </w:pPrDefault>
   </w:docDefaults>
-  <w:latentStyles w:count="260" w:defQFormat="0" w:defUnhideWhenUsed="1" w:defSemiHidden="1" w:defUIPriority="99" w:defLockedState="0">
-    <w:lsdException w:qFormat="1" w:unhideWhenUsed="0" w:uiPriority="0" w:semiHidden="0" w:name="Normal"/>
-    <w:lsdException w:qFormat="1" w:unhideWhenUsed="0" w:uiPriority="0" w:semiHidden="0" w:name="heading 1"/>
-    <w:lsdException w:qFormat="1" w:uiPriority="0" w:name="heading 2"/>
-    <w:lsdException w:qFormat="1" w:uiPriority="0" w:name="heading 3"/>
-    <w:lsdException w:qFormat="1" w:uiPriority="0" w:name="heading 4"/>
-    <w:lsdException w:qFormat="1" w:uiPriority="0" w:name="heading 5"/>
-    <w:lsdException w:qFormat="1" w:uiPriority="0" w:name="heading 6"/>
-    <w:lsdException w:qFormat="1" w:uiPriority="0" w:name="heading 7"/>
-    <w:lsdException w:qFormat="1" w:uiPriority="0" w:name="heading 8"/>
-    <w:lsdException w:qFormat="1" w:uiPriority="0" w:name="heading 9"/>
-    <w:lsdException w:unhideWhenUsed="0" w:uiPriority="0" w:semiHidden="0" w:name="index 1"/>
-    <w:lsdException w:unhideWhenUsed="0" w:uiPriority="0" w:semiHidden="0" w:name="index 2"/>
-    <w:lsdException w:unhideWhenUsed="0" w:uiPriority="0" w:semiHidden="0" w:name="index 3"/>
-    <w:lsdException w:unhideWhenUsed="0" w:uiPriority="0" w:semiHidden="0" w:name="index 4"/>
-    <w:lsdException w:unhideWhenUsed="0" w:uiPriority="0" w:semiHidden="0" w:name="index 5"/>
-    <w:lsdException w:unhideWhenUsed="0" w:uiPriority="0" w:semiHidden="0" w:name="index 6"/>
-    <w:lsdException w:unhideWhenUsed="0" w:uiPriority="0" w:semiHidden="0" w:name="index 7"/>
-    <w:lsdException w:unhideWhenUsed="0" w:uiPriority="0" w:semiHidden="0" w:name="index 8"/>
-    <w:lsdException w:unhideWhenUsed="0" w:uiPriority="0" w:semiHidden="0" w:name="index 9"/>
-    <w:lsdException w:unhideWhenUsed="0" w:uiPriority="0" w:semiHidden="0" w:name="toc 1"/>
-    <w:lsdException w:unhideWhenUsed="0" w:uiPriority="0" w:semiHidden="0" w:name="toc 2"/>
-    <w:lsdException w:unhideWhenUsed="0" w:uiPriority="0" w:semiHidden="0" w:name="toc 3"/>
-    <w:lsdException w:unhideWhenUsed="0" w:uiPriority="0" w:semiHidden="0" w:name="toc 4"/>
-    <w:lsdException w:unhideWhenUsed="0" w:uiPriority="0" w:semiHidden="0" w:name="toc 5"/>
-    <w:lsdException w:unhideWhenUsed="0" w:uiPriority="0" w:semiHidden="0" w:name="toc 6"/>
-    <w:lsdException w:unhideWhenUsed="0" w:uiPriority="0" w:semiHidden="0" w:name="toc 7"/>
-    <w:lsdException w:unhideWhenUsed="0" w:uiPriority="0" w:semiHidden="0" w:name="toc 8"/>
-    <w:lsdException w:unhideWhenUsed="0" w:uiPriority="0" w:semiHidden="0" w:name="toc 9"/>
-    <w:lsdException w:unhideWhenUsed="0" w:uiPriority="0" w:semiHidden="0" w:name="Normal Indent"/>
-    <w:lsdException w:unhideWhenUsed="0" w:uiPriority="0" w:semiHidden="0" w:name="footnote text"/>
-    <w:lsdException w:unhideWhenUsed="0" w:uiPriority="0" w:semiHidden="0" w:name="annotation text"/>
-    <w:lsdException w:qFormat="1" w:unhideWhenUsed="0" w:uiPriority="0" w:semiHidden="0" w:name="header"/>
-    <w:lsdException w:unhideWhenUsed="0" w:uiPriority="0" w:semiHidden="0" w:name="footer"/>
-    <w:lsdException w:unhideWhenUsed="0" w:uiPriority="0" w:semiHidden="0" w:name="index heading"/>
-    <w:lsdException w:qFormat="1" w:uiPriority="0" w:name="caption"/>
-    <w:lsdException w:unhideWhenUsed="0" w:uiPriority="0" w:semiHidden="0" w:name="table of figures"/>
-    <w:lsdException w:unhideWhenUsed="0" w:uiPriority="0" w:semiHidden="0" w:name="envelope address"/>
-    <w:lsdException w:unhideWhenUsed="0" w:uiPriority="0" w:semiHidden="0" w:name="envelope return"/>
-    <w:lsdException w:unhideWhenUsed="0" w:uiPriority="0" w:semiHidden="0" w:name="footnote reference"/>
-    <w:lsdException w:unhideWhenUsed="0" w:uiPriority="0" w:semiHidden="0" w:name="annotation reference"/>
-    <w:lsdException w:unhideWhenUsed="0" w:uiPriority="0" w:semiHidden="0" w:name="line number"/>
-    <w:lsdException w:unhideWhenUsed="0" w:uiPriority="0" w:semiHidden="0" w:name="page number"/>
-    <w:lsdException w:unhideWhenUsed="0" w:uiPriority="0" w:semiHidden="0" w:name="endnote reference"/>
-    <w:lsdException w:unhideWhenUsed="0" w:uiPriority="0" w:semiHidden="0" w:name="endnote text"/>
-    <w:lsdException w:unhideWhenUsed="0" w:uiPriority="0" w:semiHidden="0" w:name="table of authorities"/>
-    <w:lsdException w:unhideWhenUsed="0" w:uiPriority="0" w:semiHidden="0" w:name="macro"/>
-    <w:lsdException w:unhideWhenUsed="0" w:uiPriority="0" w:semiHidden="0" w:name="toa heading"/>
-    <w:lsdException w:unhideWhenUsed="0" w:uiPriority="0" w:semiHidden="0" w:name="List"/>
-    <w:lsdException w:unhideWhenUsed="0" w:uiPriority="0" w:semiHidden="0" w:name="List Bullet"/>
-    <w:lsdException w:unhideWhenUsed="0" w:uiPriority="0" w:semiHidden="0" w:name="List Number"/>
-    <w:lsdException w:unhideWhenUsed="0" w:uiPriority="0" w:semiHidden="0" w:name="List 2"/>
-    <w:lsdException w:unhideWhenUsed="0" w:uiPriority="0" w:semiHidden="0" w:name="List 3"/>
-    <w:lsdException w:unhideWhenUsed="0" w:uiPriority="0" w:semiHidden="0" w:name="List 4"/>
-    <w:lsdException w:unhideWhenUsed="0" w:uiPriority="0" w:semiHidden="0" w:name="List 5"/>
-    <w:lsdException w:unhideWhenUsed="0" w:uiPriority="0" w:semiHidden="0" w:name="List Bullet 2"/>
-    <w:lsdException w:unhideWhenUsed="0" w:uiPriority="0" w:semiHidden="0" w:name="List Bullet 3"/>
-    <w:lsdException w:unhideWhenUsed="0" w:uiPriority="0" w:semiHidden="0" w:name="List Bullet 4"/>
-    <w:lsdException w:unhideWhenUsed="0" w:uiPriority="0" w:semiHidden="0" w:name="List Bullet 5"/>
-    <w:lsdException w:unhideWhenUsed="0" w:uiPriority="0" w:semiHidden="0" w:name="List Number 2"/>
-    <w:lsdException w:unhideWhenUsed="0" w:uiPriority="0" w:semiHidden="0" w:name="List Number 3"/>
-    <w:lsdException w:unhideWhenUsed="0" w:uiPriority="0" w:semiHidden="0" w:name="List Number 4"/>
-    <w:lsdException w:unhideWhenUsed="0" w:uiPriority="0" w:semiHidden="0" w:name="List Number 5"/>
-    <w:lsdException w:qFormat="1" w:unhideWhenUsed="0" w:uiPriority="0" w:semiHidden="0" w:name="Title"/>
-    <w:lsdException w:unhideWhenUsed="0" w:uiPriority="0" w:semiHidden="0" w:name="Closing"/>
-    <w:lsdException w:unhideWhenUsed="0" w:uiPriority="0" w:semiHidden="0" w:name="Signature"/>
-    <w:lsdException w:qFormat="1" w:unhideWhenUsed="0" w:uiPriority="0" w:name="Default Paragraph Font"/>
-    <w:lsdException w:qFormat="1" w:uiPriority="99" w:semiHidden="0" w:name="Body Text"/>
-    <w:lsdException w:unhideWhenUsed="0" w:uiPriority="0" w:semiHidden="0" w:name="Body Text Indent"/>
-    <w:lsdException w:unhideWhenUsed="0" w:uiPriority="0" w:semiHidden="0" w:name="List Continue"/>
-    <w:lsdException w:unhideWhenUsed="0" w:uiPriority="0" w:semiHidden="0" w:name="List Continue 2"/>
-    <w:lsdException w:unhideWhenUsed="0" w:uiPriority="0" w:semiHidden="0" w:name="List Continue 3"/>
-    <w:lsdException w:unhideWhenUsed="0" w:uiPriority="0" w:semiHidden="0" w:name="List Continue 4"/>
-    <w:lsdException w:unhideWhenUsed="0" w:uiPriority="0" w:semiHidden="0" w:name="List Continue 5"/>
-    <w:lsdException w:unhideWhenUsed="0" w:uiPriority="0" w:semiHidden="0" w:name="Message Header"/>
-    <w:lsdException w:qFormat="1" w:unhideWhenUsed="0" w:uiPriority="0" w:semiHidden="0" w:name="Subtitle"/>
-    <w:lsdException w:unhideWhenUsed="0" w:uiPriority="0" w:semiHidden="0" w:name="Salutation"/>
-    <w:lsdException w:unhideWhenUsed="0" w:uiPriority="0" w:semiHidden="0" w:name="Date"/>
-    <w:lsdException w:unhideWhenUsed="0" w:uiPriority="0" w:semiHidden="0" w:name="Body Text First Indent"/>
-    <w:lsdException w:unhideWhenUsed="0" w:uiPriority="0" w:semiHidden="0" w:name="Body Text First Indent 2"/>
-    <w:lsdException w:unhideWhenUsed="0" w:uiPriority="0" w:semiHidden="0" w:name="Note Heading"/>
-    <w:lsdException w:unhideWhenUsed="0" w:uiPriority="0" w:semiHidden="0" w:name="Body Text 2"/>
-    <w:lsdException w:unhideWhenUsed="0" w:uiPriority="0" w:semiHidden="0" w:name="Body Text 3"/>
-    <w:lsdException w:unhideWhenUsed="0" w:uiPriority="0" w:semiHidden="0" w:name="Body Text Indent 2"/>
-    <w:lsdException w:unhideWhenUsed="0" w:uiPriority="0" w:semiHidden="0" w:name="Body Text Indent 3"/>
-    <w:lsdException w:unhideWhenUsed="0" w:uiPriority="0" w:semiHidden="0" w:name="Block Text"/>
-    <w:lsdException w:unhideWhenUsed="0" w:uiPriority="0" w:semiHidden="0" w:name="Hyperlink"/>
-    <w:lsdException w:unhideWhenUsed="0" w:uiPriority="0" w:semiHidden="0" w:name="FollowedHyperlink"/>
-    <w:lsdException w:qFormat="1" w:unhideWhenUsed="0" w:uiPriority="0" w:semiHidden="0" w:name="Strong"/>
-    <w:lsdException w:qFormat="1" w:unhideWhenUsed="0" w:uiPriority="0" w:semiHidden="0" w:name="Emphasis"/>
-    <w:lsdException w:unhideWhenUsed="0" w:uiPriority="0" w:semiHidden="0" w:name="Document Map"/>
-    <w:lsdException w:unhideWhenUsed="0" w:uiPriority="0" w:semiHidden="0" w:name="Plain Text"/>
-    <w:lsdException w:unhideWhenUsed="0" w:uiPriority="0" w:semiHidden="0" w:name="E-mail Signature"/>
-    <w:lsdException w:unhideWhenUsed="0" w:uiPriority="0" w:semiHidden="0" w:name="Normal (Web)"/>
-    <w:lsdException w:unhideWhenUsed="0" w:uiPriority="0" w:semiHidden="0" w:name="HTML Acronym"/>
-    <w:lsdException w:unhideWhenUsed="0" w:uiPriority="0" w:semiHidden="0" w:name="HTML Address"/>
-    <w:lsdException w:unhideWhenUsed="0" w:uiPriority="0" w:semiHidden="0" w:name="HTML Cite"/>
-    <w:lsdException w:unhideWhenUsed="0" w:uiPriority="0" w:semiHidden="0" w:name="HTML Code"/>
-    <w:lsdException w:unhideWhenUsed="0" w:uiPriority="0" w:semiHidden="0" w:name="HTML Definition"/>
-    <w:lsdException w:unhideWhenUsed="0" w:uiPriority="0" w:semiHidden="0" w:name="HTML Keyboard"/>
-    <w:lsdException w:unhideWhenUsed="0" w:uiPriority="0" w:semiHidden="0" w:name="HTML Preformatted"/>
-    <w:lsdException w:unhideWhenUsed="0" w:uiPriority="0" w:semiHidden="0" w:name="HTML Sample"/>
-    <w:lsdException w:unhideWhenUsed="0" w:uiPriority="0" w:semiHidden="0" w:name="HTML Typewriter"/>
-    <w:lsdException w:unhideWhenUsed="0" w:uiPriority="0" w:semiHidden="0" w:name="HTML Variable"/>
-    <w:lsdException w:qFormat="1" w:unhideWhenUsed="0" w:uiPriority="0" w:name="Normal Table"/>
-    <w:lsdException w:unhideWhenUsed="0" w:uiPriority="0" w:semiHidden="0" w:name="annotation subject"/>
-    <w:lsdException w:unhideWhenUsed="0" w:uiPriority="0" w:semiHidden="0" w:name="Table Simple 1"/>
-    <w:lsdException w:unhideWhenUsed="0" w:uiPriority="0" w:semiHidden="0" w:name="Table Simple 2"/>
-    <w:lsdException w:unhideWhenUsed="0" w:uiPriority="0" w:semiHidden="0" w:name="Table Simple 3"/>
-    <w:lsdException w:unhideWhenUsed="0" w:uiPriority="0" w:semiHidden="0" w:name="Table Classic 1"/>
-    <w:lsdException w:unhideWhenUsed="0" w:uiPriority="0" w:semiHidden="0" w:name="Table Classic 2"/>
-    <w:lsdException w:unhideWhenUsed="0" w:uiPriority="0" w:semiHidden="0" w:name="Table Classic 3"/>
-    <w:lsdException w:unhideWhenUsed="0" w:uiPriority="0" w:semiHidden="0" w:name="Table Classic 4"/>
-    <w:lsdException w:unhideWhenUsed="0" w:uiPriority="0" w:semiHidden="0" w:name="Table Colorful 1"/>
-    <w:lsdException w:unhideWhenUsed="0" w:uiPriority="0" w:semiHidden="0" w:name="Table Colorful 2"/>
-    <w:lsdException w:unhideWhenUsed="0" w:uiPriority="0" w:semiHidden="0" w:name="Table Colorful 3"/>
-    <w:lsdException w:unhideWhenUsed="0" w:uiPriority="0" w:semiHidden="0" w:name="Table Columns 1"/>
-    <w:lsdException w:unhideWhenUsed="0" w:uiPriority="0" w:semiHidden="0" w:name="Table Columns 2"/>
-    <w:lsdException w:unhideWhenUsed="0" w:uiPriority="0" w:semiHidden="0" w:name="Table Columns 3"/>
-    <w:lsdException w:unhideWhenUsed="0" w:uiPriority="0" w:semiHidden="0" w:name="Table Columns 4"/>
-    <w:lsdException w:unhideWhenUsed="0" w:uiPriority="0" w:semiHidden="0" w:name="Table Columns 5"/>
-    <w:lsdException w:unhideWhenUsed="0" w:uiPriority="0" w:semiHidden="0" w:name="Table Grid 1"/>
-    <w:lsdException w:unhideWhenUsed="0" w:uiPriority="0" w:semiHidden="0" w:name="Table Grid 2"/>
-    <w:lsdException w:unhideWhenUsed="0" w:uiPriority="0" w:semiHidden="0" w:name="Table Grid 3"/>
-    <w:lsdException w:unhideWhenUsed="0" w:uiPriority="0" w:semiHidden="0" w:name="Table Grid 4"/>
-    <w:lsdException w:unhideWhenUsed="0" w:uiPriority="0" w:semiHidden="0" w:name="Table Grid 5"/>
-    <w:lsdException w:unhideWhenUsed="0" w:uiPriority="0" w:semiHidden="0" w:name="Table Grid 6"/>
-    <w:lsdException w:unhideWhenUsed="0" w:uiPriority="0" w:semiHidden="0" w:name="Table Grid 7"/>
-    <w:lsdException w:unhideWhenUsed="0" w:uiPriority="0" w:semiHidden="0" w:name="Table Grid 8"/>
-    <w:lsdException w:unhideWhenUsed="0" w:uiPriority="0" w:semiHidden="0" w:name="Table List 1"/>
-    <w:lsdException w:unhideWhenUsed="0" w:uiPriority="0" w:semiHidden="0" w:name="Table List 2"/>
-    <w:lsdException w:unhideWhenUsed="0" w:uiPriority="0" w:semiHidden="0" w:name="Table List 3"/>
-    <w:lsdException w:unhideWhenUsed="0" w:uiPriority="0" w:semiHidden="0" w:name="Table List 4"/>
-    <w:lsdException w:unhideWhenUsed="0" w:uiPriority="0" w:semiHidden="0" w:name="Table List 5"/>
-    <w:lsdException w:unhideWhenUsed="0" w:uiPriority="0" w:semiHidden="0" w:name="Table List 6"/>
-    <w:lsdException w:unhideWhenUsed="0" w:uiPriority="0" w:semiHidden="0" w:name="Table List 7"/>
-    <w:lsdException w:unhideWhenUsed="0" w:uiPriority="0" w:semiHidden="0" w:name="Table List 8"/>
-    <w:lsdException w:unhideWhenUsed="0" w:uiPriority="0" w:semiHidden="0" w:name="Table 3D effects 1"/>
-    <w:lsdException w:unhideWhenUsed="0" w:uiPriority="0" w:semiHidden="0" w:name="Table 3D effects 2"/>
-    <w:lsdException w:unhideWhenUsed="0" w:uiPriority="0" w:semiHidden="0" w:name="Table 3D effects 3"/>
-    <w:lsdException w:unhideWhenUsed="0" w:uiPriority="0" w:semiHidden="0" w:name="Table Contemporary"/>
-    <w:lsdException w:unhideWhenUsed="0" w:uiPriority="0" w:semiHidden="0" w:name="Table Elegant"/>
-    <w:lsdException w:unhideWhenUsed="0" w:uiPriority="0" w:semiHidden="0" w:name="Table Professional"/>
-    <w:lsdException w:unhideWhenUsed="0" w:uiPriority="0" w:semiHidden="0" w:name="Table Subtle 1"/>
-    <w:lsdException w:unhideWhenUsed="0" w:uiPriority="0" w:semiHidden="0" w:name="Table Subtle 2"/>
-    <w:lsdException w:unhideWhenUsed="0" w:uiPriority="0" w:semiHidden="0" w:name="Table Web 1"/>
-    <w:lsdException w:unhideWhenUsed="0" w:uiPriority="0" w:semiHidden="0" w:name="Table Web 2"/>
-    <w:lsdException w:unhideWhenUsed="0" w:uiPriority="0" w:semiHidden="0" w:name="Table Web 3"/>
-    <w:lsdException w:unhideWhenUsed="0" w:uiPriority="0" w:semiHidden="0" w:name="Balloon Text"/>
-    <w:lsdException w:unhideWhenUsed="0" w:uiPriority="0" w:semiHidden="0" w:name="Table Grid"/>
-    <w:lsdException w:unhideWhenUsed="0" w:uiPriority="0" w:semiHidden="0" w:name="Table Theme"/>
-    <w:lsdException w:qFormat="1" w:unhideWhenUsed="0" w:uiPriority="60" w:semiHidden="0" w:name="Light Shading"/>
-    <w:lsdException w:qFormat="1" w:unhideWhenUsed="0" w:uiPriority="61" w:semiHidden="0" w:name="Light List"/>
-    <w:lsdException w:unhideWhenUsed="0" w:uiPriority="62" w:semiHidden="0" w:name="Light Grid"/>
-    <w:lsdException w:unhideWhenUsed="0" w:uiPriority="63" w:semiHidden="0" w:name="Medium Shading 1"/>
-    <w:lsdException w:unhideWhenUsed="0" w:uiPriority="64" w:semiHidden="0" w:name="Medium Shading 2"/>
-    <w:lsdException w:unhideWhenUsed="0" w:uiPriority="65" w:semiHidden="0" w:name="Medium List 1"/>
-    <w:lsdException w:unhideWhenUsed="0" w:uiPriority="66" w:semiHidden="0" w:name="Medium List 2"/>
-    <w:lsdException w:unhideWhenUsed="0" w:uiPriority="67" w:semiHidden="0" w:name="Medium Grid 1"/>
-    <w:lsdException w:unhideWhenUsed="0" w:uiPriority="68" w:semiHidden="0" w:name="Medium Grid 2"/>
-    <w:lsdException w:unhideWhenUsed="0" w:uiPriority="69" w:semiHidden="0" w:name="Medium Grid 3"/>
-    <w:lsdException w:unhideWhenUsed="0" w:uiPriority="70" w:semiHidden="0" w:name="Dark List"/>
-    <w:lsdException w:unhideWhenUsed="0" w:uiPriority="71" w:semiHidden="0" w:name="Colorful Shading"/>
-    <w:lsdException w:unhideWhenUsed="0" w:uiPriority="72" w:semiHidden="0" w:name="Colorful List"/>
-    <w:lsdException w:unhideWhenUsed="0" w:uiPriority="73" w:semiHidden="0" w:name="Colorful Grid"/>
-    <w:lsdException w:qFormat="1" w:unhideWhenUsed="0" w:uiPriority="60" w:semiHidden="0" w:name="Light Shading Accent 1"/>
-    <w:lsdException w:qFormat="1" w:unhideWhenUsed="0" w:uiPriority="61" w:semiHidden="0" w:name="Light List Accent 1"/>
-    <w:lsdException w:unhideWhenUsed="0" w:uiPriority="62" w:semiHidden="0" w:name="Light Grid Accent 1"/>
-    <w:lsdException w:unhideWhenUsed="0" w:uiPriority="63" w:semiHidden="0" w:name="Medium Shading 1 Accent 1"/>
-    <w:lsdException w:unhideWhenUsed="0" w:uiPriority="64" w:semiHidden="0" w:name="Medium Shading 2 Accent 1"/>
-    <w:lsdException w:unhideWhenUsed="0" w:uiPriority="65" w:semiHidden="0" w:name="Medium List 1 Accent 1"/>
-    <w:lsdException w:unhideWhenUsed="0" w:uiPriority="66" w:semiHidden="0" w:name="Medium List 2 Accent 1"/>
-    <w:lsdException w:unhideWhenUsed="0" w:uiPriority="67" w:semiHidden="0" w:name="Medium Grid 1 Accent 1"/>
-    <w:lsdException w:unhideWhenUsed="0" w:uiPriority="68" w:semiHidden="0" w:name="Medium Grid 2 Accent 1"/>
-    <w:lsdException w:unhideWhenUsed="0" w:uiPriority="69" w:semiHidden="0" w:name="Medium Grid 3 Accent 1"/>
-    <w:lsdException w:unhideWhenUsed="0" w:uiPriority="70" w:semiHidden="0" w:name="Dark List Accent 1"/>
-    <w:lsdException w:unhideWhenUsed="0" w:uiPriority="71" w:semiHidden="0" w:name="Colorful Shading Accent 1"/>
-    <w:lsdException w:unhideWhenUsed="0" w:uiPriority="72" w:semiHidden="0" w:name="Colorful List Accent 1"/>
-    <w:lsdException w:unhideWhenUsed="0" w:uiPriority="73" w:semiHidden="0" w:name="Colorful Grid Accent 1"/>
-    <w:lsdException w:qFormat="1" w:unhideWhenUsed="0" w:uiPriority="60" w:semiHidden="0" w:name="Light Shading Accent 2"/>
-    <w:lsdException w:qFormat="1" w:unhideWhenUsed="0" w:uiPriority="61" w:semiHidden="0" w:name="Light List Accent 2"/>
-    <w:lsdException w:unhideWhenUsed="0" w:uiPriority="62" w:semiHidden="0" w:name="Light Grid Accent 2"/>
-    <w:lsdException w:unhideWhenUsed="0" w:uiPriority="63" w:semiHidden="0" w:name="Medium Shading 1 Accent 2"/>
-    <w:lsdException w:unhideWhenUsed="0" w:uiPriority="64" w:semiHidden="0" w:name="Medium Shading 2 Accent 2"/>
-    <w:lsdException w:unhideWhenUsed="0" w:uiPriority="65" w:semiHidden="0" w:name="Medium List 1 Accent 2"/>
-    <w:lsdException w:unhideWhenUsed="0" w:uiPriority="66" w:semiHidden="0" w:name="Medium List 2 Accent 2"/>
-    <w:lsdException w:unhideWhenUsed="0" w:uiPriority="67" w:semiHidden="0" w:name="Medium Grid 1 Accent 2"/>
-    <w:lsdException w:unhideWhenUsed="0" w:uiPriority="68" w:semiHidden="0" w:name="Medium Grid 2 Accent 2"/>
-    <w:lsdException w:unhideWhenUsed="0" w:uiPriority="69" w:semiHidden="0" w:name="Medium Grid 3 Accent 2"/>
-    <w:lsdException w:unhideWhenUsed="0" w:uiPriority="70" w:semiHidden="0" w:name="Dark List Accent 2"/>
-    <w:lsdException w:unhideWhenUsed="0" w:uiPriority="71" w:semiHidden="0" w:name="Colorful Shading Accent 2"/>
-    <w:lsdException w:unhideWhenUsed="0" w:uiPriority="72" w:semiHidden="0" w:name="Colorful List Accent 2"/>
-    <w:lsdException w:unhideWhenUsed="0" w:uiPriority="73" w:semiHidden="0" w:name="Colorful Grid Accent 2"/>
-    <w:lsdException w:qFormat="1" w:unhideWhenUsed="0" w:uiPriority="60" w:semiHidden="0" w:name="Light Shading Accent 3"/>
-    <w:lsdException w:unhideWhenUsed="0" w:uiPriority="61" w:semiHidden="0" w:name="Light List Accent 3"/>
-    <w:lsdException w:unhideWhenUsed="0" w:uiPriority="62" w:semiHidden="0" w:name="Light Grid Accent 3"/>
-    <w:lsdException w:unhideWhenUsed="0" w:uiPriority="63" w:semiHidden="0" w:name="Medium Shading 1 Accent 3"/>
-    <w:lsdException w:unhideWhenUsed="0" w:uiPriority="64" w:semiHidden="0" w:name="Medium Shading 2 Accent 3"/>
-    <w:lsdException w:unhideWhenUsed="0" w:uiPriority="65" w:semiHidden="0" w:name="Medium List 1 Accent 3"/>
-    <w:lsdException w:unhideWhenUsed="0" w:uiPriority="66" w:semiHidden="0" w:name="Medium List 2 Accent 3"/>
-    <w:lsdException w:unhideWhenUsed="0" w:uiPriority="67" w:semiHidden="0" w:name="Medium Grid 1 Accent 3"/>
-    <w:lsdException w:unhideWhenUsed="0" w:uiPriority="68" w:semiHidden="0" w:name="Medium Grid 2 Accent 3"/>
-    <w:lsdException w:unhideWhenUsed="0" w:uiPriority="69" w:semiHidden="0" w:name="Medium Grid 3 Accent 3"/>
-    <w:lsdException w:unhideWhenUsed="0" w:uiPriority="70" w:semiHidden="0" w:name="Dark List Accent 3"/>
-    <w:lsdException w:unhideWhenUsed="0" w:uiPriority="71" w:semiHidden="0" w:name="Colorful Shading Accent 3"/>
-    <w:lsdException w:unhideWhenUsed="0" w:uiPriority="72" w:semiHidden="0" w:name="Colorful List Accent 3"/>
-    <w:lsdException w:unhideWhenUsed="0" w:uiPriority="73" w:semiHidden="0" w:name="Colorful Grid Accent 3"/>
-    <w:lsdException w:qFormat="1" w:unhideWhenUsed="0" w:uiPriority="60" w:semiHidden="0" w:name="Light Shading Accent 4"/>
-    <w:lsdException w:unhideWhenUsed="0" w:uiPriority="61" w:semiHidden="0" w:name="Light List Accent 4"/>
-    <w:lsdException w:unhideWhenUsed="0" w:uiPriority="62" w:semiHidden="0" w:name="Light Grid Accent 4"/>
-    <w:lsdException w:unhideWhenUsed="0" w:uiPriority="63" w:semiHidden="0" w:name="Medium Shading 1 Accent 4"/>
-    <w:lsdException w:unhideWhenUsed="0" w:uiPriority="64" w:semiHidden="0" w:name="Medium Shading 2 Accent 4"/>
-    <w:lsdException w:unhideWhenUsed="0" w:uiPriority="65" w:semiHidden="0" w:name="Medium List 1 Accent 4"/>
-    <w:lsdException w:unhideWhenUsed="0" w:uiPriority="66" w:semiHidden="0" w:name="Medium List 2 Accent 4"/>
-    <w:lsdException w:unhideWhenUsed="0" w:uiPriority="67" w:semiHidden="0" w:name="Medium Grid 1 Accent 4"/>
-    <w:lsdException w:unhideWhenUsed="0" w:uiPriority="68" w:semiHidden="0" w:name="Medium Grid 2 Accent 4"/>
-    <w:lsdException w:unhideWhenUsed="0" w:uiPriority="69" w:semiHidden="0" w:name="Medium Grid 3 Accent 4"/>
-    <w:lsdException w:unhideWhenUsed="0" w:uiPriority="70" w:semiHidden="0" w:name="Dark List Accent 4"/>
-    <w:lsdException w:unhideWhenUsed="0" w:uiPriority="71" w:semiHidden="0" w:name="Colorful Shading Accent 4"/>
-    <w:lsdException w:unhideWhenUsed="0" w:uiPriority="72" w:semiHidden="0" w:name="Colorful List Accent 4"/>
-    <w:lsdException w:unhideWhenUsed="0" w:uiPriority="73" w:semiHidden="0" w:name="Colorful Grid Accent 4"/>
-    <w:lsdException w:qFormat="1" w:unhideWhenUsed="0" w:uiPriority="60" w:semiHidden="0" w:name="Light Shading Accent 5"/>
-    <w:lsdException w:unhideWhenUsed="0" w:uiPriority="61" w:semiHidden="0" w:name="Light List Accent 5"/>
-    <w:lsdException w:unhideWhenUsed="0" w:uiPriority="62" w:semiHidden="0" w:name="Light Grid Accent 5"/>
-    <w:lsdException w:unhideWhenUsed="0" w:uiPriority="63" w:semiHidden="0" w:name="Medium Shading 1 Accent 5"/>
-    <w:lsdException w:unhideWhenUsed="0" w:uiPriority="64" w:semiHidden="0" w:name="Medium Shading 2 Accent 5"/>
-    <w:lsdException w:unhideWhenUsed="0" w:uiPriority="65" w:semiHidden="0" w:name="Medium List 1 Accent 5"/>
-    <w:lsdException w:unhideWhenUsed="0" w:uiPriority="66" w:semiHidden="0" w:name="Medium List 2 Accent 5"/>
-    <w:lsdException w:unhideWhenUsed="0" w:uiPriority="67" w:semiHidden="0" w:name="Medium Grid 1 Accent 5"/>
-    <w:lsdException w:unhideWhenUsed="0" w:uiPriority="68" w:semiHidden="0" w:name="Medium Grid 2 Accent 5"/>
-    <w:lsdException w:unhideWhenUsed="0" w:uiPriority="69" w:semiHidden="0" w:name="Medium Grid 3 Accent 5"/>
-    <w:lsdException w:unhideWhenUsed="0" w:uiPriority="70" w:semiHidden="0" w:name="Dark List Accent 5"/>
-    <w:lsdException w:unhideWhenUsed="0" w:uiPriority="71" w:semiHidden="0" w:name="Colorful Shading Accent 5"/>
-    <w:lsdException w:unhideWhenUsed="0" w:uiPriority="72" w:semiHidden="0" w:name="Colorful List Accent 5"/>
-    <w:lsdException w:unhideWhenUsed="0" w:uiPriority="73" w:semiHidden="0" w:name="Colorful Grid Accent 5"/>
-    <w:lsdException w:qFormat="1" w:unhideWhenUsed="0" w:uiPriority="60" w:semiHidden="0" w:name="Light Shading Accent 6"/>
-    <w:lsdException w:unhideWhenUsed="0" w:uiPriority="61" w:semiHidden="0" w:name="Light List Accent 6"/>
-    <w:lsdException w:unhideWhenUsed="0" w:uiPriority="62" w:semiHidden="0" w:name="Light Grid Accent 6"/>
-    <w:lsdException w:unhideWhenUsed="0" w:uiPriority="63" w:semiHidden="0" w:name="Medium Shading 1 Accent 6"/>
-    <w:lsdException w:unhideWhenUsed="0" w:uiPriority="64" w:semiHidden="0" w:name="Medium Shading 2 Accent 6"/>
-    <w:lsdException w:unhideWhenUsed="0" w:uiPriority="65" w:semiHidden="0" w:name="Medium List 1 Accent 6"/>
-    <w:lsdException w:unhideWhenUsed="0" w:uiPriority="66" w:semiHidden="0" w:name="Medium List 2 Accent 6"/>
-    <w:lsdException w:unhideWhenUsed="0" w:uiPriority="67" w:semiHidden="0" w:name="Medium Grid 1 Accent 6"/>
-    <w:lsdException w:unhideWhenUsed="0" w:uiPriority="68" w:semiHidden="0" w:name="Medium Grid 2 Accent 6"/>
-    <w:lsdException w:unhideWhenUsed="0" w:uiPriority="69" w:semiHidden="0" w:name="Medium Grid 3 Accent 6"/>
-    <w:lsdException w:unhideWhenUsed="0" w:uiPriority="70" w:semiHidden="0" w:name="Dark List Accent 6"/>
-    <w:lsdException w:unhideWhenUsed="0" w:uiPriority="71" w:semiHidden="0" w:name="Colorful Shading Accent 6"/>
-    <w:lsdException w:unhideWhenUsed="0" w:uiPriority="72" w:semiHidden="0" w:name="Colorful List Accent 6"/>
-    <w:lsdException w:unhideWhenUsed="0" w:uiPriority="73" w:semiHidden="0" w:name="Colorful Grid Accent 6"/>
-  </w:latentStyles>
-  <w:style w:type="paragraph" w:default="1" w:styleId="1">
+  <w:latentStyles w:count="276" w:defLockedState="0" w:defQFormat="0" w:defSemiHidden="0" w:defUIPriority="0" w:defUnhideWhenUsed="0"/>
+  <w:style w:default="1" w:styleId="Normal" w:type="paragraph">
     <w:name w:val="Normal"/>
     <w:qFormat/>
-    <w:uiPriority w:val="0"/>
     <w:pPr>
-      <w:spacing w:after="200" w:line="276" w:lineRule="auto"/>
-      <w:ind w:left="357"/>
+      <w:spacing w:line="360" w:lineRule="auto"/>
+      <w:jc w:val="both"/>
     </w:pPr>
     <w:rPr>
-      <w:rFonts w:ascii="Times New Roman" w:hAnsi="Times New Roman" w:eastAsia="Times New Roman" w:cs="Times New Roman"/>
-      <w:sz w:val="22"/>
-      <w:szCs w:val="22"/>
-      <w:lang w:val="en-US" w:eastAsia="en-US" w:bidi="ar-SA"/>
+      <w:rFonts w:ascii="Times New Roman" w:eastAsia="Times New Roman" w:hAnsi="Times New Roman"/>
+      <w:color w:val="000000"/>
+      <w:sz w:val="26"/>
     </w:rPr>
   </w:style>
-  <w:style w:type="character" w:default="1" w:styleId="2">
+  <w:style w:styleId="BodyText" w:type="paragraph">
+    <w:name w:val="Body Text"/>
+    <w:basedOn w:val="Normal"/>
+    <w:link w:val="BodyTextChar"/>
+    <w:pPr>
+      <w:spacing w:after="180" w:before="180" w:line="360" w:lineRule="auto"/>
+      <w:jc w:val="both"/>
+    </w:pPr>
+    <w:qFormat/>
+    <w:rPr>
+      <w:rFonts w:ascii="Times New Roman" w:eastAsia="Times New Roman" w:hAnsi="Times New Roman"/>
+      <w:color w:val="000000"/>
+      <w:sz w:val="26"/>
+    </w:rPr>
+  </w:style>
+  <w:style w:customStyle="1" w:styleId="FirstParagraph" w:type="paragraph">
+    <w:name w:val="First Paragraph"/>
+    <w:basedOn w:val="BodyText"/>
+    <w:next w:val="BodyText"/>
+    <w:qFormat/>
+    <w:pPr>
+      <w:spacing w:line="360" w:lineRule="auto"/>
+      <w:jc w:val="both"/>
+    </w:pPr>
+    <w:rPr>
+      <w:rFonts w:ascii="Times New Roman" w:eastAsia="Times New Roman" w:hAnsi="Times New Roman"/>
+      <w:color w:val="000000"/>
+      <w:sz w:val="26"/>
+    </w:rPr>
+  </w:style>
+  <w:style w:customStyle="1" w:styleId="Compact" w:type="paragraph">
+    <w:name w:val="Compact"/>
+    <w:basedOn w:val="BodyText"/>
+    <w:qFormat/>
+    <w:pPr>
+      <w:spacing w:after="36" w:before="36" w:line="360" w:lineRule="auto"/>
+      <w:jc w:val="both"/>
+    </w:pPr>
+    <w:rPr>
+      <w:rFonts w:ascii="Times New Roman" w:eastAsia="Times New Roman" w:hAnsi="Times New Roman"/>
+      <w:color w:val="000000"/>
+      <w:sz w:val="26"/>
+    </w:rPr>
+  </w:style>
+  <w:style w:styleId="Title" w:type="paragraph">
+    <w:name w:val="Title"/>
+    <w:basedOn w:val="Normal"/>
+    <w:next w:val="BodyText"/>
+    <w:qFormat/>
+    <w:pPr>
+      <w:keepNext/>
+      <w:keepLines/>
+      <w:spacing w:after="240" w:before="480" w:line="360" w:lineRule="auto"/>
+      <w:jc w:val="both"/>
+    </w:pPr>
+    <w:rPr>
+      <w:rFonts w:ascii="Times New Roman" w:asciiTheme="majorHAnsi" w:cstheme="majorBidi" w:eastAsia="Times New Roman" w:eastAsiaTheme="majorEastAsia" w:hAnsi="Times New Roman" w:hAnsiTheme="majorHAnsi"/>
+      <w:b/>
+      <w:bCs/>
+      <w:color w:val="000000"/>
+      <w:sz w:val="26"/>
+      <w:szCs w:val="36"/>
+    </w:rPr>
+  </w:style>
+  <w:style w:styleId="Subtitle" w:type="paragraph">
+    <w:name w:val="Subtitle"/>
+    <w:basedOn w:val="Title"/>
+    <w:next w:val="BodyText"/>
+    <w:qFormat/>
+    <w:pPr>
+      <w:keepNext/>
+      <w:keepLines/>
+      <w:spacing w:after="240" w:before="240" w:line="360" w:lineRule="auto"/>
+      <w:jc w:val="both"/>
+    </w:pPr>
+    <w:rPr>
+      <w:rFonts w:ascii="Times New Roman" w:eastAsia="Times New Roman" w:hAnsi="Times New Roman"/>
+      <w:color w:val="000000"/>
+      <w:sz w:val="26"/>
+      <w:szCs w:val="30"/>
+    </w:rPr>
+  </w:style>
+  <w:style w:customStyle="1" w:styleId="Author" w:type="paragraph">
+    <w:name w:val="Author"/>
+    <w:next w:val="BodyText"/>
+    <w:qFormat/>
+    <w:pPr>
+      <w:keepNext/>
+      <w:keepLines/>
+      <w:spacing w:line="360" w:lineRule="auto"/>
+      <w:jc w:val="both"/>
+    </w:pPr>
+    <w:rPr>
+      <w:rFonts w:ascii="Times New Roman" w:eastAsia="Times New Roman" w:hAnsi="Times New Roman"/>
+      <w:color w:val="000000"/>
+      <w:sz w:val="26"/>
+    </w:rPr>
+  </w:style>
+  <w:style w:styleId="Date" w:type="paragraph">
+    <w:name w:val="Date"/>
+    <w:next w:val="BodyText"/>
+    <w:qFormat/>
+    <w:pPr>
+      <w:keepNext/>
+      <w:keepLines/>
+      <w:spacing w:line="360" w:lineRule="auto"/>
+      <w:jc w:val="both"/>
+    </w:pPr>
+    <w:rPr>
+      <w:rFonts w:ascii="Times New Roman" w:eastAsia="Times New Roman" w:hAnsi="Times New Roman"/>
+      <w:color w:val="000000"/>
+      <w:sz w:val="26"/>
+    </w:rPr>
+  </w:style>
+  <w:style w:customStyle="1" w:styleId="AbstractTitle" w:type="paragraph">
+    <w:name w:val="Abstract Title"/>
+    <w:basedOn w:val="Normal"/>
+    <w:next w:val="Abstract"/>
+    <w:qFormat/>
+    <w:pPr>
+      <w:keepNext/>
+      <w:keepLines/>
+      <w:jc w:val="both"/>
+      <w:spacing w:after="0" w:before="300" w:line="360" w:lineRule="auto"/>
+    </w:pPr>
+    <w:rPr>
+      <w:color w:val="000000"/>
+      <w:sz w:val="26"/>
+      <w:szCs w:val="20"/>
+      <w:rFonts w:ascii="Times New Roman" w:eastAsia="Times New Roman" w:hAnsi="Times New Roman"/>
+      <w:b/>
+    </w:rPr>
+  </w:style>
+  <w:style w:customStyle="1" w:styleId="Abstract" w:type="paragraph">
+    <w:name w:val="Abstract"/>
+    <w:basedOn w:val="Normal"/>
+    <w:next w:val="BodyText"/>
+    <w:qFormat/>
+    <w:pPr>
+      <w:keepNext/>
+      <w:keepLines/>
+      <w:spacing w:after="300" w:before="100" w:line="360" w:lineRule="auto"/>
+      <w:jc w:val="both"/>
+    </w:pPr>
+    <w:rPr>
+      <w:rFonts w:ascii="Times New Roman" w:eastAsia="Times New Roman" w:hAnsi="Times New Roman"/>
+      <w:color w:val="000000"/>
+      <w:sz w:val="26"/>
+      <w:szCs w:val="20"/>
+    </w:rPr>
+  </w:style>
+  <w:style w:styleId="Bibliography" w:type="paragraph">
+    <w:name w:val="Bibliography"/>
+    <w:basedOn w:val="Normal"/>
+    <w:next w:val="Bibliography"/>
+    <w:qFormat/>
+    <w:pPr>
+      <w:spacing w:line="360" w:lineRule="auto"/>
+      <w:jc w:val="both"/>
+    </w:pPr>
+    <w:rPr>
+      <w:rFonts w:ascii="Times New Roman" w:eastAsia="Times New Roman" w:hAnsi="Times New Roman"/>
+      <w:color w:val="000000"/>
+      <w:sz w:val="26"/>
+    </w:rPr>
+  </w:style>
+  <w:style w:styleId="Heading1" w:type="paragraph">
+    <w:name w:val="Heading 1"/>
+    <w:basedOn w:val="Normal"/>
+    <w:next w:val="BodyText"/>
+    <w:uiPriority w:val="9"/>
+    <w:qFormat/>
+    <w:pPr>
+      <w:keepNext/>
+      <w:keepLines/>
+      <w:spacing w:after="0" w:before="480" w:line="360" w:lineRule="auto"/>
+      <w:jc w:val="both"/>
+      <w:outlineLvl w:val="0"/>
+    </w:pPr>
+    <w:rPr>
+      <w:rFonts w:ascii="Times New Roman" w:asciiTheme="majorHAnsi" w:cstheme="majorBidi" w:eastAsia="Times New Roman" w:eastAsiaTheme="majorEastAsia" w:hAnsi="Times New Roman" w:hAnsiTheme="majorHAnsi"/>
+      <w:b/>
+      <w:bCs/>
+      <w:color w:val="000000"/>
+      <w:sz w:val="26"/>
+      <w:szCs w:val="32"/>
+    </w:rPr>
+  </w:style>
+  <w:style w:styleId="Heading2" w:type="paragraph">
+    <w:name w:val="Heading 2"/>
+    <w:basedOn w:val="Normal"/>
+    <w:next w:val="BodyText"/>
+    <w:uiPriority w:val="9"/>
+    <w:unhideWhenUsed/>
+    <w:qFormat/>
+    <w:pPr>
+      <w:keepNext/>
+      <w:keepLines/>
+      <w:spacing w:after="0" w:before="200" w:line="360" w:lineRule="auto"/>
+      <w:jc w:val="both"/>
+      <w:outlineLvl w:val="1"/>
+    </w:pPr>
+    <w:rPr>
+      <w:rFonts w:ascii="Times New Roman" w:asciiTheme="majorHAnsi" w:cstheme="majorBidi" w:eastAsia="Times New Roman" w:eastAsiaTheme="majorEastAsia" w:hAnsi="Times New Roman" w:hAnsiTheme="majorHAnsi"/>
+      <w:b/>
+      <w:bCs/>
+      <w:color w:val="000000"/>
+      <w:sz w:val="26"/>
+      <w:szCs w:val="28"/>
+    </w:rPr>
+  </w:style>
+  <w:style w:styleId="Heading3" w:type="paragraph">
+    <w:name w:val="Heading 3"/>
+    <w:basedOn w:val="Normal"/>
+    <w:next w:val="BodyText"/>
+    <w:uiPriority w:val="9"/>
+    <w:unhideWhenUsed/>
+    <w:qFormat/>
+    <w:pPr>
+      <w:keepNext/>
+      <w:keepLines/>
+      <w:spacing w:after="0" w:before="200" w:line="360" w:lineRule="auto"/>
+      <w:jc w:val="both"/>
+      <w:outlineLvl w:val="2"/>
+    </w:pPr>
+    <w:rPr>
+      <w:rFonts w:ascii="Times New Roman" w:asciiTheme="majorHAnsi" w:cstheme="majorBidi" w:eastAsia="Times New Roman" w:eastAsiaTheme="majorEastAsia" w:hAnsi="Times New Roman" w:hAnsiTheme="majorHAnsi"/>
+      <w:b/>
+      <w:bCs/>
+      <w:color w:val="000000"/>
+      <w:sz w:val="26"/>
+      <w:szCs w:val="24"/>
+    </w:rPr>
+  </w:style>
+  <w:style w:styleId="Heading4" w:type="paragraph">
+    <w:name w:val="Heading 4"/>
+    <w:basedOn w:val="Normal"/>
+    <w:next w:val="BodyText"/>
+    <w:uiPriority w:val="9"/>
+    <w:unhideWhenUsed/>
+    <w:qFormat/>
+    <w:pPr>
+      <w:keepNext/>
+      <w:keepLines/>
+      <w:spacing w:after="0" w:before="200" w:line="360" w:lineRule="auto"/>
+      <w:jc w:val="both"/>
+      <w:outlineLvl w:val="3"/>
+    </w:pPr>
+    <w:rPr>
+      <w:rFonts w:ascii="Times New Roman" w:asciiTheme="majorHAnsi" w:cstheme="majorBidi" w:eastAsia="Times New Roman" w:eastAsiaTheme="majorEastAsia" w:hAnsi="Times New Roman" w:hAnsiTheme="majorHAnsi"/>
+      <w:i/>
+      <w:bCs/>
+      <w:color w:val="000000"/>
+      <w:sz w:val="26"/>
+      <w:szCs w:val="24"/>
+    </w:rPr>
+  </w:style>
+  <w:style w:styleId="Heading5" w:type="paragraph">
+    <w:name w:val="Heading 5"/>
+    <w:basedOn w:val="Normal"/>
+    <w:next w:val="BodyText"/>
+    <w:uiPriority w:val="9"/>
+    <w:unhideWhenUsed/>
+    <w:qFormat/>
+    <w:pPr>
+      <w:keepNext/>
+      <w:keepLines/>
+      <w:spacing w:after="0" w:before="200" w:line="360" w:lineRule="auto"/>
+      <w:jc w:val="both"/>
+      <w:outlineLvl w:val="4"/>
+    </w:pPr>
+    <w:rPr>
+      <w:rFonts w:ascii="Times New Roman" w:asciiTheme="majorHAnsi" w:cstheme="majorBidi" w:eastAsia="Times New Roman" w:eastAsiaTheme="majorEastAsia" w:hAnsi="Times New Roman" w:hAnsiTheme="majorHAnsi"/>
+      <w:iCs/>
+      <w:color w:val="000000"/>
+      <w:sz w:val="26"/>
+      <w:szCs w:val="24"/>
+    </w:rPr>
+  </w:style>
+  <w:style w:styleId="Heading6" w:type="paragraph">
+    <w:name w:val="Heading 6"/>
+    <w:basedOn w:val="Normal"/>
+    <w:next w:val="BodyText"/>
+    <w:uiPriority w:val="9"/>
+    <w:unhideWhenUsed/>
+    <w:qFormat/>
+    <w:pPr>
+      <w:keepNext/>
+      <w:keepLines/>
+      <w:spacing w:after="0" w:before="200" w:line="360" w:lineRule="auto"/>
+      <w:jc w:val="both"/>
+      <w:outlineLvl w:val="5"/>
+    </w:pPr>
+    <w:rPr>
+      <w:rFonts w:ascii="Times New Roman" w:asciiTheme="majorHAnsi" w:cstheme="majorBidi" w:eastAsia="Times New Roman" w:eastAsiaTheme="majorEastAsia" w:hAnsi="Times New Roman" w:hAnsiTheme="majorHAnsi"/>
+      <w:color w:val="000000"/>
+      <w:sz w:val="26"/>
+      <w:szCs w:val="24"/>
+    </w:rPr>
+  </w:style>
+  <w:style w:styleId="Heading7" w:type="paragraph">
+    <w:name w:val="Heading 7"/>
+    <w:basedOn w:val="Normal"/>
+    <w:next w:val="BodyText"/>
+    <w:uiPriority w:val="9"/>
+    <w:unhideWhenUsed/>
+    <w:qFormat/>
+    <w:pPr>
+      <w:keepNext/>
+      <w:keepLines/>
+      <w:spacing w:after="0" w:before="200" w:line="360" w:lineRule="auto"/>
+      <w:jc w:val="both"/>
+      <w:outlineLvl w:val="6"/>
+    </w:pPr>
+    <w:rPr>
+      <w:rFonts w:ascii="Times New Roman" w:asciiTheme="majorHAnsi" w:cstheme="majorBidi" w:eastAsia="Times New Roman" w:eastAsiaTheme="majorEastAsia" w:hAnsi="Times New Roman" w:hAnsiTheme="majorHAnsi"/>
+      <w:color w:val="000000"/>
+      <w:sz w:val="26"/>
+      <w:szCs w:val="24"/>
+    </w:rPr>
+  </w:style>
+  <w:style w:styleId="Heading8" w:type="paragraph">
+    <w:name w:val="Heading 8"/>
+    <w:basedOn w:val="Normal"/>
+    <w:next w:val="BodyText"/>
+    <w:uiPriority w:val="9"/>
+    <w:unhideWhenUsed/>
+    <w:qFormat/>
+    <w:pPr>
+      <w:keepNext/>
+      <w:keepLines/>
+      <w:spacing w:after="0" w:before="200" w:line="360" w:lineRule="auto"/>
+      <w:jc w:val="both"/>
+      <w:outlineLvl w:val="7"/>
+    </w:pPr>
+    <w:rPr>
+      <w:rFonts w:ascii="Times New Roman" w:asciiTheme="majorHAnsi" w:cstheme="majorBidi" w:eastAsia="Times New Roman" w:eastAsiaTheme="majorEastAsia" w:hAnsi="Times New Roman" w:hAnsiTheme="majorHAnsi"/>
+      <w:color w:val="000000"/>
+      <w:sz w:val="26"/>
+      <w:szCs w:val="24"/>
+    </w:rPr>
+  </w:style>
+  <w:style w:styleId="Heading9" w:type="paragraph">
+    <w:name w:val="Heading 9"/>
+    <w:basedOn w:val="Normal"/>
+    <w:next w:val="BodyText"/>
+    <w:uiPriority w:val="9"/>
+    <w:unhideWhenUsed/>
+    <w:qFormat/>
+    <w:pPr>
+      <w:keepNext/>
+      <w:keepLines/>
+      <w:spacing w:after="0" w:before="200" w:line="360" w:lineRule="auto"/>
+      <w:jc w:val="both"/>
+      <w:outlineLvl w:val="8"/>
+    </w:pPr>
+    <w:rPr>
+      <w:rFonts w:ascii="Times New Roman" w:asciiTheme="majorHAnsi" w:cstheme="majorBidi" w:eastAsia="Times New Roman" w:eastAsiaTheme="majorEastAsia" w:hAnsi="Times New Roman" w:hAnsiTheme="majorHAnsi"/>
+      <w:color w:val="000000"/>
+      <w:sz w:val="26"/>
+      <w:szCs w:val="24"/>
+    </w:rPr>
+  </w:style>
+  <w:style w:styleId="BlockText" w:type="paragraph">
+    <w:name w:val="Block Text"/>
+    <w:basedOn w:val="BodyText"/>
+    <w:next w:val="BodyText"/>
+    <w:uiPriority w:val="9"/>
+    <w:unhideWhenUsed/>
+    <w:qFormat/>
+    <w:pPr>
+      <w:spacing w:after="100" w:before="100" w:line="360" w:lineRule="auto"/>
+      <w:ind w:firstLine="0" w:left="480" w:right="480"/>
+      <w:jc w:val="both"/>
+    </w:pPr>
+    <w:rPr>
+      <w:rFonts w:ascii="Times New Roman" w:eastAsia="Times New Roman" w:hAnsi="Times New Roman"/>
+      <w:color w:val="000000"/>
+      <w:sz w:val="26"/>
+    </w:rPr>
+  </w:style>
+  <w:style w:styleId="FootnoteText" w:type="paragraph">
+    <w:name w:val="Footnote Text"/>
+    <w:basedOn w:val="Normal"/>
+    <w:next w:val="FootnoteText"/>
+    <w:uiPriority w:val="9"/>
+    <w:unhideWhenUsed/>
+    <w:qFormat/>
+    <w:pPr>
+      <w:spacing w:line="360" w:lineRule="auto"/>
+      <w:jc w:val="both"/>
+    </w:pPr>
+    <w:rPr>
+      <w:rFonts w:ascii="Times New Roman" w:eastAsia="Times New Roman" w:hAnsi="Times New Roman"/>
+      <w:color w:val="000000"/>
+      <w:sz w:val="26"/>
+    </w:rPr>
+  </w:style>
+  <w:style w:default="1" w:styleId="DefaultParagraphFont" w:type="character">
     <w:name w:val="Default Paragraph Font"/>
     <w:semiHidden/>
+    <w:unhideWhenUsed/>
+    <w:rPr>
+      <w:rFonts w:ascii="Times New Roman" w:eastAsia="Times New Roman" w:hAnsi="Times New Roman"/>
+      <w:color w:val="000000"/>
+      <w:sz w:val="26"/>
+    </w:rPr>
+  </w:style>
+  <w:style w:default="1" w:styleId="Table" w:type="table">
+    <w:name w:val="Table"/>
+    <w:basedOn w:val="TableNormal"/>
+    <w:semiHidden/>
+    <w:unhideWhenUsed/>
     <w:qFormat/>
-    <w:uiPriority w:val="0"/>
-  </w:style>
-  <w:style w:type="table" w:default="1" w:styleId="3">
-    <w:name w:val="Normal Table"/>
-    <w:semiHidden/>
-    <w:qFormat/>
-    <w:uiPriority w:val="0"/>
+    <w:pPr>
+      <w:spacing w:line="360" w:lineRule="auto"/>
+      <w:jc w:val="both"/>
+    </w:pPr>
+    <w:rPr>
+      <w:rFonts w:ascii="Times New Roman" w:eastAsia="Times New Roman" w:hAnsi="Times New Roman"/>
+      <w:color w:val="000000"/>
+      <w:sz w:val="26"/>
+    </w:rPr>
     <w:tblPr>
+      <w:tblInd w:type="dxa" w:w="0"/>
       <w:tblCellMar>
-        <w:top w:w="0" w:type="dxa"/>
-        <w:left w:w="108" w:type="dxa"/>
-        <w:bottom w:w="0" w:type="dxa"/>
-        <w:right w:w="108" w:type="dxa"/>
+        <w:top w:type="dxa" w:w="0"/>
+        <w:left w:type="dxa" w:w="108"/>
+        <w:bottom w:type="dxa" w:w="0"/>
+        <w:right w:type="dxa" w:w="108"/>
       </w:tblCellMar>
     </w:tblPr>
+    <w:tblStylePr w:type="firstRow">
+      <w:tblPr>
+        <w:jc w:val="left"/>
+        <w:tblInd w:type="dxa" w:w="0"/>
+      </w:tblPr>
+      <w:trPr>
+        <w:jc w:val="left"/>
+      </w:trPr>
+      <w:tcPr>
+        <w:vAlign w:val="bottom"/>
+        <w:tcBorders>
+          <w:bottom w:val="single"/>
+        </w:tcBorders>
+      </w:tcPr>
+    </w:tblStylePr>
   </w:style>
-  <w:style w:type="paragraph" w:styleId="4">
-    <w:name w:val="Body Text"/>
+  <w:style w:customStyle="1" w:styleId="DefinitionTerm" w:type="paragraph">
+    <w:name w:val="Definition Term"/>
+    <w:basedOn w:val="Normal"/>
+    <w:next w:val="Definition"/>
+    <w:pPr>
+      <w:keepNext/>
+      <w:keepLines/>
+      <w:spacing w:after="0" w:line="360" w:lineRule="auto"/>
+      <w:jc w:val="both"/>
+    </w:pPr>
+    <w:rPr>
+      <w:rFonts w:ascii="Times New Roman" w:eastAsia="Times New Roman" w:hAnsi="Times New Roman"/>
+      <w:b/>
+      <w:color w:val="000000"/>
+      <w:sz w:val="26"/>
+    </w:rPr>
+  </w:style>
+  <w:style w:customStyle="1" w:styleId="Definition" w:type="paragraph">
+    <w:name w:val="Definition"/>
+    <w:basedOn w:val="Normal"/>
+    <w:pPr>
+      <w:spacing w:line="360" w:lineRule="auto"/>
+      <w:jc w:val="both"/>
+    </w:pPr>
+    <w:rPr>
+      <w:rFonts w:ascii="Times New Roman" w:eastAsia="Times New Roman" w:hAnsi="Times New Roman"/>
+      <w:color w:val="000000"/>
+      <w:sz w:val="26"/>
+    </w:rPr>
+  </w:style>
+  <w:style w:styleId="Caption" w:type="paragraph">
+    <w:name w:val="Caption"/>
+    <w:basedOn w:val="Normal"/>
+    <w:link w:val="BodyTextChar"/>
+    <w:pPr>
+      <w:spacing w:after="120" w:before="0" w:line="360" w:lineRule="auto"/>
+      <w:jc w:val="both"/>
+    </w:pPr>
+    <w:rPr>
+      <w:rFonts w:ascii="Times New Roman" w:eastAsia="Times New Roman" w:hAnsi="Times New Roman"/>
+      <w:i/>
+      <w:color w:val="000000"/>
+      <w:sz w:val="26"/>
+    </w:rPr>
+  </w:style>
+  <w:style w:customStyle="1" w:styleId="TableCaption" w:type="paragraph">
+    <w:name w:val="Table Caption"/>
+    <w:basedOn w:val="Caption"/>
+    <w:pPr>
+      <w:keepNext/>
+      <w:spacing w:line="360" w:lineRule="auto"/>
+      <w:jc w:val="both"/>
+    </w:pPr>
+    <w:rPr>
+      <w:rFonts w:ascii="Times New Roman" w:eastAsia="Times New Roman" w:hAnsi="Times New Roman"/>
+      <w:color w:val="000000"/>
+      <w:sz w:val="26"/>
+    </w:rPr>
+  </w:style>
+  <w:style w:customStyle="1" w:styleId="ImageCaption" w:type="paragraph">
+    <w:name w:val="Image Caption"/>
+    <w:basedOn w:val="Caption"/>
+    <w:pPr>
+      <w:spacing w:line="360" w:lineRule="auto"/>
+      <w:jc w:val="both"/>
+    </w:pPr>
+    <w:rPr>
+      <w:rFonts w:ascii="Times New Roman" w:eastAsia="Times New Roman" w:hAnsi="Times New Roman"/>
+      <w:color w:val="000000"/>
+      <w:sz w:val="26"/>
+    </w:rPr>
+  </w:style>
+  <w:style w:customStyle="1" w:styleId="Figure" w:type="paragraph">
+    <w:name w:val="Figure"/>
+    <w:basedOn w:val="Normal"/>
+    <w:pPr>
+      <w:spacing w:line="360" w:lineRule="auto"/>
+      <w:jc w:val="both"/>
+    </w:pPr>
+    <w:rPr>
+      <w:rFonts w:ascii="Times New Roman" w:eastAsia="Times New Roman" w:hAnsi="Times New Roman"/>
+      <w:color w:val="000000"/>
+      <w:sz w:val="26"/>
+    </w:rPr>
+  </w:style>
+  <w:style w:customStyle="1" w:styleId="CaptionedFigure" w:type="paragraph">
+    <w:name w:val="Captioned Figure"/>
+    <w:basedOn w:val="Figure"/>
+    <w:pPr>
+      <w:keepNext/>
+      <w:spacing w:line="360" w:lineRule="auto"/>
+      <w:jc w:val="both"/>
+    </w:pPr>
+    <w:rPr>
+      <w:rFonts w:ascii="Times New Roman" w:eastAsia="Times New Roman" w:hAnsi="Times New Roman"/>
+      <w:color w:val="000000"/>
+      <w:sz w:val="26"/>
+    </w:rPr>
+  </w:style>
+  <w:style w:customStyle="1" w:styleId="BodyTextChar" w:type="character">
+    <w:name w:val="Body Text Char"/>
+    <w:basedOn w:val="DefaultParagraphFont"/>
+    <w:link w:val="BodyText"/>
+    <w:rPr>
+      <w:rFonts w:ascii="Times New Roman" w:eastAsia="Times New Roman" w:hAnsi="Times New Roman"/>
+      <w:color w:val="000000"/>
+      <w:sz w:val="26"/>
+    </w:rPr>
+  </w:style>
+  <w:style w:customStyle="1" w:styleId="VerbatimChar" w:type="character">
+    <w:name w:val="Verbatim Char"/>
+    <w:basedOn w:val="BodyTextChar"/>
+    <w:rPr>
+      <w:rFonts w:ascii="Times New Roman" w:eastAsia="Times New Roman" w:hAnsi="Times New Roman"/>
+      <w:color w:val="000000"/>
+      <w:sz w:val="26"/>
+    </w:rPr>
+  </w:style>
+  <w:style w:customStyle="1" w:styleId="SectionNumber" w:type="character">
+    <w:name w:val="Section Number"/>
+    <w:basedOn w:val="BodyTextChar"/>
+    <w:rPr>
+      <w:rFonts w:ascii="Times New Roman" w:eastAsia="Times New Roman" w:hAnsi="Times New Roman"/>
+      <w:color w:val="000000"/>
+      <w:sz w:val="26"/>
+    </w:rPr>
+  </w:style>
+  <w:style w:styleId="FootnoteReference" w:type="character">
+    <w:name w:val="Footnote Reference"/>
+    <w:basedOn w:val="BodyTextChar"/>
+    <w:rPr>
+      <w:rFonts w:ascii="Times New Roman" w:eastAsia="Times New Roman" w:hAnsi="Times New Roman"/>
+      <w:color w:val="000000"/>
+      <w:sz w:val="26"/>
+      <w:vertAlign w:val="superscript"/>
+    </w:rPr>
+  </w:style>
+  <w:style w:styleId="Hyperlink" w:type="character">
+    <w:name w:val="Hyperlink"/>
+    <w:basedOn w:val="BodyTextChar"/>
+    <w:rPr>
+      <w:rFonts w:ascii="Times New Roman" w:eastAsia="Times New Roman" w:hAnsi="Times New Roman"/>
+      <w:color w:val="000000"/>
+      <w:sz w:val="26"/>
+    </w:rPr>
+  </w:style>
+  <w:style w:styleId="TOCHeading" w:type="paragraph">
+    <w:name w:val="TOC Heading"/>
+    <w:basedOn w:val="Heading1"/>
+    <w:next w:val="BodyText"/>
+    <w:uiPriority w:val="39"/>
     <w:unhideWhenUsed/>
     <w:qFormat/>
-    <w:uiPriority w:val="99"/>
     <w:pPr>
-      <w:spacing w:after="120" w:line="276" w:lineRule="auto"/>
-      <w:ind w:left="357"/>
+      <w:spacing w:before="240" w:line="360" w:lineRule="auto"/>
+      <w:jc w:val="both"/>
+      <w:outlineLvl w:val="9"/>
     </w:pPr>
     <w:rPr>
-      <w:rFonts w:ascii="Times New Roman" w:hAnsi="Times New Roman" w:eastAsia="Times New Roman" w:cs="Times New Roman"/>
-      <w:sz w:val="22"/>
-      <w:szCs w:val="22"/>
-      <w:lang w:val="en-US" w:eastAsia="en-US" w:bidi="ar-SA"/>
+      <w:rFonts w:ascii="Times New Roman" w:asciiTheme="majorHAnsi" w:cstheme="majorBidi" w:eastAsia="Times New Roman" w:eastAsiaTheme="majorEastAsia" w:hAnsi="Times New Roman" w:hAnsiTheme="majorHAnsi"/>
+      <w:b w:val="0"/>
+      <w:bCs w:val="0"/>
+      <w:color w:val="000000"/>
+      <w:sz w:val="26"/>
     </w:rPr>
   </w:style>
-  <w:style w:type="paragraph" w:styleId="5">
-    <w:name w:val="footer"/>
-    <w:basedOn w:val="1"/>
-    <w:uiPriority w:val="0"/>
+  <w:style w:type="paragraph" w:customStyle="1" w:styleId="SourceCode">
+    <w:name w:val="Source Code"/>
+    <w:basedOn w:val="Normal"/>
+    <w:link w:val="VerbatimChar"/>
     <w:pPr>
-      <w:tabs>
-        <w:tab w:val="center" w:pos="4153"/>
-        <w:tab w:val="right" w:pos="8306"/>
-      </w:tabs>
-      <w:snapToGrid w:val="0"/>
-      <w:jc w:val="left"/>
+      <w:wordWrap w:val="off"/>
     </w:pPr>
+  </w:style>
+  <w:style w:type="character" w:customStyle="1" w:styleId="KeywordTok">
+    <w:name w:val="KeywordTok"/>
+    <w:basedOn w:val="VerbatimChar"/>
     <w:rPr>
-      <w:sz w:val="18"/>
-      <w:szCs w:val="18"/>
+      <w:color w:val="007020"/>
+      <w:b/>
     </w:rPr>
   </w:style>
-  <w:style w:type="paragraph" w:styleId="6">
-    <w:name w:val="header"/>
-    <w:basedOn w:val="1"/>
-    <w:qFormat/>
-    <w:uiPriority w:val="0"/>
-    <w:pPr>
-      <w:tabs>
-        <w:tab w:val="center" w:pos="4153"/>
-        <w:tab w:val="right" w:pos="8306"/>
-      </w:tabs>
-      <w:snapToGrid w:val="0"/>
-    </w:pPr>
+  <w:style w:type="character" w:customStyle="1" w:styleId="DataTypeTok">
+    <w:name w:val="DataTypeTok"/>
+    <w:basedOn w:val="VerbatimChar"/>
     <w:rPr>
-      <w:sz w:val="18"/>
-      <w:szCs w:val="18"/>
+      <w:color w:val="902000"/>
     </w:rPr>
+  </w:style>
+  <w:style w:type="character" w:customStyle="1" w:styleId="DecValTok">
+    <w:name w:val="DecValTok"/>
+    <w:basedOn w:val="VerbatimChar"/>
+    <w:rPr>
+      <w:color w:val="40a070"/>
+    </w:rPr>
+  </w:style>
+  <w:style w:type="character" w:customStyle="1" w:styleId="BaseNTok">
+    <w:name w:val="BaseNTok"/>
+    <w:basedOn w:val="VerbatimChar"/>
+    <w:rPr>
+      <w:color w:val="40a070"/>
+    </w:rPr>
+  </w:style>
+  <w:style w:type="character" w:customStyle="1" w:styleId="FloatTok">
+    <w:name w:val="FloatTok"/>
+    <w:basedOn w:val="VerbatimChar"/>
+    <w:rPr>
+      <w:color w:val="40a070"/>
+    </w:rPr>
+  </w:style>
+  <w:style w:type="character" w:customStyle="1" w:styleId="ConstantTok">
+    <w:name w:val="ConstantTok"/>
+    <w:basedOn w:val="VerbatimChar"/>
+    <w:rPr>
+      <w:color w:val="880000"/>
+    </w:rPr>
+  </w:style>
+  <w:style w:type="character" w:customStyle="1" w:styleId="CharTok">
+    <w:name w:val="CharTok"/>
+    <w:basedOn w:val="VerbatimChar"/>
+    <w:rPr>
+      <w:color w:val="4070a0"/>
+    </w:rPr>
+  </w:style>
+  <w:style w:type="character" w:customStyle="1" w:styleId="SpecialCharTok">
+    <w:name w:val="SpecialCharTok"/>
+    <w:basedOn w:val="VerbatimChar"/>
+    <w:rPr>
+      <w:color w:val="4070a0"/>
+    </w:rPr>
+  </w:style>
+  <w:style w:type="character" w:customStyle="1" w:styleId="StringTok">
+    <w:name w:val="StringTok"/>
+    <w:basedOn w:val="VerbatimChar"/>
+    <w:rPr>
+      <w:color w:val="4070a0"/>
+    </w:rPr>
+  </w:style>
+  <w:style w:type="character" w:customStyle="1" w:styleId="VerbatimStringTok">
+    <w:name w:val="VerbatimStringTok"/>
+    <w:basedOn w:val="VerbatimChar"/>
+    <w:rPr>
+      <w:color w:val="4070a0"/>
+    </w:rPr>
+  </w:style>
+  <w:style w:type="character" w:customStyle="1" w:styleId="SpecialStringTok">
+    <w:name w:val="SpecialStringTok"/>
+    <w:basedOn w:val="VerbatimChar"/>
+    <w:rPr>
+      <w:color w:val="bb6688"/>
+    </w:rPr>
+  </w:style>
+  <w:style w:type="character" w:customStyle="1" w:styleId="ImportTok">
+    <w:name w:val="ImportTok"/>
+    <w:basedOn w:val="VerbatimChar"/>
+    <w:rPr>
+      <w:color w:val="008000"/>
+      <w:b/>
+    </w:rPr>
+  </w:style>
+  <w:style w:type="character" w:customStyle="1" w:styleId="CommentTok">
+    <w:name w:val="CommentTok"/>
+    <w:basedOn w:val="VerbatimChar"/>
+    <w:rPr>
+      <w:color w:val="60a0b0"/>
+      <w:i/>
+    </w:rPr>
+  </w:style>
+  <w:style w:type="character" w:customStyle="1" w:styleId="DocumentationTok">
+    <w:name w:val="DocumentationTok"/>
+    <w:basedOn w:val="VerbatimChar"/>
+    <w:rPr>
+      <w:color w:val="ba2121"/>
+      <w:i/>
+    </w:rPr>
+  </w:style>
+  <w:style w:type="character" w:customStyle="1" w:styleId="AnnotationTok">
+    <w:name w:val="AnnotationTok"/>
+    <w:basedOn w:val="VerbatimChar"/>
+    <w:rPr>
+      <w:color w:val="60a0b0"/>
+      <w:b/>
+      <w:i/>
+    </w:rPr>
+  </w:style>
+  <w:style w:type="character" w:customStyle="1" w:styleId="CommentVarTok">
+    <w:name w:val="CommentVarTok"/>
+    <w:basedOn w:val="VerbatimChar"/>
+    <w:rPr>
+      <w:color w:val="60a0b0"/>
+      <w:b/>
+      <w:i/>
+    </w:rPr>
+  </w:style>
+  <w:style w:type="character" w:customStyle="1" w:styleId="OtherTok">
+    <w:name w:val="OtherTok"/>
+    <w:basedOn w:val="VerbatimChar"/>
+    <w:rPr>
+      <w:color w:val="007020"/>
+    </w:rPr>
+  </w:style>
+  <w:style w:type="character" w:customStyle="1" w:styleId="FunctionTok">
+    <w:name w:val="FunctionTok"/>
+    <w:basedOn w:val="VerbatimChar"/>
+    <w:rPr>
+      <w:color w:val="06287e"/>
+    </w:rPr>
+  </w:style>
+  <w:style w:type="character" w:customStyle="1" w:styleId="VariableTok">
+    <w:name w:val="VariableTok"/>
+    <w:basedOn w:val="VerbatimChar"/>
+    <w:rPr>
+      <w:color w:val="19177c"/>
+    </w:rPr>
+  </w:style>
+  <w:style w:type="character" w:customStyle="1" w:styleId="ControlFlowTok">
+    <w:name w:val="ControlFlowTok"/>
+    <w:basedOn w:val="VerbatimChar"/>
+    <w:rPr>
+      <w:color w:val="007020"/>
+      <w:b/>
+    </w:rPr>
+  </w:style>
+  <w:style w:type="character" w:customStyle="1" w:styleId="OperatorTok">
+    <w:name w:val="OperatorTok"/>
+    <w:basedOn w:val="VerbatimChar"/>
+    <w:rPr>
+      <w:color w:val="666666"/>
+    </w:rPr>
+  </w:style>
+  <w:style w:type="character" w:customStyle="1" w:styleId="BuiltInTok">
+    <w:name w:val="BuiltInTok"/>
+    <w:basedOn w:val="VerbatimChar"/>
+    <w:rPr>
+      <w:color w:val="008000"/>
+    </w:rPr>
+  </w:style>
+  <w:style w:type="character" w:customStyle="1" w:styleId="ExtensionTok">
+    <w:name w:val="ExtensionTok"/>
+    <w:basedOn w:val="VerbatimChar"/>
+    <w:rPr/>
+  </w:style>
+  <w:style w:type="character" w:customStyle="1" w:styleId="PreprocessorTok">
+    <w:name w:val="PreprocessorTok"/>
+    <w:basedOn w:val="VerbatimChar"/>
+    <w:rPr>
+      <w:color w:val="bc7a00"/>
+    </w:rPr>
+  </w:style>
+  <w:style w:type="character" w:customStyle="1" w:styleId="AttributeTok">
+    <w:name w:val="AttributeTok"/>
+    <w:basedOn w:val="VerbatimChar"/>
+    <w:rPr>
+      <w:color w:val="7d9029"/>
+    </w:rPr>
+  </w:style>
+  <w:style w:type="character" w:customStyle="1" w:styleId="RegionMarkerTok">
+    <w:name w:val="RegionMarkerTok"/>
+    <w:basedOn w:val="VerbatimChar"/>
+    <w:rPr/>
+  </w:style>
+  <w:style w:type="character" w:customStyle="1" w:styleId="InformationTok">
+    <w:name w:val="InformationTok"/>
+    <w:basedOn w:val="VerbatimChar"/>
+    <w:rPr>
+      <w:color w:val="60a0b0"/>
+      <w:b/>
+      <w:i/>
+    </w:rPr>
+  </w:style>
+  <w:style w:type="character" w:customStyle="1" w:styleId="WarningTok">
+    <w:name w:val="WarningTok"/>
+    <w:basedOn w:val="VerbatimChar"/>
+    <w:rPr>
+      <w:color w:val="60a0b0"/>
+      <w:b/>
+      <w:i/>
+    </w:rPr>
+  </w:style>
+  <w:style w:type="character" w:customStyle="1" w:styleId="AlertTok">
+    <w:name w:val="AlertTok"/>
+    <w:basedOn w:val="VerbatimChar"/>
+    <w:rPr>
+      <w:color w:val="ff0000"/>
+      <w:b/>
+    </w:rPr>
+  </w:style>
+  <w:style w:type="character" w:customStyle="1" w:styleId="ErrorTok">
+    <w:name w:val="ErrorTok"/>
+    <w:basedOn w:val="VerbatimChar"/>
+    <w:rPr>
+      <w:color w:val="ff0000"/>
+      <w:b/>
+    </w:rPr>
+  </w:style>
+  <w:style w:type="character" w:customStyle="1" w:styleId="NormalTok">
+    <w:name w:val="NormalTok"/>
+    <w:basedOn w:val="VerbatimChar"/>
+    <w:rPr/>
   </w:style>
 </w:styles>
 </file>
 
 <file path=word/theme/theme1.xml><?xml version="1.0" encoding="utf-8"?>
-<a:theme xmlns:a="http://schemas.openxmlformats.org/drawingml/2006/main" name="Office 主题">
+<a:theme xmlns:a="http://schemas.openxmlformats.org/drawingml/2006/main" name="Office Theme">
   <a:themeElements>
     <a:clrScheme name="Office">
       <a:dk1>
@@ -14905,39 +14524,39 @@
         <a:sysClr val="window" lastClr="FFFFFF"/>
       </a:lt1>
       <a:dk2>
-        <a:srgbClr val="44546A"/>
+        <a:srgbClr val="1F497D"/>
       </a:dk2>
       <a:lt2>
-        <a:srgbClr val="E7E6E6"/>
+        <a:srgbClr val="EEECE1"/>
       </a:lt2>
       <a:accent1>
-        <a:srgbClr val="5B9BD5"/>
+        <a:srgbClr val="4F81BD"/>
       </a:accent1>
       <a:accent2>
-        <a:srgbClr val="ED7D31"/>
+        <a:srgbClr val="C0504D"/>
       </a:accent2>
       <a:accent3>
-        <a:srgbClr val="A5A5A5"/>
+        <a:srgbClr val="9BBB59"/>
       </a:accent3>
       <a:accent4>
-        <a:srgbClr val="FFC000"/>
+        <a:srgbClr val="8064A2"/>
       </a:accent4>
       <a:accent5>
-        <a:srgbClr val="4472C4"/>
+        <a:srgbClr val="4BACC6"/>
       </a:accent5>
       <a:accent6>
-        <a:srgbClr val="70AD47"/>
+        <a:srgbClr val="F79646"/>
       </a:accent6>
       <a:hlink>
-        <a:srgbClr val="0563C1"/>
+        <a:srgbClr val="0000FF"/>
       </a:hlink>
       <a:folHlink>
-        <a:srgbClr val="954F72"/>
+        <a:srgbClr val="800080"/>
       </a:folHlink>
     </a:clrScheme>
     <a:fontScheme name="Office">
       <a:majorFont>
-        <a:latin typeface="Calibri Light"/>
+        <a:latin typeface="Calibri"/>
         <a:ea typeface=""/>
         <a:cs typeface=""/>
         <a:font script="Jpan" typeface="ＭＳ ゴシック"/>
@@ -14969,10 +14588,9 @@
         <a:font script="Mong" typeface="Mongolian Baiti"/>
         <a:font script="Viet" typeface="Times New Roman"/>
         <a:font script="Uigh" typeface="Microsoft Uighur"/>
-        <a:font script="Geor" typeface="Sylfaen"/>
       </a:majorFont>
       <a:minorFont>
-        <a:latin typeface="Calibri"/>
+        <a:latin typeface="Cambria"/>
         <a:ea typeface=""/>
         <a:cs typeface=""/>
         <a:font script="Jpan" typeface="ＭＳ 明朝"/>
@@ -15004,7 +14622,6 @@
         <a:font script="Mong" typeface="Mongolian Baiti"/>
         <a:font script="Viet" typeface="Arial"/>
         <a:font script="Uigh" typeface="Microsoft Uighur"/>
-        <a:font script="Geor" typeface="Sylfaen"/>
       </a:minorFont>
     </a:fontScheme>
     <a:fmtScheme name="Office">
@@ -15016,135 +14633,200 @@
           <a:gsLst>
             <a:gs pos="0">
               <a:schemeClr val="phClr">
-                <a:lumMod val="110000"/>
-                <a:satMod val="105000"/>
-                <a:tint val="67000"/>
+                <a:tint val="50000"/>
+                <a:satMod val="300000"/>
               </a:schemeClr>
             </a:gs>
-            <a:gs pos="50000">
+            <a:gs pos="35000">
               <a:schemeClr val="phClr">
-                <a:lumMod val="105000"/>
-                <a:satMod val="103000"/>
-                <a:tint val="73000"/>
+                <a:tint val="37000"/>
+                <a:satMod val="300000"/>
               </a:schemeClr>
             </a:gs>
             <a:gs pos="100000">
               <a:schemeClr val="phClr">
-                <a:lumMod val="105000"/>
-                <a:satMod val="109000"/>
-                <a:tint val="81000"/>
+                <a:tint val="15000"/>
+                <a:satMod val="350000"/>
               </a:schemeClr>
             </a:gs>
           </a:gsLst>
-          <a:lin ang="5400000" scaled="0"/>
+          <a:lin ang="16200000" scaled="1"/>
         </a:gradFill>
         <a:gradFill rotWithShape="1">
           <a:gsLst>
             <a:gs pos="0">
               <a:schemeClr val="phClr">
-                <a:satMod val="103000"/>
-                <a:lumMod val="102000"/>
-                <a:tint val="94000"/>
-              </a:schemeClr>
-            </a:gs>
-            <a:gs pos="50000">
-              <a:schemeClr val="phClr">
-                <a:satMod val="110000"/>
-                <a:lumMod val="100000"/>
+                <a:tint val="100000"/>
                 <a:shade val="100000"/>
+                <a:satMod val="130000"/>
               </a:schemeClr>
             </a:gs>
             <a:gs pos="100000">
               <a:schemeClr val="phClr">
-                <a:lumMod val="99000"/>
-                <a:satMod val="120000"/>
-                <a:shade val="78000"/>
+                <a:tint val="50000"/>
+                <a:shade val="100000"/>
+                <a:satMod val="350000"/>
               </a:schemeClr>
             </a:gs>
           </a:gsLst>
-          <a:lin ang="5400000" scaled="0"/>
+          <a:lin ang="16200000" scaled="0"/>
         </a:gradFill>
       </a:fillStyleLst>
       <a:lnStyleLst>
-        <a:ln w="6350" cap="flat" cmpd="sng" algn="ctr">
+        <a:ln w="9525" cap="flat" cmpd="sng" algn="ctr">
+          <a:solidFill>
+            <a:schemeClr val="phClr">
+              <a:shade val="95000"/>
+              <a:satMod val="105000"/>
+            </a:schemeClr>
+          </a:solidFill>
+          <a:prstDash val="solid"/>
+        </a:ln>
+        <a:ln w="25400" cap="flat" cmpd="sng" algn="ctr">
           <a:solidFill>
             <a:schemeClr val="phClr"/>
           </a:solidFill>
           <a:prstDash val="solid"/>
-          <a:miter lim="800000"/>
         </a:ln>
-        <a:ln w="12700" cap="flat" cmpd="sng" algn="ctr">
+        <a:ln w="38100" cap="flat" cmpd="sng" algn="ctr">
           <a:solidFill>
             <a:schemeClr val="phClr"/>
           </a:solidFill>
           <a:prstDash val="solid"/>
-          <a:miter lim="800000"/>
-        </a:ln>
-        <a:ln w="19050" cap="flat" cmpd="sng" algn="ctr">
-          <a:solidFill>
-            <a:schemeClr val="phClr"/>
-          </a:solidFill>
-          <a:prstDash val="solid"/>
-          <a:miter lim="800000"/>
         </a:ln>
       </a:lnStyleLst>
       <a:effectStyleLst>
         <a:effectStyle>
-          <a:effectLst/>
-        </a:effectStyle>
-        <a:effectStyle>
-          <a:effectLst/>
+          <a:effectLst>
+            <a:outerShdw blurRad="40000" dist="20000" dir="5400000" rotWithShape="0">
+              <a:srgbClr val="000000">
+                <a:alpha val="38000"/>
+              </a:srgbClr>
+            </a:outerShdw>
+          </a:effectLst>
         </a:effectStyle>
         <a:effectStyle>
           <a:effectLst>
-            <a:outerShdw blurRad="57150" dist="19050" dir="5400000" algn="ctr" rotWithShape="0">
+            <a:outerShdw blurRad="40000" dist="23000" dir="5400000" rotWithShape="0">
               <a:srgbClr val="000000">
-                <a:alpha val="63000"/>
+                <a:alpha val="35000"/>
               </a:srgbClr>
             </a:outerShdw>
           </a:effectLst>
+        </a:effectStyle>
+        <a:effectStyle>
+          <a:effectLst>
+            <a:outerShdw blurRad="40000" dist="23000" dir="5400000" rotWithShape="0">
+              <a:srgbClr val="000000">
+                <a:alpha val="35000"/>
+              </a:srgbClr>
+            </a:outerShdw>
+          </a:effectLst>
+          <a:scene3d>
+            <a:camera prst="orthographicFront">
+              <a:rot lat="0" lon="0" rev="0"/>
+            </a:camera>
+            <a:lightRig rig="threePt" dir="t">
+              <a:rot lat="0" lon="0" rev="1200000"/>
+            </a:lightRig>
+          </a:scene3d>
+          <a:sp3d>
+            <a:bevelT w="63500" h="25400"/>
+          </a:sp3d>
         </a:effectStyle>
       </a:effectStyleLst>
       <a:bgFillStyleLst>
         <a:solidFill>
           <a:schemeClr val="phClr"/>
         </a:solidFill>
-        <a:solidFill>
-          <a:schemeClr val="phClr">
-            <a:tint val="95000"/>
-            <a:satMod val="170000"/>
-          </a:schemeClr>
-        </a:solidFill>
         <a:gradFill rotWithShape="1">
           <a:gsLst>
             <a:gs pos="0">
               <a:schemeClr val="phClr">
-                <a:tint val="93000"/>
-                <a:satMod val="150000"/>
-                <a:shade val="98000"/>
-                <a:lumMod val="102000"/>
+                <a:tint val="40000"/>
+                <a:satMod val="350000"/>
               </a:schemeClr>
             </a:gs>
-            <a:gs pos="50000">
+            <a:gs pos="40000">
               <a:schemeClr val="phClr">
-                <a:tint val="98000"/>
-                <a:satMod val="130000"/>
-                <a:shade val="90000"/>
-                <a:lumMod val="103000"/>
+                <a:tint val="45000"/>
+                <a:shade val="99000"/>
+                <a:satMod val="350000"/>
               </a:schemeClr>
             </a:gs>
             <a:gs pos="100000">
               <a:schemeClr val="phClr">
-                <a:shade val="63000"/>
-                <a:satMod val="120000"/>
+                <a:shade val="20000"/>
+                <a:satMod val="255000"/>
               </a:schemeClr>
             </a:gs>
           </a:gsLst>
-          <a:lin ang="5400000" scaled="0"/>
+          <a:path path="circle">
+            <a:fillToRect l="50000" t="-80000" r="50000" b="180000"/>
+          </a:path>
+        </a:gradFill>
+        <a:gradFill rotWithShape="1">
+          <a:gsLst>
+            <a:gs pos="0">
+              <a:schemeClr val="phClr">
+                <a:tint val="80000"/>
+                <a:satMod val="300000"/>
+              </a:schemeClr>
+            </a:gs>
+            <a:gs pos="100000">
+              <a:schemeClr val="phClr">
+                <a:shade val="30000"/>
+                <a:satMod val="200000"/>
+              </a:schemeClr>
+            </a:gs>
+          </a:gsLst>
+          <a:path path="circle">
+            <a:fillToRect l="50000" t="50000" r="50000" b="50000"/>
+          </a:path>
         </a:gradFill>
       </a:bgFillStyleLst>
     </a:fmtScheme>
   </a:themeElements>
-  <a:objectDefaults/>
+  <a:objectDefaults>
+    <a:spDef>
+      <a:spPr/>
+      <a:bodyPr/>
+      <a:lstStyle/>
+      <a:style>
+        <a:lnRef idx="1">
+          <a:schemeClr val="accent1"/>
+        </a:lnRef>
+        <a:fillRef idx="3">
+          <a:schemeClr val="accent1"/>
+        </a:fillRef>
+        <a:effectRef idx="2">
+          <a:schemeClr val="accent1"/>
+        </a:effectRef>
+        <a:fontRef idx="minor">
+          <a:schemeClr val="lt1"/>
+        </a:fontRef>
+      </a:style>
+    </a:spDef>
+    <a:lnDef>
+      <a:spPr/>
+      <a:bodyPr/>
+      <a:lstStyle/>
+      <a:style>
+        <a:lnRef idx="2">
+          <a:schemeClr val="accent1"/>
+        </a:lnRef>
+        <a:fillRef idx="0">
+          <a:schemeClr val="accent1"/>
+        </a:fillRef>
+        <a:effectRef idx="1">
+          <a:schemeClr val="accent1"/>
+        </a:effectRef>
+        <a:fontRef idx="minor">
+          <a:schemeClr val="tx1"/>
+        </a:fontRef>
+      </a:style>
+    </a:lnDef>
+  </a:objectDefaults>
+  <a:extraClrSchemeLst/>
 </a:theme>
 </file>
</xml_diff>

<commit_message>
dist: rebuild CD2 submission final docx; update pipeline_status
CD2_submission_final.docx was stale since commit 09cdcd3 — the source
cd2 was updated in 4 subsequent commits (H4a/H4b/H4c split, Bảng 2.13,
section heading fix, H3a/H3b split + Khatua APA7). Rebuilt from current
source with --resource-path to include hinh_2_1/hinh_2_2 figures.

pipeline_status.md: Added session log entries for all CD2 B.1/B.2/B.6/B.8
fixes, P8 Atlas 2026 in-text citations, and refs v2.8 changes.

https://claude.ai/code/session_01GMFmEtt6FYiJ4MKzBNCLqb
</commit_message>
<xml_diff>
--- a/dist/submission_packages/cd2/CD2_submission_final.docx
+++ b/dist/submission_packages/cd2/CD2_submission_final.docx
@@ -2,7 +2,7 @@
 <file path=word/document.xml><?xml version="1.0" encoding="utf-8"?>
 <w:document xmlns:w="http://schemas.openxmlformats.org/wordprocessingml/2006/main" xmlns:m="http://schemas.openxmlformats.org/officeDocument/2006/math" xmlns:r="http://schemas.openxmlformats.org/officeDocument/2006/relationships" xmlns:o="urn:schemas-microsoft-com:office:office" xmlns:v="urn:schemas-microsoft-com:vml" xmlns:w10="urn:schemas-microsoft-com:office:word" xmlns:a="http://schemas.openxmlformats.org/drawingml/2006/main" xmlns:pic="http://schemas.openxmlformats.org/drawingml/2006/picture" xmlns:wp="http://schemas.openxmlformats.org/drawingml/2006/wordprocessingDrawing">
   <w:body>
-    <w:bookmarkStart w:id="129" w:name="chuyên-đề-tiến-sĩ-số-2"/>
+    <w:bookmarkStart w:id="130" w:name="chuyên-đề-tiến-sĩ-số-2"/>
     <w:p>
       <w:pPr>
         <w:pStyle w:val="Heading1"/>
@@ -192,7 +192,7 @@
         <w:pStyle w:val="FirstParagraph"/>
       </w:pPr>
       <w:r>
-        <w:t xml:space="preserve">Chuyên đề này xây dựng mô hình nghiên cứu lý thuyết và thực nghiệm về ảnh hưởng của quốc tế hóa đến hiệu quả hoạt động kinh doanh của các doanh nghiệp ở các quốc gia châu Á trong giai đoạn 2009–2025. Khung lý thuyết tích hợp bốn tầng — Uppsala Model (Johanson &amp; Vahlne, 1977, 2009), Resource-Based View (Barney, 1991; Wernerfelt, 1984), Institutional Theory (North, 1990; Khanna &amp; Palepu, 2010; Peng, 2003) và Upper Echelons Theory (Hambrick &amp; Mason, 1984; Hambrick, 2007) — kết hợp với Foundational Digital Adoption Framework (Banalieva &amp; Dhanaraj, 2019; Verhoef et al., 2021; Stallkamp &amp; Schotter, 2021) làm nền tảng lý thuyết. Lược khảo năm dạng hàm quan hệ quốc tế hóa — hiệu quả (I→P) gồm tuyến tính, chữ U ngược, S-curve, M-curve, và forced penalty, cùng năm meta-analysis lớn giai đoạn 1980–2024, cho thấy khoảng trống thực nghiệm trong việc kiểm định đồng thời phi tuyến và điều tiết đa tầng ở châu Á. Hệ giả thuyết H1–H6 được phát triển: H1 phi tuyến dạng chữ U ngược hoặc S-curve; H2 Technological Capability Index (TCI) điều tiết tích cực; H3 Digital Adoption Index (DAI) điều tiết theo ngữ cảnh và phân biệt với TCI; H4 đặc điểm nhà quản trị điều tiết; H5 thể chế nội địa điều tiết theo gradient ICRV sáu nhóm; H6 tính không đồng nhất theo thời gian. Tám mô hình thực nghiệm M0–M7 được đặc tả, từ baseline tuyến tính đến mô hình điều tiết ba chiều cấp luận án. Chiến lược nhận dạng đa tầng và kế hoạch kiểm định độ vững toàn diện được thiết kế cho pool 101.185 doanh nghiệp ở 47 nền kinh tế châu Á và Thái Bình Dương, bao gồm 108 cặp quốc gia-năm qua 14 mốc khảo sát WBES giai đoạn 2009–2025. Bốn đóng góp chính: (i) khung tích hợp 4 tầng kết hợp Foundational Digital Adoption Framework chưa có tương đương cho châu Á; (ii) tách bạch TCI và DAI theo Mô hình Áp dụng số và Năng lực phụ thuộc bối cảnh (CDCM); (iii) mô hình M7 điều tiết ba chiều; (iv) phân loại nhánh Advanced thành tiên tiến đổi mới sáng tạo dẫn dắt (ICRV Nhóm I) và tiên tiến tài nguyên dẫn dắt (ICRV Nhóm II). Ba bản thảo thực nghiệm đồng hành — P3 Việt Nam (JABS, under review), P4 Singapore (MIR, under review), P5 Trung Quốc (IJOEM, under review) — cung cấp bằng chứng quốc gia cụ thể kiểm định H1–H6 và xác nhận tính khả nghiệm của mô hình đề xuất.</w:t>
+        <w:t xml:space="preserve">Chuyên đề này xây dựng mô hình nghiên cứu lý thuyết và thực nghiệm về ảnh hưởng của quốc tế hóa đến hiệu quả hoạt động kinh doanh của các doanh nghiệp ở các quốc gia châu Á trong giai đoạn 2009–2025. Khung lý thuyết tích hợp bốn tầng — Uppsala Model (Johanson &amp; Vahlne, 1977, 2009), Resource-Based View (Barney, 1991; Wernerfelt, 1984), Institutional Theory (North, 1990; Khanna &amp; Palepu, 2010; Peng, 2003) và Upper Echelons Theory (Hambrick &amp; Mason, 1984; Hambrick, 2007) — kết hợp với Foundational Digital Adoption Framework (Banalieva &amp; Dhanaraj, 2019; Verhoef et al., 2021; Stallkamp &amp; Schotter, 2021) làm nền tảng lý thuyết. Lược khảo năm dạng hàm quan hệ quốc tế hóa — hiệu quả (I→P) gồm tuyến tính, chữ U ngược, S-curve, M-curve, và forced penalty, cùng năm meta-analysis lớn giai đoạn 1980–2024, cho thấy khoảng trống thực nghiệm trong việc kiểm định đồng thời phi tuyến và điều tiết đa tầng ở châu Á. Hệ giả thuyết H1–H6 được phát triển: H1 phi tuyến dạng chữ U ngược hoặc S-curve; H2 Technological Capability Index (TCI) điều tiết tích cực; H3a–H3b Digital Adoption Index (DAI) điều tiết phụ thuộc chế độ thể chế: tích cực ở Emerging/Frontier (H3a) và có điều kiện/null ở Advanced (H3b), phân biệt với TCI; H4a–H4c đặc điểm nhà quản trị điều tiết (kinh nghiệm, học vấn, giới tính — tách biệt dấu kỳ vọng); H5 thể chế nội địa điều tiết theo gradient ICRV sáu nhóm; H6 tính không đồng nhất theo thời gian. Tám mô hình thực nghiệm M0–M7 được đặc tả, từ baseline tuyến tính đến mô hình điều tiết ba chiều cấp luận án. Chiến lược nhận dạng đa tầng và kế hoạch kiểm định độ vững toàn diện được thiết kế cho pool 101.185 doanh nghiệp ở 47 nền kinh tế châu Á và Thái Bình Dương, bao gồm 108 cặp quốc gia-năm qua 14 mốc khảo sát WBES giai đoạn 2009–2025. Bốn đóng góp chính: (i) khung tích hợp 4 tầng kết hợp Foundational Digital Adoption Framework chưa có tương đương cho châu Á; (ii) tách bạch TCI và DAI theo Mô hình Áp dụng số và Năng lực phụ thuộc bối cảnh (CDCM); (iii) mô hình M7 điều tiết ba chiều; (iv) phân loại nhánh Advanced thành tiên tiến đổi mới sáng tạo dẫn dắt (ICRV Nhóm I) và tiên tiến tài nguyên dẫn dắt (ICRV Nhóm II). Ba bản thảo thực nghiệm đồng hành — P3 Việt Nam (JABS, under review), P4 Singapore (MIR, under review), P5 Trung Quốc (IJOEM, under review) — cung cấp bằng chứng quốc gia cụ thể kiểm định H1–H6 và xác nhận tính khả nghiệm của mô hình đề xuất.</w:t>
       </w:r>
     </w:p>
     <w:p>
@@ -225,7 +225,7 @@
         <w:pStyle w:val="FirstParagraph"/>
       </w:pPr>
       <w:r>
-        <w:t xml:space="preserve">This specialty essay constructs a theoretical and empirical research model on the effect of internationalization on firm performance across Asian economies during 2009–2025. The integrated theoretical framework combines four layers — the Uppsala Model (Johanson &amp; Vahlne, 1977, 2009), the Resource-Based View (Barney, 1991; Wernerfelt, 1984), Institutional Theory (North, 1990; Khanna &amp; Palepu, 2010; Peng, 2003), and Upper Echelons Theory (Hambrick &amp; Mason, 1984; Hambrick, 2007) — together with the Foundational Digital Adoption Framework (Banalieva &amp; Dhanaraj, 2019; Verhoef et al., 2021; Stallkamp &amp; Schotter, 2021). A review of five functional forms of the internationalization–performance (I→P) relationship — linear, inverted-U, S-curve, M-curve, and forced penalty — together with five major meta-analyses covering 1980–2024 reveals an empirical gap in the simultaneous testing of nonlinearity and multi-level moderation in Asia. Six hypotheses (H1–H6) are developed: H1 nonlinear inverted-U or S-curve relationship; H2 Technological Capability Index (TCI) positively moderating; H3 Digital Adoption Index (DAI) moderating contingently and distinguishable from TCI; H4 top manager characteristics moderating; H5 home-country institutions moderating along the ICRV six-regime gradient; H6 temporal heterogeneity. Eight empirical models M0–M7 are specified, from linear baseline to three-way moderation. A multi-level identification strategy and comprehensive robustness plan are designed for a pool of 101,185 firms across 47 Asian and Pacific economies, spanning 108 country-year pairs across 14 WBES survey waves (2009–2025). The four main contributions are: (i) an integrated 4-tier framework combined with the Foundational Digital Adoption Framework with no equivalent for Asia; (ii) the separation of TCI and DAI within the Context-Contingent Digital-and-Capability Model (CDCM); (iii) the M7 three-way moderation model; (iv) sub-grouping of the Advanced regime into innovation-driven (ICRV Group I) and resource-driven (ICRV Group II) types. Three companion empirical papers — P3 Vietnam (JABS, under review), P4 Singapore (MIR, under review), P5 China (IJOEM, under review) — provide country-specific evidence testing H1–H6 and validating the proposed model structure.</w:t>
+        <w:t xml:space="preserve">This specialty essay constructs a theoretical and empirical research model on the effect of internationalization on firm performance across Asian economies during 2009–2025. The integrated theoretical framework combines four layers — the Uppsala Model (Johanson &amp; Vahlne, 1977, 2009), the Resource-Based View (Barney, 1991; Wernerfelt, 1984), Institutional Theory (North, 1990; Khanna &amp; Palepu, 2010; Peng, 2003), and Upper Echelons Theory (Hambrick &amp; Mason, 1984; Hambrick, 2007) — together with the Foundational Digital Adoption Framework (Banalieva &amp; Dhanaraj, 2019; Verhoef et al., 2021; Stallkamp &amp; Schotter, 2021). A review of five functional forms of the internationalization–performance (I→P) relationship — linear, inverted-U, S-curve, M-curve, and forced penalty — together with five major meta-analyses covering 1980–2024 reveals an empirical gap in the simultaneous testing of nonlinearity and multi-level moderation in Asia. Six hypotheses (H1–H6) are developed: H1 nonlinear inverted-U or S-curve relationship; H2 Technological Capability Index (TCI) positively moderating; H3a–H3b Digital Adoption Index (DAI) moderating contingent on institutional regime: positive for Emerging/Frontier (H3a), conditional or null for Advanced (H3b), and distinguishable from TCI; H4a–H4c top manager characteristics moderating (experience, education, and gender with distinct directional expectations); H5 home-country institutions moderating along the ICRV six-regime gradient; H6 temporal heterogeneity. Eight empirical models M0–M7 are specified, from linear baseline to three-way moderation. A multi-level identification strategy and comprehensive robustness plan are designed for a pool of 101,185 firms across 47 Asian and Pacific economies, spanning 108 country-year pairs across 14 WBES survey waves (2009–2025). The four main contributions are: (i) an integrated 4-tier framework combined with the Foundational Digital Adoption Framework with no equivalent for Asia; (ii) the separation of TCI and DAI within the Context-Contingent Digital-and-Capability Model (CDCM); (iii) the M7 three-way moderation model; (iv) sub-grouping of the Advanced regime into innovation-driven (ICRV Group I) and resource-driven (ICRV Group II) types. Three companion empirical papers — P3 Vietnam (JABS, under review), P4 Singapore (MIR, under review), P5 China (IJOEM, under review) — provide country-specific evidence testing H1–H6 and validating the proposed model structure.</w:t>
       </w:r>
     </w:p>
     <w:p>
@@ -516,6 +516,14 @@
       </w:pPr>
       <w:r>
         <w:t xml:space="preserve">Bảng 2.12. Kế hoạch kiểm định độ vững — sáu nhóm</w:t>
+      </w:r>
+    </w:p>
+    <w:p>
+      <w:pPr>
+        <w:pStyle w:val="BodyText"/>
+      </w:pPr>
+      <w:r>
+        <w:t xml:space="preserve">Bảng 2.13. So sánh đặc điểm phương pháp và phạm vi lý thuyết của các khung tham chiếu chính và CĐ2</w:t>
       </w:r>
     </w:p>
     <w:p>
@@ -2352,6 +2360,964 @@
       </w:pPr>
       <w:r>
         <w:t xml:space="preserve">Kết luận tổng quan: hiệu ứng trung bình I→P là dương nhỏ (r khoảng 0,04–0,07) nhưng rất không đồng nhất (SD = 0,15–0,21). Cả năm tổng quan đều thiếu: (i) bao phủ đầy đủ châu Á và Thái Bình Dương; (ii) kiểm định đồng thời phi tuyến và điều tiết đa tầng; (iii) phân tách TCI và DAI; (iv) bao gồm quốc đảo nhỏ Thái Bình Dương; (v) dữ liệu sau 2020. Chuyên đề này lấp đầy tất cả năm khoảng trống với pool 101.185 doanh nghiệp và khung CDCM.</w:t>
+      </w:r>
+    </w:p>
+    <w:p>
+      <w:pPr>
+        <w:pStyle w:val="BodyText"/>
+      </w:pPr>
+      <w:r>
+        <w:t xml:space="preserve">Bảng 2.13. So sánh đặc điểm phương pháp và phạm vi lý thuyết của các khung tham chiếu chính và CĐ2.</w:t>
+      </w:r>
+    </w:p>
+    <w:tbl>
+      <w:tblPr>
+        <w:tblStyle w:val="Table"/>
+        <w:tblW w:type="auto" w:w="0"/>
+        <w:tblLook w:firstRow="1" w:lastRow="0" w:firstColumn="0" w:lastColumn="0" w:noHBand="0" w:noVBand="0" w:val="0020"/>
+        <w:jc w:val="start"/>
+      </w:tblPr>
+      <w:tblGrid>
+        <w:gridCol w:w="880"/>
+        <w:gridCol w:w="880"/>
+        <w:gridCol w:w="880"/>
+        <w:gridCol w:w="880"/>
+        <w:gridCol w:w="880"/>
+        <w:gridCol w:w="880"/>
+        <w:gridCol w:w="880"/>
+        <w:gridCol w:w="880"/>
+        <w:gridCol w:w="880"/>
+      </w:tblGrid>
+      <w:tr>
+        <w:trPr>
+          <w:tblHeader w:val="true"/>
+        </w:trPr>
+        <w:tc>
+          <w:tcPr/>
+          <w:p>
+            <w:pPr>
+              <w:pStyle w:val="Compact"/>
+              <w:jc w:val="left"/>
+            </w:pPr>
+            <w:r>
+              <w:t xml:space="preserve">Khung</w:t>
+            </w:r>
+          </w:p>
+        </w:tc>
+        <w:tc>
+          <w:tcPr/>
+          <w:p>
+            <w:pPr>
+              <w:pStyle w:val="Compact"/>
+              <w:jc w:val="left"/>
+            </w:pPr>
+            <w:r>
+              <w:t xml:space="preserve">Phi tuyến I→P</w:t>
+            </w:r>
+          </w:p>
+        </w:tc>
+        <w:tc>
+          <w:tcPr/>
+          <w:p>
+            <w:pPr>
+              <w:pStyle w:val="Compact"/>
+              <w:jc w:val="left"/>
+            </w:pPr>
+            <w:r>
+              <w:t xml:space="preserve">TCI</w:t>
+            </w:r>
+          </w:p>
+        </w:tc>
+        <w:tc>
+          <w:tcPr/>
+          <w:p>
+            <w:pPr>
+              <w:pStyle w:val="Compact"/>
+              <w:jc w:val="left"/>
+            </w:pPr>
+            <w:r>
+              <w:t xml:space="preserve">DAI</w:t>
+            </w:r>
+          </w:p>
+        </w:tc>
+        <w:tc>
+          <w:tcPr/>
+          <w:p>
+            <w:pPr>
+              <w:pStyle w:val="Compact"/>
+              <w:jc w:val="left"/>
+            </w:pPr>
+            <w:r>
+              <w:t xml:space="preserve">Đặc điểm QL</w:t>
+            </w:r>
+          </w:p>
+        </w:tc>
+        <w:tc>
+          <w:tcPr/>
+          <w:p>
+            <w:pPr>
+              <w:pStyle w:val="Compact"/>
+              <w:jc w:val="left"/>
+            </w:pPr>
+            <w:r>
+              <w:t xml:space="preserve">Thể chế (Inst.)</w:t>
+            </w:r>
+          </w:p>
+        </w:tc>
+        <w:tc>
+          <w:tcPr/>
+          <w:p>
+            <w:pPr>
+              <w:pStyle w:val="Compact"/>
+              <w:jc w:val="left"/>
+            </w:pPr>
+            <w:r>
+              <w:t xml:space="preserve">Temporal</w:t>
+            </w:r>
+          </w:p>
+        </w:tc>
+        <w:tc>
+          <w:tcPr/>
+          <w:p>
+            <w:pPr>
+              <w:pStyle w:val="Compact"/>
+              <w:jc w:val="left"/>
+            </w:pPr>
+            <w:r>
+              <w:t xml:space="preserve">Phân nhóm</w:t>
+            </w:r>
+          </w:p>
+        </w:tc>
+        <w:tc>
+          <w:tcPr/>
+          <w:p>
+            <w:pPr>
+              <w:pStyle w:val="Compact"/>
+              <w:jc w:val="left"/>
+            </w:pPr>
+            <w:r>
+              <w:t xml:space="preserve">SIDS</w:t>
+            </w:r>
+          </w:p>
+        </w:tc>
+      </w:tr>
+      <w:tr>
+        <w:tc>
+          <w:tcPr/>
+          <w:p>
+            <w:pPr>
+              <w:pStyle w:val="Compact"/>
+              <w:jc w:val="left"/>
+            </w:pPr>
+            <w:r>
+              <w:t xml:space="preserve">Bausch &amp; Krist (2007)</w:t>
+            </w:r>
+          </w:p>
+        </w:tc>
+        <w:tc>
+          <w:tcPr/>
+          <w:p>
+            <w:pPr>
+              <w:pStyle w:val="Compact"/>
+              <w:jc w:val="left"/>
+            </w:pPr>
+            <w:r>
+              <w:t xml:space="preserve">✗ (không kiểm định hệ thống)</w:t>
+            </w:r>
+          </w:p>
+        </w:tc>
+        <w:tc>
+          <w:tcPr/>
+          <w:p>
+            <w:pPr>
+              <w:pStyle w:val="Compact"/>
+              <w:jc w:val="left"/>
+            </w:pPr>
+            <w:r>
+              <w:t xml:space="preserve">Partial (R&amp;D proxy)</w:t>
+            </w:r>
+          </w:p>
+        </w:tc>
+        <w:tc>
+          <w:tcPr/>
+          <w:p>
+            <w:pPr>
+              <w:pStyle w:val="Compact"/>
+              <w:jc w:val="left"/>
+            </w:pPr>
+            <w:r>
+              <w:t xml:space="preserve">✗</w:t>
+            </w:r>
+          </w:p>
+        </w:tc>
+        <w:tc>
+          <w:tcPr/>
+          <w:p>
+            <w:pPr>
+              <w:pStyle w:val="Compact"/>
+              <w:jc w:val="left"/>
+            </w:pPr>
+            <w:r>
+              <w:t xml:space="preserve">✗</w:t>
+            </w:r>
+          </w:p>
+        </w:tc>
+        <w:tc>
+          <w:tcPr/>
+          <w:p>
+            <w:pPr>
+              <w:pStyle w:val="Compact"/>
+              <w:jc w:val="left"/>
+            </w:pPr>
+            <w:r>
+              <w:t xml:space="preserve">✓ (GDP, văn hóa)</w:t>
+            </w:r>
+          </w:p>
+        </w:tc>
+        <w:tc>
+          <w:tcPr/>
+          <w:p>
+            <w:pPr>
+              <w:pStyle w:val="Compact"/>
+              <w:jc w:val="left"/>
+            </w:pPr>
+            <w:r>
+              <w:t xml:space="preserve">✗</w:t>
+            </w:r>
+          </w:p>
+        </w:tc>
+        <w:tc>
+          <w:tcPr/>
+          <w:p>
+            <w:pPr>
+              <w:pStyle w:val="Compact"/>
+              <w:jc w:val="left"/>
+            </w:pPr>
+            <w:r>
+              <w:t xml:space="preserve">✗</w:t>
+            </w:r>
+          </w:p>
+        </w:tc>
+        <w:tc>
+          <w:tcPr/>
+          <w:p>
+            <w:pPr>
+              <w:pStyle w:val="Compact"/>
+              <w:jc w:val="left"/>
+            </w:pPr>
+            <w:r>
+              <w:t xml:space="preserve">✗</w:t>
+            </w:r>
+          </w:p>
+        </w:tc>
+      </w:tr>
+      <w:tr>
+        <w:tc>
+          <w:tcPr/>
+          <w:p>
+            <w:pPr>
+              <w:pStyle w:val="Compact"/>
+              <w:jc w:val="left"/>
+            </w:pPr>
+            <w:r>
+              <w:t xml:space="preserve">Kirca et al. (2012)</w:t>
+            </w:r>
+          </w:p>
+        </w:tc>
+        <w:tc>
+          <w:tcPr/>
+          <w:p>
+            <w:pPr>
+              <w:pStyle w:val="Compact"/>
+              <w:jc w:val="left"/>
+            </w:pPr>
+            <w:r>
+              <w:t xml:space="preserve">✗</w:t>
+            </w:r>
+          </w:p>
+        </w:tc>
+        <w:tc>
+          <w:tcPr/>
+          <w:p>
+            <w:pPr>
+              <w:pStyle w:val="Compact"/>
+              <w:jc w:val="left"/>
+            </w:pPr>
+            <w:r>
+              <w:t xml:space="preserve">✓ (R&amp;D proxy)</w:t>
+            </w:r>
+          </w:p>
+        </w:tc>
+        <w:tc>
+          <w:tcPr/>
+          <w:p>
+            <w:pPr>
+              <w:pStyle w:val="Compact"/>
+              <w:jc w:val="left"/>
+            </w:pPr>
+            <w:r>
+              <w:t xml:space="preserve">✗</w:t>
+            </w:r>
+          </w:p>
+        </w:tc>
+        <w:tc>
+          <w:tcPr/>
+          <w:p>
+            <w:pPr>
+              <w:pStyle w:val="Compact"/>
+              <w:jc w:val="left"/>
+            </w:pPr>
+            <w:r>
+              <w:t xml:space="preserve">✗</w:t>
+            </w:r>
+          </w:p>
+        </w:tc>
+        <w:tc>
+          <w:tcPr/>
+          <w:p>
+            <w:pPr>
+              <w:pStyle w:val="Compact"/>
+              <w:jc w:val="left"/>
+            </w:pPr>
+            <w:r>
+              <w:t xml:space="preserve">Partial</w:t>
+            </w:r>
+          </w:p>
+        </w:tc>
+        <w:tc>
+          <w:tcPr/>
+          <w:p>
+            <w:pPr>
+              <w:pStyle w:val="Compact"/>
+              <w:jc w:val="left"/>
+            </w:pPr>
+            <w:r>
+              <w:t xml:space="preserve">✗</w:t>
+            </w:r>
+          </w:p>
+        </w:tc>
+        <w:tc>
+          <w:tcPr/>
+          <w:p>
+            <w:pPr>
+              <w:pStyle w:val="Compact"/>
+              <w:jc w:val="left"/>
+            </w:pPr>
+            <w:r>
+              <w:t xml:space="preserve">Partial (ngành)</w:t>
+            </w:r>
+          </w:p>
+        </w:tc>
+        <w:tc>
+          <w:tcPr/>
+          <w:p>
+            <w:pPr>
+              <w:pStyle w:val="Compact"/>
+              <w:jc w:val="left"/>
+            </w:pPr>
+            <w:r>
+              <w:t xml:space="preserve">✗</w:t>
+            </w:r>
+          </w:p>
+        </w:tc>
+      </w:tr>
+      <w:tr>
+        <w:tc>
+          <w:tcPr/>
+          <w:p>
+            <w:pPr>
+              <w:pStyle w:val="Compact"/>
+              <w:jc w:val="left"/>
+            </w:pPr>
+            <w:r>
+              <w:t xml:space="preserve">Marano et al. (2016)</w:t>
+            </w:r>
+          </w:p>
+        </w:tc>
+        <w:tc>
+          <w:tcPr/>
+          <w:p>
+            <w:pPr>
+              <w:pStyle w:val="Compact"/>
+              <w:jc w:val="left"/>
+            </w:pPr>
+            <w:r>
+              <w:t xml:space="preserve">✓ (TP ±15% FSTS)</w:t>
+            </w:r>
+          </w:p>
+        </w:tc>
+        <w:tc>
+          <w:tcPr/>
+          <w:p>
+            <w:pPr>
+              <w:pStyle w:val="Compact"/>
+              <w:jc w:val="left"/>
+            </w:pPr>
+            <w:r>
+              <w:t xml:space="preserve">✗</w:t>
+            </w:r>
+          </w:p>
+        </w:tc>
+        <w:tc>
+          <w:tcPr/>
+          <w:p>
+            <w:pPr>
+              <w:pStyle w:val="Compact"/>
+              <w:jc w:val="left"/>
+            </w:pPr>
+            <w:r>
+              <w:t xml:space="preserve">✗</w:t>
+            </w:r>
+          </w:p>
+        </w:tc>
+        <w:tc>
+          <w:tcPr/>
+          <w:p>
+            <w:pPr>
+              <w:pStyle w:val="Compact"/>
+              <w:jc w:val="left"/>
+            </w:pPr>
+            <w:r>
+              <w:t xml:space="preserve">✗</w:t>
+            </w:r>
+          </w:p>
+        </w:tc>
+        <w:tc>
+          <w:tcPr/>
+          <w:p>
+            <w:pPr>
+              <w:pStyle w:val="Compact"/>
+              <w:jc w:val="left"/>
+            </w:pPr>
+            <w:r>
+              <w:t xml:space="preserve">✓ (cốt lõi)</w:t>
+            </w:r>
+          </w:p>
+        </w:tc>
+        <w:tc>
+          <w:tcPr/>
+          <w:p>
+            <w:pPr>
+              <w:pStyle w:val="Compact"/>
+              <w:jc w:val="left"/>
+            </w:pPr>
+            <w:r>
+              <w:t xml:space="preserve">✗</w:t>
+            </w:r>
+          </w:p>
+        </w:tc>
+        <w:tc>
+          <w:tcPr/>
+          <w:p>
+            <w:pPr>
+              <w:pStyle w:val="Compact"/>
+              <w:jc w:val="left"/>
+            </w:pPr>
+            <w:r>
+              <w:t xml:space="preserve">✗</w:t>
+            </w:r>
+          </w:p>
+        </w:tc>
+        <w:tc>
+          <w:tcPr/>
+          <w:p>
+            <w:pPr>
+              <w:pStyle w:val="Compact"/>
+              <w:jc w:val="left"/>
+            </w:pPr>
+            <w:r>
+              <w:t xml:space="preserve">✗</w:t>
+            </w:r>
+          </w:p>
+        </w:tc>
+      </w:tr>
+      <w:tr>
+        <w:tc>
+          <w:tcPr/>
+          <w:p>
+            <w:pPr>
+              <w:pStyle w:val="Compact"/>
+              <w:jc w:val="left"/>
+            </w:pPr>
+            <w:r>
+              <w:t xml:space="preserve">Banalieva &amp; Dhanaraj (2019)</w:t>
+            </w:r>
+          </w:p>
+        </w:tc>
+        <w:tc>
+          <w:tcPr/>
+          <w:p>
+            <w:pPr>
+              <w:pStyle w:val="Compact"/>
+              <w:jc w:val="left"/>
+            </w:pPr>
+            <w:r>
+              <w:t xml:space="preserve">Partial</w:t>
+            </w:r>
+          </w:p>
+        </w:tc>
+        <w:tc>
+          <w:tcPr/>
+          <w:p>
+            <w:pPr>
+              <w:pStyle w:val="Compact"/>
+              <w:jc w:val="left"/>
+            </w:pPr>
+            <w:r>
+              <w:t xml:space="preserve">✗</w:t>
+            </w:r>
+          </w:p>
+        </w:tc>
+        <w:tc>
+          <w:tcPr/>
+          <w:p>
+            <w:pPr>
+              <w:pStyle w:val="Compact"/>
+              <w:jc w:val="left"/>
+            </w:pPr>
+            <w:r>
+              <w:t xml:space="preserve">✓ (cốt lõi)</w:t>
+            </w:r>
+          </w:p>
+        </w:tc>
+        <w:tc>
+          <w:tcPr/>
+          <w:p>
+            <w:pPr>
+              <w:pStyle w:val="Compact"/>
+              <w:jc w:val="left"/>
+            </w:pPr>
+            <w:r>
+              <w:t xml:space="preserve">✗</w:t>
+            </w:r>
+          </w:p>
+        </w:tc>
+        <w:tc>
+          <w:tcPr/>
+          <w:p>
+            <w:pPr>
+              <w:pStyle w:val="Compact"/>
+              <w:jc w:val="left"/>
+            </w:pPr>
+            <w:r>
+              <w:t xml:space="preserve">Partial</w:t>
+            </w:r>
+          </w:p>
+        </w:tc>
+        <w:tc>
+          <w:tcPr/>
+          <w:p>
+            <w:pPr>
+              <w:pStyle w:val="Compact"/>
+              <w:jc w:val="left"/>
+            </w:pPr>
+            <w:r>
+              <w:t xml:space="preserve">Partial</w:t>
+            </w:r>
+          </w:p>
+        </w:tc>
+        <w:tc>
+          <w:tcPr/>
+          <w:p>
+            <w:pPr>
+              <w:pStyle w:val="Compact"/>
+              <w:jc w:val="left"/>
+            </w:pPr>
+            <w:r>
+              <w:t xml:space="preserve">✗</w:t>
+            </w:r>
+          </w:p>
+        </w:tc>
+        <w:tc>
+          <w:tcPr/>
+          <w:p>
+            <w:pPr>
+              <w:pStyle w:val="Compact"/>
+              <w:jc w:val="left"/>
+            </w:pPr>
+            <w:r>
+              <w:t xml:space="preserve">✗</w:t>
+            </w:r>
+          </w:p>
+        </w:tc>
+      </w:tr>
+      <w:tr>
+        <w:tc>
+          <w:tcPr/>
+          <w:p>
+            <w:pPr>
+              <w:pStyle w:val="Compact"/>
+              <w:jc w:val="left"/>
+            </w:pPr>
+            <w:r>
+              <w:t xml:space="preserve">Wu, Wood &amp; Khan (2022)</w:t>
+            </w:r>
+          </w:p>
+        </w:tc>
+        <w:tc>
+          <w:tcPr/>
+          <w:p>
+            <w:pPr>
+              <w:pStyle w:val="Compact"/>
+              <w:jc w:val="left"/>
+            </w:pPr>
+            <w:r>
+              <w:t xml:space="preserve">✓ (TP thấp hơn EMNE)</w:t>
+            </w:r>
+          </w:p>
+        </w:tc>
+        <w:tc>
+          <w:tcPr/>
+          <w:p>
+            <w:pPr>
+              <w:pStyle w:val="Compact"/>
+              <w:jc w:val="left"/>
+            </w:pPr>
+            <w:r>
+              <w:t xml:space="preserve">Partial (absorptive capacity)</w:t>
+            </w:r>
+          </w:p>
+        </w:tc>
+        <w:tc>
+          <w:tcPr/>
+          <w:p>
+            <w:pPr>
+              <w:pStyle w:val="Compact"/>
+              <w:jc w:val="left"/>
+            </w:pPr>
+            <w:r>
+              <w:t xml:space="preserve">✗</w:t>
+            </w:r>
+          </w:p>
+        </w:tc>
+        <w:tc>
+          <w:tcPr/>
+          <w:p>
+            <w:pPr>
+              <w:pStyle w:val="Compact"/>
+              <w:jc w:val="left"/>
+            </w:pPr>
+            <w:r>
+              <w:t xml:space="preserve">✗</w:t>
+            </w:r>
+          </w:p>
+        </w:tc>
+        <w:tc>
+          <w:tcPr/>
+          <w:p>
+            <w:pPr>
+              <w:pStyle w:val="Compact"/>
+              <w:jc w:val="left"/>
+            </w:pPr>
+            <w:r>
+              <w:t xml:space="preserve">✓</w:t>
+            </w:r>
+          </w:p>
+        </w:tc>
+        <w:tc>
+          <w:tcPr/>
+          <w:p>
+            <w:pPr>
+              <w:pStyle w:val="Compact"/>
+              <w:jc w:val="left"/>
+            </w:pPr>
+            <w:r>
+              <w:t xml:space="preserve">✓ (20 năm)</w:t>
+            </w:r>
+          </w:p>
+        </w:tc>
+        <w:tc>
+          <w:tcPr/>
+          <w:p>
+            <w:pPr>
+              <w:pStyle w:val="Compact"/>
+              <w:jc w:val="left"/>
+            </w:pPr>
+            <w:r>
+              <w:t xml:space="preserve">✓ (EMNE/DMNE)</w:t>
+            </w:r>
+          </w:p>
+        </w:tc>
+        <w:tc>
+          <w:tcPr/>
+          <w:p>
+            <w:pPr>
+              <w:pStyle w:val="Compact"/>
+              <w:jc w:val="left"/>
+            </w:pPr>
+            <w:r>
+              <w:t xml:space="preserve">✗</w:t>
+            </w:r>
+          </w:p>
+        </w:tc>
+      </w:tr>
+      <w:tr>
+        <w:tc>
+          <w:tcPr/>
+          <w:p>
+            <w:pPr>
+              <w:pStyle w:val="Compact"/>
+              <w:jc w:val="left"/>
+            </w:pPr>
+            <w:r>
+              <w:t xml:space="preserve">Đỗ &amp; Phan (2026 — JFAR)</w:t>
+            </w:r>
+          </w:p>
+        </w:tc>
+        <w:tc>
+          <w:tcPr/>
+          <w:p>
+            <w:pPr>
+              <w:pStyle w:val="Compact"/>
+              <w:jc w:val="left"/>
+            </w:pPr>
+            <w:r>
+              <w:t xml:space="preserve">✓ (bậc ba / S-curve)</w:t>
+            </w:r>
+          </w:p>
+        </w:tc>
+        <w:tc>
+          <w:tcPr/>
+          <w:p>
+            <w:pPr>
+              <w:pStyle w:val="Compact"/>
+              <w:jc w:val="left"/>
+            </w:pPr>
+            <w:r>
+              <w:t xml:space="preserve">–</w:t>
+            </w:r>
+          </w:p>
+        </w:tc>
+        <w:tc>
+          <w:tcPr/>
+          <w:p>
+            <w:pPr>
+              <w:pStyle w:val="Compact"/>
+              <w:jc w:val="left"/>
+            </w:pPr>
+            <w:r>
+              <w:t xml:space="preserve">–</w:t>
+            </w:r>
+          </w:p>
+        </w:tc>
+        <w:tc>
+          <w:tcPr/>
+          <w:p>
+            <w:pPr>
+              <w:pStyle w:val="Compact"/>
+              <w:jc w:val="left"/>
+            </w:pPr>
+            <w:r>
+              <w:t xml:space="preserve">–</w:t>
+            </w:r>
+          </w:p>
+        </w:tc>
+        <w:tc>
+          <w:tcPr/>
+          <w:p>
+            <w:pPr>
+              <w:pStyle w:val="Compact"/>
+              <w:jc w:val="left"/>
+            </w:pPr>
+            <w:r>
+              <w:t xml:space="preserve">–</w:t>
+            </w:r>
+          </w:p>
+        </w:tc>
+        <w:tc>
+          <w:tcPr/>
+          <w:p>
+            <w:pPr>
+              <w:pStyle w:val="Compact"/>
+              <w:jc w:val="left"/>
+            </w:pPr>
+            <w:r>
+              <w:t xml:space="preserve">–</w:t>
+            </w:r>
+          </w:p>
+        </w:tc>
+        <w:tc>
+          <w:tcPr/>
+          <w:p>
+            <w:pPr>
+              <w:pStyle w:val="Compact"/>
+              <w:jc w:val="left"/>
+            </w:pPr>
+            <w:r>
+              <w:t xml:space="preserve">–</w:t>
+            </w:r>
+          </w:p>
+        </w:tc>
+        <w:tc>
+          <w:tcPr/>
+          <w:p>
+            <w:pPr>
+              <w:pStyle w:val="Compact"/>
+              <w:jc w:val="left"/>
+            </w:pPr>
+            <w:r>
+              <w:t xml:space="preserve">–</w:t>
+            </w:r>
+          </w:p>
+        </w:tc>
+      </w:tr>
+      <w:tr>
+        <w:tc>
+          <w:tcPr/>
+          <w:p>
+            <w:pPr>
+              <w:pStyle w:val="Compact"/>
+              <w:jc w:val="left"/>
+            </w:pPr>
+            <w:r>
+              <w:rPr>
+                <w:bCs/>
+                <w:b/>
+              </w:rPr>
+              <w:t xml:space="preserve">CĐ2 (luận án này)</w:t>
+            </w:r>
+          </w:p>
+        </w:tc>
+        <w:tc>
+          <w:tcPr/>
+          <w:p>
+            <w:pPr>
+              <w:pStyle w:val="Compact"/>
+              <w:jc w:val="left"/>
+            </w:pPr>
+            <w:r>
+              <w:rPr>
+                <w:bCs/>
+                <w:b/>
+              </w:rPr>
+              <w:t xml:space="preserve">✓ (H1: chữ U ngược + S-curve)</w:t>
+            </w:r>
+          </w:p>
+        </w:tc>
+        <w:tc>
+          <w:tcPr/>
+          <w:p>
+            <w:pPr>
+              <w:pStyle w:val="Compact"/>
+              <w:jc w:val="left"/>
+            </w:pPr>
+            <w:r>
+              <w:rPr>
+                <w:bCs/>
+                <w:b/>
+              </w:rPr>
+              <w:t xml:space="preserve">✓ (H2: nhân quả IV)</w:t>
+            </w:r>
+          </w:p>
+        </w:tc>
+        <w:tc>
+          <w:tcPr/>
+          <w:p>
+            <w:pPr>
+              <w:pStyle w:val="Compact"/>
+              <w:jc w:val="left"/>
+            </w:pPr>
+            <w:r>
+              <w:rPr>
+                <w:bCs/>
+                <w:b/>
+              </w:rPr>
+              <w:t xml:space="preserve">✓ (H3: CDCM phân biệt)</w:t>
+            </w:r>
+          </w:p>
+        </w:tc>
+        <w:tc>
+          <w:tcPr/>
+          <w:p>
+            <w:pPr>
+              <w:pStyle w:val="Compact"/>
+              <w:jc w:val="left"/>
+            </w:pPr>
+            <w:r>
+              <w:rPr>
+                <w:bCs/>
+                <w:b/>
+              </w:rPr>
+              <w:t xml:space="preserve">✓ (H4a–H4c)</w:t>
+            </w:r>
+          </w:p>
+        </w:tc>
+        <w:tc>
+          <w:tcPr/>
+          <w:p>
+            <w:pPr>
+              <w:pStyle w:val="Compact"/>
+              <w:jc w:val="left"/>
+            </w:pPr>
+            <w:r>
+              <w:rPr>
+                <w:bCs/>
+                <w:b/>
+              </w:rPr>
+              <w:t xml:space="preserve">✓ (H5: ICRV 6 nhóm)</w:t>
+            </w:r>
+          </w:p>
+        </w:tc>
+        <w:tc>
+          <w:tcPr/>
+          <w:p>
+            <w:pPr>
+              <w:pStyle w:val="Compact"/>
+              <w:jc w:val="left"/>
+            </w:pPr>
+            <w:r>
+              <w:rPr>
+                <w:bCs/>
+                <w:b/>
+              </w:rPr>
+              <w:t xml:space="preserve">✓ (H6: 3 giai đoạn)</w:t>
+            </w:r>
+          </w:p>
+        </w:tc>
+        <w:tc>
+          <w:tcPr/>
+          <w:p>
+            <w:pPr>
+              <w:pStyle w:val="Compact"/>
+              <w:jc w:val="left"/>
+            </w:pPr>
+            <w:r>
+              <w:rPr>
+                <w:bCs/>
+                <w:b/>
+              </w:rPr>
+              <w:t xml:space="preserve">✓ (Nhóm I→VI)</w:t>
+            </w:r>
+          </w:p>
+        </w:tc>
+        <w:tc>
+          <w:tcPr/>
+          <w:p>
+            <w:pPr>
+              <w:pStyle w:val="Compact"/>
+              <w:jc w:val="left"/>
+            </w:pPr>
+            <w:r>
+              <w:rPr>
+                <w:bCs/>
+                <w:b/>
+              </w:rPr>
+              <w:t xml:space="preserve">✓ (Nhóm VI FIP)</w:t>
+            </w:r>
+          </w:p>
+        </w:tc>
+      </w:tr>
+    </w:tbl>
+    <w:p>
+      <w:pPr>
+        <w:pStyle w:val="BodyText"/>
+      </w:pPr>
+      <w:r>
+        <w:rPr>
+          <w:iCs/>
+          <w:i/>
+        </w:rPr>
+        <w:t xml:space="preserve">Ghi chú: ✓ = kiểm định chính thức hoặc đóng góp lý thuyết rõ ràng; Partial = đề cập nhưng không phải trọng tâm; ✗ = không bao gồm; – = không áp dụng. FIP = Forced Internationalization Penalty. TCI và DAI được phân tách theo tiêu chí CDCM; P2 JFAR không kiểm định CDCM (pre-framework) nhưng cung cấp bằng chứng phi tuyến cubic tiền thân.</w:t>
       </w:r>
     </w:p>
     <w:bookmarkEnd w:id="35"/>
@@ -3119,7 +4085,7 @@
         <w:pStyle w:val="BodyText"/>
       </w:pPr>
       <w:r>
-        <w:t xml:space="preserve">Vai trò trong mô hình đề xuất: Upper Echelons cung cấp lý thuyết cho H4 (đặc điểm nhà quản trị điều tiết). Doanh nghiệp có nhà quản trị kinh nghiệm cao, học vấn cao, kinh nghiệm quốc tế chuyển hóa quốc tế hóa thành hiệu quả tốt hơn thông qua hai kênh: chất lượng quyết định (tránh quốc tế hóa sớm) và năng lực điều phối (quản lý phức tạp đa thị trường).</w:t>
+        <w:t xml:space="preserve">Vai trò trong mô hình đề xuất: Upper Echelons cung cấp lý thuyết cho H4a–H4c (đặc điểm nhà quản trị điều tiết). Doanh nghiệp có nhà quản trị kinh nghiệm cao (H4a), học vấn cao (H4b) chuyển hóa quốc tế hóa thành hiệu quả tốt hơn thông qua hai kênh: chất lượng quyết định (tránh quốc tế hóa sớm) và năng lực điều phối (quản lý phức tạp đa thị trường). Giới tính nhà quản trị (H4c) được kiểm định khám phá không có dấu tiên nghiệm.</w:t>
       </w:r>
     </w:p>
     <w:bookmarkEnd w:id="41"/>
@@ -3511,19 +4477,19 @@
               <w:jc w:val="left"/>
             </w:pPr>
             <w:r>
-              <w:t xml:space="preserve">H3 DAI nguồn lực mở rộng tình huống</w:t>
-            </w:r>
-          </w:p>
-        </w:tc>
-        <w:tc>
-          <w:tcPr/>
-          <w:p>
-            <w:pPr>
-              <w:pStyle w:val="Compact"/>
-              <w:jc w:val="left"/>
-            </w:pPr>
-            <w:r>
-              <w:t xml:space="preserve">P4: DAI×FSTS² = +3,119; P3: IV null (β = 0,018)</w:t>
+              <w:t xml:space="preserve">H3a–H3b DAI phụ thuộc chế độ thể chế</w:t>
+            </w:r>
+          </w:p>
+        </w:tc>
+        <w:tc>
+          <w:tcPr/>
+          <w:p>
+            <w:pPr>
+              <w:pStyle w:val="Compact"/>
+              <w:jc w:val="left"/>
+            </w:pPr>
+            <w:r>
+              <w:t xml:space="preserve">P4: DAI×FSTS² = +3,119 (Nhóm I); P3: IV null (β = 0,018, Nhóm IV)</w:t>
             </w:r>
           </w:p>
         </w:tc>
@@ -3585,7 +4551,7 @@
               <w:jc w:val="left"/>
             </w:pPr>
             <w:r>
-              <w:t xml:space="preserve">H4 Quản trị điều tiết</w:t>
+              <w:t xml:space="preserve">H4a–H4c Quản trị điều tiết</w:t>
             </w:r>
           </w:p>
         </w:tc>
@@ -3929,7 +4895,7 @@
         <w:pStyle w:val="BodyText"/>
       </w:pPr>
       <w:r>
-        <w:t xml:space="preserve">Mũi tên liền nét biểu thị tác động trực tiếp (H1: quan hệ phi tuyến I→P). Mũi tên đứt nét biểu thị tác động điều tiết. H1–H6 tương ứng với các giả thuyết phát triển trong §2.3.4. Biến phụ thuộc (ln(Labour Productivity)) được xác định duy nhất ở cực phải. Biến độc lập (FSTS, FSTS²_c, FSTS³_c) ở cực trái. Năm nhóm biến điều tiết phân theo hai cấp: cấp doanh nghiệp (TCI — H2, DAI — H3, đặc điểm nhà quản trị — H4) và cấp quốc gia (ICRV regime — H5, giai đoạn thời gian — H6). Biến kiểm soát (ln(emp), firm_age, foreign_own, sector/country/year FE) được đưa vào mô hình thực nghiệm nhưng không hiển thị trong sơ đồ để đơn giản hóa trình bày. Mỗi tầng lý thuyết cung cấp cơ chế nhân quả riêng biệt: Uppsala giải thích đường cong I→P; RBV biện minh cho H2; Foundational Digital Adoption Framework (CDCM) biện minh cho H3; Upper Echelons biện minh cho H4; Institutional Theory biện minh cho H5. Bằng chứng neo đậu từ P3 Việt Nam, P4 Singapore và P5 Trung Quốc xác nhận tính khả nghiệm trước khi áp dụng cho toàn pool 101.185 doanh nghiệp.</w:t>
+        <w:t xml:space="preserve">Mũi tên liền nét biểu thị tác động trực tiếp (H1: quan hệ phi tuyến I→P). Mũi tên đứt nét biểu thị tác động điều tiết. H1–H6 tương ứng với các giả thuyết phát triển trong §2.3.4. Biến phụ thuộc (ln(Labour Productivity)) được xác định duy nhất ở cực phải. Biến độc lập (FSTS, FSTS²_c, FSTS³_c) ở cực trái. Năm nhóm biến điều tiết phân theo hai cấp: cấp doanh nghiệp (TCI — H2, DAI — H3, đặc điểm nhà quản trị — H4a–H4c) và cấp quốc gia (ICRV regime — H5, giai đoạn thời gian — H6). Biến kiểm soát (ln(emp), firm_age, foreign_own, sector/country/year FE) được đưa vào mô hình thực nghiệm nhưng không hiển thị trong sơ đồ để đơn giản hóa trình bày. Mỗi tầng lý thuyết cung cấp cơ chế nhân quả riêng biệt: Uppsala giải thích đường cong I→P; RBV biện minh cho H2; Foundational Digital Adoption Framework (CDCM) biện minh cho H3; Upper Echelons biện minh cho H4; Institutional Theory biện minh cho H5. Bằng chứng neo đậu từ P3 Việt Nam, P4 Singapore và P5 Trung Quốc xác nhận tính khả nghiệm trước khi áp dụng cho toàn pool 101.185 doanh nghiệp.</w:t>
       </w:r>
     </w:p>
     <w:bookmarkEnd w:id="48"/>
@@ -4790,19 +5756,19 @@
               <w:jc w:val="left"/>
             </w:pPr>
             <w:r>
-              <w:t xml:space="preserve">β &gt; 0 (H4)</w:t>
-            </w:r>
-          </w:p>
-        </w:tc>
-        <w:tc>
-          <w:tcPr/>
-          <w:p>
-            <w:pPr>
-              <w:pStyle w:val="Compact"/>
-              <w:jc w:val="left"/>
-            </w:pPr>
-            <w:r>
-              <w:t xml:space="preserve">H4</w:t>
+              <w:t xml:space="preserve">β &gt; 0 (δ_exp &gt; 0)</w:t>
+            </w:r>
+          </w:p>
+        </w:tc>
+        <w:tc>
+          <w:tcPr/>
+          <w:p>
+            <w:pPr>
+              <w:pStyle w:val="Compact"/>
+              <w:jc w:val="left"/>
+            </w:pPr>
+            <w:r>
+              <w:t xml:space="preserve">H4a</w:t>
             </w:r>
           </w:p>
         </w:tc>
@@ -4816,67 +5782,67 @@
               <w:jc w:val="left"/>
             </w:pPr>
             <w:r>
-              <w:t xml:space="preserve">gender_manager</w:t>
-            </w:r>
-          </w:p>
-        </w:tc>
-        <w:tc>
-          <w:tcPr/>
-          <w:p>
-            <w:pPr>
-              <w:pStyle w:val="Compact"/>
-              <w:jc w:val="left"/>
-            </w:pPr>
-            <w:r>
-              <w:t xml:space="preserve">Giới tính QL</w:t>
-            </w:r>
-          </w:p>
-        </w:tc>
-        <w:tc>
-          <w:tcPr/>
-          <w:p>
-            <w:pPr>
-              <w:pStyle w:val="Compact"/>
-              <w:jc w:val="left"/>
-            </w:pPr>
-            <w:r>
-              <w:t xml:space="preserve">b7</w:t>
-            </w:r>
-          </w:p>
-        </w:tc>
-        <w:tc>
-          <w:tcPr/>
-          <w:p>
-            <w:pPr>
-              <w:pStyle w:val="Compact"/>
-              <w:jc w:val="left"/>
-            </w:pPr>
-            <w:r>
-              <w:t xml:space="preserve">binary female=1</w:t>
-            </w:r>
-          </w:p>
-        </w:tc>
-        <w:tc>
-          <w:tcPr/>
-          <w:p>
-            <w:pPr>
-              <w:pStyle w:val="Compact"/>
-              <w:jc w:val="left"/>
-            </w:pPr>
-            <w:r>
-              <w:t xml:space="preserve">Khám phá</w:t>
-            </w:r>
-          </w:p>
-        </w:tc>
-        <w:tc>
-          <w:tcPr/>
-          <w:p>
-            <w:pPr>
-              <w:pStyle w:val="Compact"/>
-              <w:jc w:val="left"/>
-            </w:pPr>
-            <w:r>
-              <w:t xml:space="preserve">H4</w:t>
+              <w:t xml:space="preserve">educ_manager</w:t>
+            </w:r>
+          </w:p>
+        </w:tc>
+        <w:tc>
+          <w:tcPr/>
+          <w:p>
+            <w:pPr>
+              <w:pStyle w:val="Compact"/>
+              <w:jc w:val="left"/>
+            </w:pPr>
+            <w:r>
+              <w:t xml:space="preserve">Học vấn QL</w:t>
+            </w:r>
+          </w:p>
+        </w:tc>
+        <w:tc>
+          <w:tcPr/>
+          <w:p>
+            <w:pPr>
+              <w:pStyle w:val="Compact"/>
+              <w:jc w:val="left"/>
+            </w:pPr>
+            <w:r>
+              <w:t xml:space="preserve">b7a</w:t>
+            </w:r>
+          </w:p>
+        </w:tc>
+        <w:tc>
+          <w:tcPr/>
+          <w:p>
+            <w:pPr>
+              <w:pStyle w:val="Compact"/>
+              <w:jc w:val="left"/>
+            </w:pPr>
+            <w:r>
+              <w:t xml:space="preserve">thứ tự</w:t>
+            </w:r>
+          </w:p>
+        </w:tc>
+        <w:tc>
+          <w:tcPr/>
+          <w:p>
+            <w:pPr>
+              <w:pStyle w:val="Compact"/>
+              <w:jc w:val="left"/>
+            </w:pPr>
+            <w:r>
+              <w:t xml:space="preserve">β &gt; 0 (δ_educ &gt; 0)</w:t>
+            </w:r>
+          </w:p>
+        </w:tc>
+        <w:tc>
+          <w:tcPr/>
+          <w:p>
+            <w:pPr>
+              <w:pStyle w:val="Compact"/>
+              <w:jc w:val="left"/>
+            </w:pPr>
+            <w:r>
+              <w:t xml:space="preserve">H4b</w:t>
             </w:r>
           </w:p>
         </w:tc>
@@ -4890,67 +5856,67 @@
               <w:jc w:val="left"/>
             </w:pPr>
             <w:r>
-              <w:t xml:space="preserve">educ_manager</w:t>
-            </w:r>
-          </w:p>
-        </w:tc>
-        <w:tc>
-          <w:tcPr/>
-          <w:p>
-            <w:pPr>
-              <w:pStyle w:val="Compact"/>
-              <w:jc w:val="left"/>
-            </w:pPr>
-            <w:r>
-              <w:t xml:space="preserve">Học vấn QL</w:t>
-            </w:r>
-          </w:p>
-        </w:tc>
-        <w:tc>
-          <w:tcPr/>
-          <w:p>
-            <w:pPr>
-              <w:pStyle w:val="Compact"/>
-              <w:jc w:val="left"/>
-            </w:pPr>
-            <w:r>
-              <w:t xml:space="preserve">b7a</w:t>
-            </w:r>
-          </w:p>
-        </w:tc>
-        <w:tc>
-          <w:tcPr/>
-          <w:p>
-            <w:pPr>
-              <w:pStyle w:val="Compact"/>
-              <w:jc w:val="left"/>
-            </w:pPr>
-            <w:r>
-              <w:t xml:space="preserve">thứ tự</w:t>
-            </w:r>
-          </w:p>
-        </w:tc>
-        <w:tc>
-          <w:tcPr/>
-          <w:p>
-            <w:pPr>
-              <w:pStyle w:val="Compact"/>
-              <w:jc w:val="left"/>
-            </w:pPr>
-            <w:r>
-              <w:t xml:space="preserve">β &gt; 0</w:t>
-            </w:r>
-          </w:p>
-        </w:tc>
-        <w:tc>
-          <w:tcPr/>
-          <w:p>
-            <w:pPr>
-              <w:pStyle w:val="Compact"/>
-              <w:jc w:val="left"/>
-            </w:pPr>
-            <w:r>
-              <w:t xml:space="preserve">H4</w:t>
+              <w:t xml:space="preserve">gender_manager</w:t>
+            </w:r>
+          </w:p>
+        </w:tc>
+        <w:tc>
+          <w:tcPr/>
+          <w:p>
+            <w:pPr>
+              <w:pStyle w:val="Compact"/>
+              <w:jc w:val="left"/>
+            </w:pPr>
+            <w:r>
+              <w:t xml:space="preserve">Giới tính QL</w:t>
+            </w:r>
+          </w:p>
+        </w:tc>
+        <w:tc>
+          <w:tcPr/>
+          <w:p>
+            <w:pPr>
+              <w:pStyle w:val="Compact"/>
+              <w:jc w:val="left"/>
+            </w:pPr>
+            <w:r>
+              <w:t xml:space="preserve">b7</w:t>
+            </w:r>
+          </w:p>
+        </w:tc>
+        <w:tc>
+          <w:tcPr/>
+          <w:p>
+            <w:pPr>
+              <w:pStyle w:val="Compact"/>
+              <w:jc w:val="left"/>
+            </w:pPr>
+            <w:r>
+              <w:t xml:space="preserve">binary female=1</w:t>
+            </w:r>
+          </w:p>
+        </w:tc>
+        <w:tc>
+          <w:tcPr/>
+          <w:p>
+            <w:pPr>
+              <w:pStyle w:val="Compact"/>
+              <w:jc w:val="left"/>
+            </w:pPr>
+            <w:r>
+              <w:t xml:space="preserve">Exploratory, two-sided</w:t>
+            </w:r>
+          </w:p>
+        </w:tc>
+        <w:tc>
+          <w:tcPr/>
+          <w:p>
+            <w:pPr>
+              <w:pStyle w:val="Compact"/>
+              <w:jc w:val="left"/>
+            </w:pPr>
+            <w:r>
+              <w:t xml:space="preserve">H4c</w:t>
             </w:r>
           </w:p>
         </w:tc>
@@ -5367,7 +6333,7 @@
         <w:pStyle w:val="BodyText"/>
       </w:pPr>
       <w:r>
-        <w:t xml:space="preserve">H1–H3 và H5 là xác nhận (dấu rõ, ≥2 bằng chứng neo đậu từ P3/P4/P5). H4 và H6 là hỗn hợp xác nhận/khám phá (hướng rõ nhưng magnitude khám phá).</w:t>
+        <w:t xml:space="preserve">H1–H3 và H5 là xác nhận (dấu rõ, ≥2 bằng chứng neo đậu từ P3/P4/P5). H4a–H4b và H6 là hỗn hợp xác nhận/khám phá (hướng rõ nhưng magnitude khám phá). H4c là hoàn toàn khám phá (two-sided, không có dấu tiên nghiệm).</w:t>
       </w:r>
     </w:p>
     <w:bookmarkEnd w:id="55"/>
@@ -5463,13 +6429,13 @@
       </w:r>
     </w:p>
     <w:bookmarkEnd w:id="57"/>
-    <w:bookmarkStart w:id="58" w:name="h3--dai-điều-tiết-theo-ngữ-cảnh-cdcm"/>
+    <w:bookmarkStart w:id="58" w:name="X0516cda47fb7e119b35b670f6b14c3b43dbbdc7"/>
     <w:p>
       <w:pPr>
         <w:pStyle w:val="Heading5"/>
       </w:pPr>
       <w:r>
-        <w:t xml:space="preserve">H3 — DAI điều tiết theo ngữ cảnh (CDCM)</w:t>
+        <w:t xml:space="preserve">H3a–H3b — DAI điều tiết phụ thuộc chế độ thể chế (CDCM)</w:t>
       </w:r>
     </w:p>
     <w:p>
@@ -5972,17 +6938,77 @@
         <w:pStyle w:val="BodyText"/>
       </w:pPr>
       <w:r>
-        <w:t xml:space="preserve">H3: Digital Adoption Index (DAI) không hoạt động như một phần thưởng năng suất đồng nhất mà như một nguồn lực mở rộng tình huống theo CDCM: tác động của DAI lên ln(LP) phụ thuộc vào chế độ thể chế (ICRV), mức FSTS, và mức độ bão hòa số. Cụ thể: (a) β(FSTS²×DAI) &gt; 0 trong Nhóm I; (b) tác động DAI yếu hoặc phụ thuộc chọn lựa trong Nhóm IV; (c) TCI và DAI là hai cấu trúc phân biệt và không thể thay thế nhau.</w:t>
+        <w:t xml:space="preserve">H3: Mức độ áp dụng số (DAI) có cơ chế điều tiết</w:t>
+      </w:r>
+      <w:r>
+        <w:t xml:space="preserve"> </w:t>
+      </w:r>
+      <w:r>
+        <w:rPr>
+          <w:bCs/>
+          <w:b/>
+        </w:rPr>
+        <w:t xml:space="preserve">phụ thuộc chế độ thể chế</w:t>
+      </w:r>
+      <w:r>
+        <w:t xml:space="preserve"> </w:t>
+      </w:r>
+      <w:r>
+        <w:t xml:space="preserve">trong quan hệ I→P. DAI không hoạt động như một phần thưởng năng suất đồng nhất mà như một nguồn lực mở rộng tình huống theo CDCM, với hướng và cường độ khác nhau rõ ràng giữa Emerging/Frontier và Advanced. Hai sub-hypothesis phân biệt dấu kỳ vọng:</w:t>
+      </w:r>
+    </w:p>
+    <w:p>
+      <w:pPr>
+        <w:pStyle w:val="BodyText"/>
+      </w:pPr>
+      <w:r>
+        <w:rPr>
+          <w:bCs/>
+          <w:b/>
+        </w:rPr>
+        <w:t xml:space="preserve">H3a</w:t>
+      </w:r>
+      <w:r>
+        <w:t xml:space="preserve"> </w:t>
+      </w:r>
+      <w:r>
+        <w:t xml:space="preserve">(Emerging và Frontier — Nhóm III–V): Trong các nền kinh tế đang nổi và cận biên, DAI điều tiết tích cực quan hệ FSTS → ln(LP): β(FSTS×DAI) &gt; 0 và/hoặc β(FSTS²×DAI) &gt; 0. Cơ chế: DAI giảm khoảng cách tâm lý, mở rộng tiếp cận thị trường ảo, và tăng năng lực điều phối ở những bối cảnh mà website presence vẫn là tín hiệu phân biệt (chưa bão hòa).</w:t>
+      </w:r>
+    </w:p>
+    <w:p>
+      <w:pPr>
+        <w:pStyle w:val="BodyText"/>
+      </w:pPr>
+      <w:r>
+        <w:rPr>
+          <w:bCs/>
+          <w:b/>
+        </w:rPr>
+        <w:t xml:space="preserve">H3b</w:t>
+      </w:r>
+      <w:r>
+        <w:t xml:space="preserve"> </w:t>
+      </w:r>
+      <w:r>
+        <w:t xml:space="preserve">(Advanced — Nhóm I–II): Trong các nền kinh tế tiên tiến, tác động trực tiếp không điều kiện của DAI lên ln(LP) có thể null hoặc âm do bão hòa số và single-component measurement (chỉ website binary — Tier-1 proxy — không phản ánh đầy đủ năng lực số). Tuy nhiên, tác động điều tiết điều kiện β(FSTS²×DAI) vẫn dương ở mức FSTS cao nơi nhu cầu điều phối xuyên biên giới cao (bằng chứng neo đậu: P4 Singapore β(FSTS²×DAI) = +3,119, p = 0,005).</w:t>
+      </w:r>
+    </w:p>
+    <w:p>
+      <w:pPr>
+        <w:pStyle w:val="BodyText"/>
+      </w:pPr>
+      <w:r>
+        <w:t xml:space="preserve">TCI và DAI là hai cấu trúc phân biệt và không thể thay thế nhau trong cả hai sub-hypothesis (CDCM distinctiveness hypothesis — H3c: β(TCI) ≠ β(DAI) và hai cấu trúc thỏa mãn tiêu chí discriminant validity).</w:t>
       </w:r>
     </w:p>
     <w:bookmarkEnd w:id="58"/>
-    <w:bookmarkStart w:id="59" w:name="h4--đặc-điểm-nhà-quản-trị-điều-tiết"/>
+    <w:bookmarkStart w:id="59" w:name="h4ah4c--đặc-điểm-nhà-quản-trị-điều-tiết"/>
     <w:p>
       <w:pPr>
         <w:pStyle w:val="Heading5"/>
       </w:pPr>
       <w:r>
-        <w:t xml:space="preserve">H4 — Đặc điểm nhà quản trị điều tiết</w:t>
+        <w:t xml:space="preserve">H4a–H4c — Đặc điểm nhà quản trị điều tiết</w:t>
       </w:r>
     </w:p>
     <w:p>
@@ -5990,23 +7016,68 @@
         <w:pStyle w:val="FirstParagraph"/>
       </w:pPr>
       <w:r>
-        <w:t xml:space="preserve">Cơ sở lý thuyết: Upper Echelons Theory (Hambrick &amp; Mason, 1984; Hambrick, 2007) cho rằng quyết định chiến lược phản ánh đặc điểm của nhà quản trị cấp cao. Trong bối cảnh WBES, biến nhà quản trị được đo bởi số năm kinh nghiệm quản lý (b5), trình độ học vấn (b7a), giới tính (b7). Cơ chế điều tiết hoạt động qua hai kênh: chất lượng quyết định (tránh quốc tế hóa sớm) và năng lực điều phối (quản lý phức tạp đa thị trường ở FSTS cao).</w:t>
-      </w:r>
-    </w:p>
-    <w:p>
-      <w:pPr>
-        <w:pStyle w:val="BodyText"/>
-      </w:pPr>
-      <w:r>
-        <w:t xml:space="preserve">H4: Kinh nghiệm của nhà quản trị cấp cao (exp_manager) điều tiết tích cực quan hệ FSTS → ln(LP): β(FSTS×exp_manager) &gt; 0, nghĩa là với cùng mức FSTS, doanh nghiệp có nhà quản trị kinh nghiệm hơn đạt hiệu quả cao hơn. Học vấn và giới tính được kiểm định như biến điều tiết khám phá.</w:t>
-      </w:r>
-    </w:p>
-    <w:p>
-      <w:pPr>
-        <w:pStyle w:val="BodyText"/>
-      </w:pPr>
-      <w:r>
-        <w:t xml:space="preserve">Phạm vi kiểm định: do WBES không đo trực tiếp kinh nghiệm quốc tế mà chỉ đo tổng số năm kinh nghiệm, H4 được kiểm định với biến đại diện. Kết quả là chỉ báo, không phải kiểm định trực tiếp cơ chế Upper Echelons — một hạn chế cần thừa nhận rõ.</w:t>
+        <w:t xml:space="preserve">Cơ sở lý thuyết: Upper Echelons Theory (Hambrick &amp; Mason, 1984; Hambrick, 2007) cho rằng quyết định chiến lược phản ánh đặc điểm nhân khẩu học của nhà quản trị cấp cao — bao gồm kinh nghiệm, học vấn, và giới tính. Cơ chế điều tiết hoạt động qua hai kênh: chất lượng quyết định (tránh quốc tế hóa sớm ở FSTS thấp) và năng lực điều phối (quản lý phức tạp đa thị trường ở FSTS cao). Trong bối cảnh WBES, ba biến đại diện có sẵn: số năm kinh nghiệm quản lý (b5), trình độ học vấn (b7a), và giới tính nhà quản trị cấp cao (b7).</w:t>
+      </w:r>
+    </w:p>
+    <w:p>
+      <w:pPr>
+        <w:pStyle w:val="BodyText"/>
+      </w:pPr>
+      <w:r>
+        <w:t xml:space="preserve">Ba sub-hypothesis được tách biệt theo đặc điểm và dấu kỳ vọng:</w:t>
+      </w:r>
+    </w:p>
+    <w:p>
+      <w:pPr>
+        <w:pStyle w:val="BodyText"/>
+      </w:pPr>
+      <w:r>
+        <w:rPr>
+          <w:bCs/>
+          <w:b/>
+        </w:rPr>
+        <w:t xml:space="preserve">H4a</w:t>
+      </w:r>
+      <w:r>
+        <w:t xml:space="preserve">: Kinh nghiệm quản lý tổng thể điều tiết tích cực quan hệ FSTS → ln(LP): β(FSTS×exp_manager) &gt; 0. Nhà quản trị nhiều kinh nghiệm chuyển hóa quốc tế hóa thành hiệu quả tốt hơn thông qua khả năng nhận diện cơ hội thị trường và tránh bẫy tăng trưởng quá mức (δ_exp &gt; 0).</w:t>
+      </w:r>
+    </w:p>
+    <w:p>
+      <w:pPr>
+        <w:pStyle w:val="BodyText"/>
+      </w:pPr>
+      <w:r>
+        <w:rPr>
+          <w:bCs/>
+          <w:b/>
+        </w:rPr>
+        <w:t xml:space="preserve">H4b</w:t>
+      </w:r>
+      <w:r>
+        <w:t xml:space="preserve">: Học vấn nhà quản trị — đại diện cho năng lực nhận thức và khả năng tiếp thu kinh nghiệm quốc tế — điều tiết tích cực quan hệ FSTS → ln(LP): β(FSTS×educ_manager) &gt; 0. Nhà quản trị học vấn cao có khung nhận thức rộng hơn để xử lý sự phức tạp thông tin trong quản lý đa thị trường (δ_educ &gt; 0). Lưu ý: WBES (b7a) không đo trực tiếp kinh nghiệm quốc tế; học vấn được dùng như biến đại diện cho năng lực tư duy vượt biên giới (cognitive international readiness).</w:t>
+      </w:r>
+    </w:p>
+    <w:p>
+      <w:pPr>
+        <w:pStyle w:val="BodyText"/>
+      </w:pPr>
+      <w:r>
+        <w:rPr>
+          <w:bCs/>
+          <w:b/>
+        </w:rPr>
+        <w:t xml:space="preserve">H4c</w:t>
+      </w:r>
+      <w:r>
+        <w:t xml:space="preserve">: Giới tính nữ của nhà quản trị cấp cao (gender_manager = 1) — kiểm định khám phá, không đặt dấu kỳ vọng tiên nghiệm; kiểm định two-sided. Bằng chứng trong văn liệu Upper Echelons không đồng nhất về chiều hướng cho châu Á (Hambrick, 2007); H4c vì vậy là exploratory.</w:t>
+      </w:r>
+    </w:p>
+    <w:p>
+      <w:pPr>
+        <w:pStyle w:val="BodyText"/>
+      </w:pPr>
+      <w:r>
+        <w:t xml:space="preserve">Phạm vi kiểm định: H4a–H4b là biến đại diện (proxy) cho cơ chế Upper Echelons — kết quả là chỉ báo gián tiếp, không phải kiểm định trực tiếp cấu trúc lý thuyết gốc. Hạn chế này cần được thừa nhận rõ trong phần thảo luận kết quả.</w:t>
       </w:r>
     </w:p>
     <w:bookmarkEnd w:id="59"/>
@@ -6626,19 +7697,19 @@
               <w:jc w:val="left"/>
             </w:pPr>
             <w:r>
-              <w:t xml:space="preserve">H3</w:t>
-            </w:r>
-          </w:p>
-        </w:tc>
-        <w:tc>
-          <w:tcPr/>
-          <w:p>
-            <w:pPr>
-              <w:pStyle w:val="Compact"/>
-              <w:jc w:val="left"/>
-            </w:pPr>
-            <w:r>
-              <w:t xml:space="preserve">DAI tình huống</w:t>
+              <w:t xml:space="preserve">H3a</w:t>
+            </w:r>
+          </w:p>
+        </w:tc>
+        <w:tc>
+          <w:tcPr/>
+          <w:p>
+            <w:pPr>
+              <w:pStyle w:val="Compact"/>
+              <w:jc w:val="left"/>
+            </w:pPr>
+            <w:r>
+              <w:t xml:space="preserve">DAI Emerging/Frontier (+)</w:t>
             </w:r>
           </w:p>
         </w:tc>
@@ -6662,31 +7733,31 @@
               <w:jc w:val="left"/>
             </w:pPr>
             <w:r>
-              <w:t xml:space="preserve">DAI, FSTS²×DAI</w:t>
-            </w:r>
-          </w:p>
-        </w:tc>
-        <w:tc>
-          <w:tcPr/>
-          <w:p>
-            <w:pPr>
-              <w:pStyle w:val="Compact"/>
-              <w:jc w:val="left"/>
-            </w:pPr>
-            <w:r>
-              <w:t xml:space="preserve">Phụ thuộc ngữ cảnh (β &gt; 0 ở Nhóm I)</w:t>
-            </w:r>
-          </w:p>
-        </w:tc>
-        <w:tc>
-          <w:tcPr/>
-          <w:p>
-            <w:pPr>
-              <w:pStyle w:val="Compact"/>
-              <w:jc w:val="left"/>
-            </w:pPr>
-            <w:r>
-              <w:t xml:space="preserve">P4 +3,119; P3 IV null</w:t>
+              <w:t xml:space="preserve">DAI, FSTS×DAI</w:t>
+            </w:r>
+          </w:p>
+        </w:tc>
+        <w:tc>
+          <w:tcPr/>
+          <w:p>
+            <w:pPr>
+              <w:pStyle w:val="Compact"/>
+              <w:jc w:val="left"/>
+            </w:pPr>
+            <w:r>
+              <w:t xml:space="preserve">β(FSTS×DAI) &gt; 0 (Nhóm III–V)</w:t>
+            </w:r>
+          </w:p>
+        </w:tc>
+        <w:tc>
+          <w:tcPr/>
+          <w:p>
+            <w:pPr>
+              <w:pStyle w:val="Compact"/>
+              <w:jc w:val="left"/>
+            </w:pPr>
+            <w:r>
+              <w:t xml:space="preserve">P3 IV null; bằng chứng hạn chế</w:t>
             </w:r>
           </w:p>
         </w:tc>
@@ -6700,67 +7771,67 @@
               <w:jc w:val="left"/>
             </w:pPr>
             <w:r>
-              <w:t xml:space="preserve">H4</w:t>
-            </w:r>
-          </w:p>
-        </w:tc>
-        <w:tc>
-          <w:tcPr/>
-          <w:p>
-            <w:pPr>
-              <w:pStyle w:val="Compact"/>
-              <w:jc w:val="left"/>
-            </w:pPr>
-            <w:r>
-              <w:t xml:space="preserve">Quản trị điều tiết</w:t>
-            </w:r>
-          </w:p>
-        </w:tc>
-        <w:tc>
-          <w:tcPr/>
-          <w:p>
-            <w:pPr>
-              <w:pStyle w:val="Compact"/>
-              <w:jc w:val="left"/>
-            </w:pPr>
-            <w:r>
-              <w:t xml:space="preserve">Upper Echelons</w:t>
-            </w:r>
-          </w:p>
-        </w:tc>
-        <w:tc>
-          <w:tcPr/>
-          <w:p>
-            <w:pPr>
-              <w:pStyle w:val="Compact"/>
-              <w:jc w:val="left"/>
-            </w:pPr>
-            <w:r>
-              <w:t xml:space="preserve">exp_manager, FSTS×exp</w:t>
-            </w:r>
-          </w:p>
-        </w:tc>
-        <w:tc>
-          <w:tcPr/>
-          <w:p>
-            <w:pPr>
-              <w:pStyle w:val="Compact"/>
-              <w:jc w:val="left"/>
-            </w:pPr>
-            <w:r>
-              <w:t xml:space="preserve">β(FSTS×exp) &gt; 0</w:t>
-            </w:r>
-          </w:p>
-        </w:tc>
-        <w:tc>
-          <w:tcPr/>
-          <w:p>
-            <w:pPr>
-              <w:pStyle w:val="Compact"/>
-              <w:jc w:val="left"/>
-            </w:pPr>
-            <w:r>
-              <w:t xml:space="preserve">(WBES b5, b7a, b7)</w:t>
+              <w:t xml:space="preserve">H3b</w:t>
+            </w:r>
+          </w:p>
+        </w:tc>
+        <w:tc>
+          <w:tcPr/>
+          <w:p>
+            <w:pPr>
+              <w:pStyle w:val="Compact"/>
+              <w:jc w:val="left"/>
+            </w:pPr>
+            <w:r>
+              <w:t xml:space="preserve">DAI Advanced (null/−, conditional +)</w:t>
+            </w:r>
+          </w:p>
+        </w:tc>
+        <w:tc>
+          <w:tcPr/>
+          <w:p>
+            <w:pPr>
+              <w:pStyle w:val="Compact"/>
+              <w:jc w:val="left"/>
+            </w:pPr>
+            <w:r>
+              <w:t xml:space="preserve">CDCM × Digital Adoption Lens</w:t>
+            </w:r>
+          </w:p>
+        </w:tc>
+        <w:tc>
+          <w:tcPr/>
+          <w:p>
+            <w:pPr>
+              <w:pStyle w:val="Compact"/>
+              <w:jc w:val="left"/>
+            </w:pPr>
+            <w:r>
+              <w:t xml:space="preserve">DAI, FSTS²×DAI</w:t>
+            </w:r>
+          </w:p>
+        </w:tc>
+        <w:tc>
+          <w:tcPr/>
+          <w:p>
+            <w:pPr>
+              <w:pStyle w:val="Compact"/>
+              <w:jc w:val="left"/>
+            </w:pPr>
+            <w:r>
+              <w:t xml:space="preserve">Direct: null/–; cond: β(FSTS²×DAI) &gt; 0 ở FSTS cao</w:t>
+            </w:r>
+          </w:p>
+        </w:tc>
+        <w:tc>
+          <w:tcPr/>
+          <w:p>
+            <w:pPr>
+              <w:pStyle w:val="Compact"/>
+              <w:jc w:val="left"/>
+            </w:pPr>
+            <w:r>
+              <w:t xml:space="preserve">P4 +3,119; bão hòa số</w:t>
             </w:r>
           </w:p>
         </w:tc>
@@ -6774,67 +7845,67 @@
               <w:jc w:val="left"/>
             </w:pPr>
             <w:r>
-              <w:t xml:space="preserve">H5</w:t>
-            </w:r>
-          </w:p>
-        </w:tc>
-        <w:tc>
-          <w:tcPr/>
-          <w:p>
-            <w:pPr>
-              <w:pStyle w:val="Compact"/>
-              <w:jc w:val="left"/>
-            </w:pPr>
-            <w:r>
-              <w:t xml:space="preserve">Gradient ICRV</w:t>
-            </w:r>
-          </w:p>
-        </w:tc>
-        <w:tc>
-          <w:tcPr/>
-          <w:p>
-            <w:pPr>
-              <w:pStyle w:val="Compact"/>
-              <w:jc w:val="left"/>
-            </w:pPr>
-            <w:r>
-              <w:t xml:space="preserve">Institutional Theory</w:t>
-            </w:r>
-          </w:p>
-        </w:tc>
-        <w:tc>
-          <w:tcPr/>
-          <w:p>
-            <w:pPr>
-              <w:pStyle w:val="Compact"/>
-              <w:jc w:val="left"/>
-            </w:pPr>
-            <w:r>
-              <w:t xml:space="preserve">ICRV_j × FSTS</w:t>
-            </w:r>
-          </w:p>
-        </w:tc>
-        <w:tc>
-          <w:tcPr/>
-          <w:p>
-            <w:pPr>
-              <w:pStyle w:val="Compact"/>
-              <w:jc w:val="left"/>
-            </w:pPr>
-            <w:r>
-              <w:t xml:space="preserve">TP gradient; Nhóm VI gánh nặng tắt buộc</w:t>
-            </w:r>
-          </w:p>
-        </w:tc>
-        <w:tc>
-          <w:tcPr/>
-          <w:p>
-            <w:pPr>
-              <w:pStyle w:val="Compact"/>
-              <w:jc w:val="left"/>
-            </w:pPr>
-            <w:r>
-              <w:t xml:space="preserve">Phân tán LP tăng theo chế độ (CĐ1)</w:t>
+              <w:t xml:space="preserve">H4a</w:t>
+            </w:r>
+          </w:p>
+        </w:tc>
+        <w:tc>
+          <w:tcPr/>
+          <w:p>
+            <w:pPr>
+              <w:pStyle w:val="Compact"/>
+              <w:jc w:val="left"/>
+            </w:pPr>
+            <w:r>
+              <w:t xml:space="preserve">Kinh nghiệm QL điều tiết</w:t>
+            </w:r>
+          </w:p>
+        </w:tc>
+        <w:tc>
+          <w:tcPr/>
+          <w:p>
+            <w:pPr>
+              <w:pStyle w:val="Compact"/>
+              <w:jc w:val="left"/>
+            </w:pPr>
+            <w:r>
+              <w:t xml:space="preserve">Upper Echelons</w:t>
+            </w:r>
+          </w:p>
+        </w:tc>
+        <w:tc>
+          <w:tcPr/>
+          <w:p>
+            <w:pPr>
+              <w:pStyle w:val="Compact"/>
+              <w:jc w:val="left"/>
+            </w:pPr>
+            <w:r>
+              <w:t xml:space="preserve">exp_manager, FSTS×exp</w:t>
+            </w:r>
+          </w:p>
+        </w:tc>
+        <w:tc>
+          <w:tcPr/>
+          <w:p>
+            <w:pPr>
+              <w:pStyle w:val="Compact"/>
+              <w:jc w:val="left"/>
+            </w:pPr>
+            <w:r>
+              <w:t xml:space="preserve">β(FSTS×exp) &gt; 0 (δ_exp &gt; 0)</w:t>
+            </w:r>
+          </w:p>
+        </w:tc>
+        <w:tc>
+          <w:tcPr/>
+          <w:p>
+            <w:pPr>
+              <w:pStyle w:val="Compact"/>
+              <w:jc w:val="left"/>
+            </w:pPr>
+            <w:r>
+              <w:t xml:space="preserve">(WBES b5)</w:t>
             </w:r>
           </w:p>
         </w:tc>
@@ -6848,6 +7919,228 @@
               <w:jc w:val="left"/>
             </w:pPr>
             <w:r>
+              <w:t xml:space="preserve">H4b</w:t>
+            </w:r>
+          </w:p>
+        </w:tc>
+        <w:tc>
+          <w:tcPr/>
+          <w:p>
+            <w:pPr>
+              <w:pStyle w:val="Compact"/>
+              <w:jc w:val="left"/>
+            </w:pPr>
+            <w:r>
+              <w:t xml:space="preserve">Học vấn QL điều tiết</w:t>
+            </w:r>
+          </w:p>
+        </w:tc>
+        <w:tc>
+          <w:tcPr/>
+          <w:p>
+            <w:pPr>
+              <w:pStyle w:val="Compact"/>
+              <w:jc w:val="left"/>
+            </w:pPr>
+            <w:r>
+              <w:t xml:space="preserve">Upper Echelons</w:t>
+            </w:r>
+          </w:p>
+        </w:tc>
+        <w:tc>
+          <w:tcPr/>
+          <w:p>
+            <w:pPr>
+              <w:pStyle w:val="Compact"/>
+              <w:jc w:val="left"/>
+            </w:pPr>
+            <w:r>
+              <w:t xml:space="preserve">educ_manager, FSTS×educ</w:t>
+            </w:r>
+          </w:p>
+        </w:tc>
+        <w:tc>
+          <w:tcPr/>
+          <w:p>
+            <w:pPr>
+              <w:pStyle w:val="Compact"/>
+              <w:jc w:val="left"/>
+            </w:pPr>
+            <w:r>
+              <w:t xml:space="preserve">β(FSTS×educ) &gt; 0 (δ_educ &gt; 0)</w:t>
+            </w:r>
+          </w:p>
+        </w:tc>
+        <w:tc>
+          <w:tcPr/>
+          <w:p>
+            <w:pPr>
+              <w:pStyle w:val="Compact"/>
+              <w:jc w:val="left"/>
+            </w:pPr>
+            <w:r>
+              <w:t xml:space="preserve">(WBES b7a)</w:t>
+            </w:r>
+          </w:p>
+        </w:tc>
+      </w:tr>
+      <w:tr>
+        <w:tc>
+          <w:tcPr/>
+          <w:p>
+            <w:pPr>
+              <w:pStyle w:val="Compact"/>
+              <w:jc w:val="left"/>
+            </w:pPr>
+            <w:r>
+              <w:t xml:space="preserve">H4c</w:t>
+            </w:r>
+          </w:p>
+        </w:tc>
+        <w:tc>
+          <w:tcPr/>
+          <w:p>
+            <w:pPr>
+              <w:pStyle w:val="Compact"/>
+              <w:jc w:val="left"/>
+            </w:pPr>
+            <w:r>
+              <w:t xml:space="preserve">Giới tính QL — khám phá</w:t>
+            </w:r>
+          </w:p>
+        </w:tc>
+        <w:tc>
+          <w:tcPr/>
+          <w:p>
+            <w:pPr>
+              <w:pStyle w:val="Compact"/>
+              <w:jc w:val="left"/>
+            </w:pPr>
+            <w:r>
+              <w:t xml:space="preserve">Upper Echelons</w:t>
+            </w:r>
+          </w:p>
+        </w:tc>
+        <w:tc>
+          <w:tcPr/>
+          <w:p>
+            <w:pPr>
+              <w:pStyle w:val="Compact"/>
+              <w:jc w:val="left"/>
+            </w:pPr>
+            <w:r>
+              <w:t xml:space="preserve">gender_manager, FSTS×gender</w:t>
+            </w:r>
+          </w:p>
+        </w:tc>
+        <w:tc>
+          <w:tcPr/>
+          <w:p>
+            <w:pPr>
+              <w:pStyle w:val="Compact"/>
+              <w:jc w:val="left"/>
+            </w:pPr>
+            <w:r>
+              <w:t xml:space="preserve">Exploratory, two-sided</w:t>
+            </w:r>
+          </w:p>
+        </w:tc>
+        <w:tc>
+          <w:tcPr/>
+          <w:p>
+            <w:pPr>
+              <w:pStyle w:val="Compact"/>
+              <w:jc w:val="left"/>
+            </w:pPr>
+            <w:r>
+              <w:t xml:space="preserve">(WBES b7)</w:t>
+            </w:r>
+          </w:p>
+        </w:tc>
+      </w:tr>
+      <w:tr>
+        <w:tc>
+          <w:tcPr/>
+          <w:p>
+            <w:pPr>
+              <w:pStyle w:val="Compact"/>
+              <w:jc w:val="left"/>
+            </w:pPr>
+            <w:r>
+              <w:t xml:space="preserve">H5</w:t>
+            </w:r>
+          </w:p>
+        </w:tc>
+        <w:tc>
+          <w:tcPr/>
+          <w:p>
+            <w:pPr>
+              <w:pStyle w:val="Compact"/>
+              <w:jc w:val="left"/>
+            </w:pPr>
+            <w:r>
+              <w:t xml:space="preserve">Gradient ICRV</w:t>
+            </w:r>
+          </w:p>
+        </w:tc>
+        <w:tc>
+          <w:tcPr/>
+          <w:p>
+            <w:pPr>
+              <w:pStyle w:val="Compact"/>
+              <w:jc w:val="left"/>
+            </w:pPr>
+            <w:r>
+              <w:t xml:space="preserve">Institutional Theory</w:t>
+            </w:r>
+          </w:p>
+        </w:tc>
+        <w:tc>
+          <w:tcPr/>
+          <w:p>
+            <w:pPr>
+              <w:pStyle w:val="Compact"/>
+              <w:jc w:val="left"/>
+            </w:pPr>
+            <w:r>
+              <w:t xml:space="preserve">ICRV_j × FSTS</w:t>
+            </w:r>
+          </w:p>
+        </w:tc>
+        <w:tc>
+          <w:tcPr/>
+          <w:p>
+            <w:pPr>
+              <w:pStyle w:val="Compact"/>
+              <w:jc w:val="left"/>
+            </w:pPr>
+            <w:r>
+              <w:t xml:space="preserve">TP gradient; Nhóm VI gánh nặng tắt buộc</w:t>
+            </w:r>
+          </w:p>
+        </w:tc>
+        <w:tc>
+          <w:tcPr/>
+          <w:p>
+            <w:pPr>
+              <w:pStyle w:val="Compact"/>
+              <w:jc w:val="left"/>
+            </w:pPr>
+            <w:r>
+              <w:t xml:space="preserve">Phân tán LP tăng theo chế độ (CĐ1)</w:t>
+            </w:r>
+          </w:p>
+        </w:tc>
+      </w:tr>
+      <w:tr>
+        <w:tc>
+          <w:tcPr/>
+          <w:p>
+            <w:pPr>
+              <w:pStyle w:val="Compact"/>
+              <w:jc w:val="left"/>
+            </w:pPr>
+            <w:r>
               <w:t xml:space="preserve">H6</w:t>
             </w:r>
           </w:p>
@@ -6919,7 +8212,7 @@
         <w:pStyle w:val="BodyText"/>
       </w:pPr>
       <w:r>
-        <w:t xml:space="preserve">Sáu giả thuyết tạo thành hệ thống logic nhất quán: H1 (phi tuyến) là trọng tâm; H2 (TCI) và H3 (DAI) phân rã cơ chế năng lực doanh nghiệp; H4 (Quản trị) bổ sung tầng Upper Echelons; H5 (ICRV gradient) là tầng thể chế bao trùm; H6 (Thời gian) là tầng động.</w:t>
+        <w:t xml:space="preserve">Chín giả thuyết (H1a–H1b, H2, H3a–H3b với H3c distinctiveness, H4a–H4c, H5, H6) tạo thành hệ thống logic nhất quán: H1a/H1b (phi tuyến — biên tham gia vs biên cường độ) là trọng tâm; H2 (TCI nâng mặt bằng) và H3a/H3b (DAI phụ thuộc regime) phân rã cơ chế năng lực doanh nghiệp với dấu kỳ vọng khác nhau theo ngữ cảnh; H4a–H4c (Quản trị) bổ sung tầng Upper Echelons với dấu kỳ vọng phân biệt theo đặc điểm nhà quản trị; H5 (ICRV gradient) là tầng thể chế bao trùm; H6 (Thời gian) là tầng động.</w:t>
       </w:r>
     </w:p>
     <w:p>
@@ -7377,13 +8670,13 @@
       </w:r>
     </w:p>
     <w:bookmarkEnd w:id="69"/>
-    <w:bookmarkStart w:id="70" w:name="m5---điều-tiết-nhà-quản-trị-kiểm-định-h4"/>
+    <w:bookmarkStart w:id="70" w:name="X06f71524788155e2ebf216bcee5f2e32a6c0cd5"/>
     <w:p>
       <w:pPr>
         <w:pStyle w:val="Heading5"/>
       </w:pPr>
       <w:r>
-        <w:t xml:space="preserve">M5 — + Điều tiết nhà quản trị (kiểm định H4)</w:t>
+        <w:t xml:space="preserve">M5 — + Điều tiết nhà quản trị (kiểm định H4a/H4b/H4c)</w:t>
       </w:r>
     </w:p>
     <w:p>
@@ -7449,13 +8742,13 @@
         <w:pStyle w:val="BodyText"/>
       </w:pPr>
       <w:r>
-        <w:t xml:space="preserve">Biến Manager theo thứ tự ưu tiên: exp_manager (b5) — biến chính; educ_manager (b7a) — biến phụ; gender_manager (b7) — khám phá.</w:t>
-      </w:r>
-      <w:r>
-        <w:t xml:space="preserve"> </w:t>
-      </w:r>
-      <w:r>
-        <w:t xml:space="preserve">Kỳ vọng: β₄(FSTS×exp_manager) &gt; 0.</w:t>
+        <w:t xml:space="preserve">Biến Manager theo thứ tự ưu tiên: exp_manager (b5, H4a) — biến chính với kỳ vọng β₄ &gt; 0; educ_manager (b7a, H4b) — biến phụ với kỳ vọng β₄ &gt; 0; gender_manager (b7, H4c) — khám phá, kiểm định two-sided.</w:t>
+      </w:r>
+      <w:r>
+        <w:t xml:space="preserve"> </w:t>
+      </w:r>
+      <w:r>
+        <w:t xml:space="preserve">Kỳ vọng: β₄(FSTS×exp_manager) &gt; 0 [H4a]; β₄(FSTS×educ_manager) &gt; 0 [H4b]; β₄(FSTS×gender_manager) — không có kỳ vọng tiên nghiệm [H4c].</w:t>
       </w:r>
     </w:p>
     <w:bookmarkEnd w:id="70"/>
@@ -8379,19 +9672,19 @@
               <w:jc w:val="left"/>
             </w:pPr>
             <w:r>
-              <w:t xml:space="preserve">H3</w:t>
-            </w:r>
-          </w:p>
-        </w:tc>
-        <w:tc>
-          <w:tcPr/>
-          <w:p>
-            <w:pPr>
-              <w:pStyle w:val="Compact"/>
-              <w:jc w:val="left"/>
-            </w:pPr>
-            <w:r>
-              <w:t xml:space="preserve">β₅ &gt; 0 Nhóm I; IV check</w:t>
+              <w:t xml:space="preserve">H3a/H3b</w:t>
+            </w:r>
+          </w:p>
+        </w:tc>
+        <w:tc>
+          <w:tcPr/>
+          <w:p>
+            <w:pPr>
+              <w:pStyle w:val="Compact"/>
+              <w:jc w:val="left"/>
+            </w:pPr>
+            <w:r>
+              <w:t xml:space="preserve">H3a: β(FSTS×DAI) &gt; 0 Nhóm III–V; H3b: β(FSTS²×DAI) &gt; 0 ở FSTS cao Nhóm I</w:t>
             </w:r>
           </w:p>
         </w:tc>
@@ -8429,19 +9722,19 @@
               <w:jc w:val="left"/>
             </w:pPr>
             <w:r>
-              <w:t xml:space="preserve">H4</w:t>
-            </w:r>
-          </w:p>
-        </w:tc>
-        <w:tc>
-          <w:tcPr/>
-          <w:p>
-            <w:pPr>
-              <w:pStyle w:val="Compact"/>
-              <w:jc w:val="left"/>
-            </w:pPr>
-            <w:r>
-              <w:t xml:space="preserve">β₄(FSTS×exp) &gt; 0</w:t>
+              <w:t xml:space="preserve">H4a/H4b/H4c</w:t>
+            </w:r>
+          </w:p>
+        </w:tc>
+        <w:tc>
+          <w:tcPr/>
+          <w:p>
+            <w:pPr>
+              <w:pStyle w:val="Compact"/>
+              <w:jc w:val="left"/>
+            </w:pPr>
+            <w:r>
+              <w:t xml:space="preserve">H4a: β₄(FSTS×exp) &gt; 0; H4b: β₄(FSTS×educ) &gt; 0; H4c: two-sided</w:t>
             </w:r>
           </w:p>
         </w:tc>
@@ -11187,7 +12480,7 @@
         <w:pStyle w:val="BodyText"/>
       </w:pPr>
       <w:r>
-        <w:t xml:space="preserve">Kết quả dự kiến từ bằng chứng neo đậu: H1 (phi tuyến) xác nhận chữ U ngược ở hầu hết nhóm ICRV với gradient điểm uốn từ Nhóm I đến Nhóm VI; H2 (TCI nâng mặt bằng) TCI dương bền vững và nhân quả; H3 (DAI tình huống) FSTS²×DAI dương trong Nhóm I, phụ thuộc chọn lựa trong Nhóm IV; H4 (Quản trị) exp_manager×FSTS dương; H5 (ICRV gradient) điểm uốn gradient từ Nhóm I đến VI, Nhóm VI gánh nặng tắt buộc; H6 (Thời gian) DAI dịch chuyển 2009→2023, TCI tăng cường theo thời gian.</w:t>
+        <w:t xml:space="preserve">Kết quả dự kiến từ bằng chứng neo đậu: H1 (phi tuyến) xác nhận chữ U ngược ở hầu hết nhóm ICRV với gradient điểm uốn từ Nhóm I đến Nhóm VI; H2 (TCI nâng mặt bằng) TCI dương bền vững và nhân quả; H3a (DAI Emerging/Frontier) khám phá; H3b (DAI Advanced) β(FSTS²×DAI) dương trong Nhóm I (P4 xác nhận), null/phụ thuộc chọn lựa trong Nhóm IV (P3 IV null); H4a (Kinh nghiệm QL) exp_manager×FSTS dương; H4b (Học vấn QL) educ_manager×FSTS dương; H4c (Giới tính) exploratory; H5 (ICRV gradient) điểm uốn gradient từ Nhóm I đến VI, Nhóm VI gánh nặng tắt buộc; H6 (Thời gian) DAI dịch chuyển 2009→2023, TCI tăng cường theo thời gian.</w:t>
       </w:r>
     </w:p>
     <w:p>
@@ -11297,7 +12590,7 @@
         <w:pStyle w:val="BodyText"/>
       </w:pPr>
       <w:r>
-        <w:t xml:space="preserve">Thứ tư, biến nhà quản trị trong H4 bị hạn chế do WBES không đo khoảng cách tâm lý, gắn kết mạng lưới quốc tế, hay cấu trúc hội đồng quản trị đầy đủ. Kiểm định H4 vì vậy là</w:t>
+        <w:t xml:space="preserve">Thứ tư, biến nhà quản trị trong H4a–H4c bị hạn chế do WBES không đo khoảng cách tâm lý, gắn kết mạng lưới quốc tế, hay cấu trúc hội đồng quản trị đầy đủ. Kiểm định H4a–H4c vì vậy là</w:t>
       </w:r>
       <w:r>
         <w:t xml:space="preserve"> </w:t>
@@ -13210,7 +14503,7 @@
       </w:r>
     </w:p>
     <w:bookmarkEnd w:id="124"/>
-    <w:bookmarkStart w:id="128" w:name="phụ-lục"/>
+    <w:bookmarkStart w:id="129" w:name="phụ-lục"/>
     <w:p>
       <w:pPr>
         <w:pStyle w:val="Heading2"/>
@@ -13399,8 +14692,977 @@
       </w:r>
     </w:p>
     <w:bookmarkEnd w:id="127"/>
+    <w:bookmarkStart w:id="128" w:name="Xd529ac992b128dceb2ea262f8c2f50bab89d9c2"/>
+    <w:p>
+      <w:pPr>
+        <w:pStyle w:val="Heading3"/>
+      </w:pPr>
+      <w:r>
+        <w:t xml:space="preserve">Phụ lục D — Đặc tả Stata: Sai số chuẩn cluster</w:t>
+      </w:r>
+    </w:p>
+    <w:p>
+      <w:pPr>
+        <w:pStyle w:val="FirstParagraph"/>
+      </w:pPr>
+      <w:r>
+        <w:t xml:space="preserve">Toàn bộ pipeline phân tích sử dụng Stata 18. Mô hình chuẩn (Mục 6.4) dùng HC1 robust SE cho điều chỉnh phương sai không đồng nhất cấp doanh nghiệp. Để kiểm định độ vững với clustering ở cấp quốc gia × ngành (country × industry cluster), thêm bước sau trước khi chạy mô hình hồi quy:</w:t>
+      </w:r>
+    </w:p>
+    <w:p>
+      <w:pPr>
+        <w:pStyle w:val="SourceCode"/>
+      </w:pPr>
+      <w:r>
+        <w:rPr>
+          <w:rStyle w:val="NormalTok"/>
+        </w:rPr>
+        <w:t xml:space="preserve">* === Tạo biến </w:t>
+      </w:r>
+      <w:r>
+        <w:rPr>
+          <w:rStyle w:val="KeywordTok"/>
+        </w:rPr>
+        <w:t xml:space="preserve">cluster</w:t>
+      </w:r>
+      <w:r>
+        <w:rPr>
+          <w:rStyle w:val="NormalTok"/>
+        </w:rPr>
+        <w:t xml:space="preserve"> country × industry ===</w:t>
+      </w:r>
+      <w:r>
+        <w:br/>
+      </w:r>
+      <w:r>
+        <w:rPr>
+          <w:rStyle w:val="KeywordTok"/>
+        </w:rPr>
+        <w:t xml:space="preserve">gen</w:t>
+      </w:r>
+      <w:r>
+        <w:rPr>
+          <w:rStyle w:val="NormalTok"/>
+        </w:rPr>
+        <w:t xml:space="preserve"> cluster_id = country_iso3 + </w:t>
+      </w:r>
+      <w:r>
+        <w:rPr>
+          <w:rStyle w:val="StringTok"/>
+        </w:rPr>
+        <w:t xml:space="preserve">"_"</w:t>
+      </w:r>
+      <w:r>
+        <w:rPr>
+          <w:rStyle w:val="NormalTok"/>
+        </w:rPr>
+        <w:t xml:space="preserve"> + </w:t>
+      </w:r>
+      <w:r>
+        <w:rPr>
+          <w:rStyle w:val="FunctionTok"/>
+        </w:rPr>
+        <w:t xml:space="preserve">string</w:t>
+      </w:r>
+      <w:r>
+        <w:rPr>
+          <w:rStyle w:val="NormalTok"/>
+        </w:rPr>
+        <w:t xml:space="preserve">(sector_main)</w:t>
+      </w:r>
+      <w:r>
+        <w:br/>
+      </w:r>
+      <w:r>
+        <w:br/>
+      </w:r>
+      <w:r>
+        <w:rPr>
+          <w:rStyle w:val="NormalTok"/>
+        </w:rPr>
+        <w:t xml:space="preserve">* === M1 với </w:t>
+      </w:r>
+      <w:r>
+        <w:rPr>
+          <w:rStyle w:val="KeywordTok"/>
+        </w:rPr>
+        <w:t xml:space="preserve">cluster</w:t>
+      </w:r>
+      <w:r>
+        <w:rPr>
+          <w:rStyle w:val="NormalTok"/>
+        </w:rPr>
+        <w:t xml:space="preserve"> </w:t>
+      </w:r>
+      <w:r>
+        <w:rPr>
+          <w:rStyle w:val="KeywordTok"/>
+        </w:rPr>
+        <w:t xml:space="preserve">SE</w:t>
+      </w:r>
+      <w:r>
+        <w:rPr>
+          <w:rStyle w:val="NormalTok"/>
+        </w:rPr>
+        <w:t xml:space="preserve"> (kiểm định H1) ===</w:t>
+      </w:r>
+      <w:r>
+        <w:br/>
+      </w:r>
+      <w:r>
+        <w:rPr>
+          <w:rStyle w:val="KeywordTok"/>
+        </w:rPr>
+        <w:t xml:space="preserve">reg</w:t>
+      </w:r>
+      <w:r>
+        <w:rPr>
+          <w:rStyle w:val="NormalTok"/>
+        </w:rPr>
+        <w:t xml:space="preserve"> ln_lp fsts_c fsts_c2 ln_emp firm_age foreign_own i.country i.</w:t>
+      </w:r>
+      <w:r>
+        <w:rPr>
+          <w:rStyle w:val="FunctionTok"/>
+        </w:rPr>
+        <w:t xml:space="preserve">year</w:t>
+      </w:r>
+      <w:r>
+        <w:rPr>
+          <w:rStyle w:val="NormalTok"/>
+        </w:rPr>
+        <w:t xml:space="preserve">, </w:t>
+      </w:r>
+      <w:r>
+        <w:rPr>
+          <w:rStyle w:val="CommentTok"/>
+        </w:rPr>
+        <w:t xml:space="preserve">///</w:t>
+      </w:r>
+      <w:r>
+        <w:br/>
+      </w:r>
+      <w:r>
+        <w:rPr>
+          <w:rStyle w:val="NormalTok"/>
+        </w:rPr>
+        <w:t xml:space="preserve">    </w:t>
+      </w:r>
+      <w:r>
+        <w:rPr>
+          <w:rStyle w:val="KeywordTok"/>
+        </w:rPr>
+        <w:t xml:space="preserve">vce</w:t>
+      </w:r>
+      <w:r>
+        <w:rPr>
+          <w:rStyle w:val="NormalTok"/>
+        </w:rPr>
+        <w:t xml:space="preserve">(</w:t>
+      </w:r>
+      <w:r>
+        <w:rPr>
+          <w:rStyle w:val="KeywordTok"/>
+        </w:rPr>
+        <w:t xml:space="preserve">cluster</w:t>
+      </w:r>
+      <w:r>
+        <w:rPr>
+          <w:rStyle w:val="NormalTok"/>
+        </w:rPr>
+        <w:t xml:space="preserve"> cluster_id)</w:t>
+      </w:r>
+      <w:r>
+        <w:br/>
+      </w:r>
+      <w:r>
+        <w:br/>
+      </w:r>
+      <w:r>
+        <w:rPr>
+          <w:rStyle w:val="NormalTok"/>
+        </w:rPr>
+        <w:t xml:space="preserve">* === M2 với </w:t>
+      </w:r>
+      <w:r>
+        <w:rPr>
+          <w:rStyle w:val="KeywordTok"/>
+        </w:rPr>
+        <w:t xml:space="preserve">cluster</w:t>
+      </w:r>
+      <w:r>
+        <w:rPr>
+          <w:rStyle w:val="NormalTok"/>
+        </w:rPr>
+        <w:t xml:space="preserve"> </w:t>
+      </w:r>
+      <w:r>
+        <w:rPr>
+          <w:rStyle w:val="KeywordTok"/>
+        </w:rPr>
+        <w:t xml:space="preserve">SE</w:t>
+      </w:r>
+      <w:r>
+        <w:rPr>
+          <w:rStyle w:val="NormalTok"/>
+        </w:rPr>
+        <w:t xml:space="preserve"> (kiểm định H2: TCI) ===</w:t>
+      </w:r>
+      <w:r>
+        <w:br/>
+      </w:r>
+      <w:r>
+        <w:rPr>
+          <w:rStyle w:val="KeywordTok"/>
+        </w:rPr>
+        <w:t xml:space="preserve">reg</w:t>
+      </w:r>
+      <w:r>
+        <w:rPr>
+          <w:rStyle w:val="NormalTok"/>
+        </w:rPr>
+        <w:t xml:space="preserve"> ln_lp fsts_c fsts_c2 tci_z c.fsts_c#c.tci_z </w:t>
+      </w:r>
+      <w:r>
+        <w:rPr>
+          <w:rStyle w:val="CommentTok"/>
+        </w:rPr>
+        <w:t xml:space="preserve">///</w:t>
+      </w:r>
+      <w:r>
+        <w:br/>
+      </w:r>
+      <w:r>
+        <w:rPr>
+          <w:rStyle w:val="NormalTok"/>
+        </w:rPr>
+        <w:t xml:space="preserve">    ln_emp firm_age foreign_own i.country i.</w:t>
+      </w:r>
+      <w:r>
+        <w:rPr>
+          <w:rStyle w:val="FunctionTok"/>
+        </w:rPr>
+        <w:t xml:space="preserve">year</w:t>
+      </w:r>
+      <w:r>
+        <w:rPr>
+          <w:rStyle w:val="NormalTok"/>
+        </w:rPr>
+        <w:t xml:space="preserve">, </w:t>
+      </w:r>
+      <w:r>
+        <w:rPr>
+          <w:rStyle w:val="CommentTok"/>
+        </w:rPr>
+        <w:t xml:space="preserve">///</w:t>
+      </w:r>
+      <w:r>
+        <w:br/>
+      </w:r>
+      <w:r>
+        <w:rPr>
+          <w:rStyle w:val="NormalTok"/>
+        </w:rPr>
+        <w:t xml:space="preserve">    </w:t>
+      </w:r>
+      <w:r>
+        <w:rPr>
+          <w:rStyle w:val="KeywordTok"/>
+        </w:rPr>
+        <w:t xml:space="preserve">vce</w:t>
+      </w:r>
+      <w:r>
+        <w:rPr>
+          <w:rStyle w:val="NormalTok"/>
+        </w:rPr>
+        <w:t xml:space="preserve">(</w:t>
+      </w:r>
+      <w:r>
+        <w:rPr>
+          <w:rStyle w:val="KeywordTok"/>
+        </w:rPr>
+        <w:t xml:space="preserve">cluster</w:t>
+      </w:r>
+      <w:r>
+        <w:rPr>
+          <w:rStyle w:val="NormalTok"/>
+        </w:rPr>
+        <w:t xml:space="preserve"> cluster_id)</w:t>
+      </w:r>
+      <w:r>
+        <w:br/>
+      </w:r>
+      <w:r>
+        <w:br/>
+      </w:r>
+      <w:r>
+        <w:rPr>
+          <w:rStyle w:val="NormalTok"/>
+        </w:rPr>
+        <w:t xml:space="preserve">* === M3 với </w:t>
+      </w:r>
+      <w:r>
+        <w:rPr>
+          <w:rStyle w:val="KeywordTok"/>
+        </w:rPr>
+        <w:t xml:space="preserve">cluster</w:t>
+      </w:r>
+      <w:r>
+        <w:rPr>
+          <w:rStyle w:val="NormalTok"/>
+        </w:rPr>
+        <w:t xml:space="preserve"> </w:t>
+      </w:r>
+      <w:r>
+        <w:rPr>
+          <w:rStyle w:val="KeywordTok"/>
+        </w:rPr>
+        <w:t xml:space="preserve">SE</w:t>
+      </w:r>
+      <w:r>
+        <w:rPr>
+          <w:rStyle w:val="NormalTok"/>
+        </w:rPr>
+        <w:t xml:space="preserve"> (kiểm định H3: DAI) ===</w:t>
+      </w:r>
+      <w:r>
+        <w:br/>
+      </w:r>
+      <w:r>
+        <w:rPr>
+          <w:rStyle w:val="KeywordTok"/>
+        </w:rPr>
+        <w:t xml:space="preserve">reg</w:t>
+      </w:r>
+      <w:r>
+        <w:rPr>
+          <w:rStyle w:val="NormalTok"/>
+        </w:rPr>
+        <w:t xml:space="preserve"> ln_lp fsts_c fsts_c2 dai_z c.fsts_c#c.dai_z c.fsts_c2#c.dai_z </w:t>
+      </w:r>
+      <w:r>
+        <w:rPr>
+          <w:rStyle w:val="CommentTok"/>
+        </w:rPr>
+        <w:t xml:space="preserve">///</w:t>
+      </w:r>
+      <w:r>
+        <w:br/>
+      </w:r>
+      <w:r>
+        <w:rPr>
+          <w:rStyle w:val="NormalTok"/>
+        </w:rPr>
+        <w:t xml:space="preserve">    ln_emp firm_age foreign_own i.country i.</w:t>
+      </w:r>
+      <w:r>
+        <w:rPr>
+          <w:rStyle w:val="FunctionTok"/>
+        </w:rPr>
+        <w:t xml:space="preserve">year</w:t>
+      </w:r>
+      <w:r>
+        <w:rPr>
+          <w:rStyle w:val="NormalTok"/>
+        </w:rPr>
+        <w:t xml:space="preserve">, </w:t>
+      </w:r>
+      <w:r>
+        <w:rPr>
+          <w:rStyle w:val="CommentTok"/>
+        </w:rPr>
+        <w:t xml:space="preserve">///</w:t>
+      </w:r>
+      <w:r>
+        <w:br/>
+      </w:r>
+      <w:r>
+        <w:rPr>
+          <w:rStyle w:val="NormalTok"/>
+        </w:rPr>
+        <w:t xml:space="preserve">    </w:t>
+      </w:r>
+      <w:r>
+        <w:rPr>
+          <w:rStyle w:val="KeywordTok"/>
+        </w:rPr>
+        <w:t xml:space="preserve">vce</w:t>
+      </w:r>
+      <w:r>
+        <w:rPr>
+          <w:rStyle w:val="NormalTok"/>
+        </w:rPr>
+        <w:t xml:space="preserve">(</w:t>
+      </w:r>
+      <w:r>
+        <w:rPr>
+          <w:rStyle w:val="KeywordTok"/>
+        </w:rPr>
+        <w:t xml:space="preserve">cluster</w:t>
+      </w:r>
+      <w:r>
+        <w:rPr>
+          <w:rStyle w:val="NormalTok"/>
+        </w:rPr>
+        <w:t xml:space="preserve"> cluster_id)</w:t>
+      </w:r>
+      <w:r>
+        <w:br/>
+      </w:r>
+      <w:r>
+        <w:br/>
+      </w:r>
+      <w:r>
+        <w:rPr>
+          <w:rStyle w:val="NormalTok"/>
+        </w:rPr>
+        <w:t xml:space="preserve">* === M5 với </w:t>
+      </w:r>
+      <w:r>
+        <w:rPr>
+          <w:rStyle w:val="KeywordTok"/>
+        </w:rPr>
+        <w:t xml:space="preserve">cluster</w:t>
+      </w:r>
+      <w:r>
+        <w:rPr>
+          <w:rStyle w:val="NormalTok"/>
+        </w:rPr>
+        <w:t xml:space="preserve"> </w:t>
+      </w:r>
+      <w:r>
+        <w:rPr>
+          <w:rStyle w:val="KeywordTok"/>
+        </w:rPr>
+        <w:t xml:space="preserve">SE</w:t>
+      </w:r>
+      <w:r>
+        <w:rPr>
+          <w:rStyle w:val="NormalTok"/>
+        </w:rPr>
+        <w:t xml:space="preserve"> (kiểm định H4a–H4c) ===</w:t>
+      </w:r>
+      <w:r>
+        <w:br/>
+      </w:r>
+      <w:r>
+        <w:rPr>
+          <w:rStyle w:val="NormalTok"/>
+        </w:rPr>
+        <w:t xml:space="preserve">* H4a: kinh nghiệm</w:t>
+      </w:r>
+      <w:r>
+        <w:br/>
+      </w:r>
+      <w:r>
+        <w:rPr>
+          <w:rStyle w:val="KeywordTok"/>
+        </w:rPr>
+        <w:t xml:space="preserve">reg</w:t>
+      </w:r>
+      <w:r>
+        <w:rPr>
+          <w:rStyle w:val="NormalTok"/>
+        </w:rPr>
+        <w:t xml:space="preserve"> ln_lp fsts_c fsts_c2 exp_manager c.fsts_c#c.exp_manager </w:t>
+      </w:r>
+      <w:r>
+        <w:rPr>
+          <w:rStyle w:val="CommentTok"/>
+        </w:rPr>
+        <w:t xml:space="preserve">///</w:t>
+      </w:r>
+      <w:r>
+        <w:br/>
+      </w:r>
+      <w:r>
+        <w:rPr>
+          <w:rStyle w:val="NormalTok"/>
+        </w:rPr>
+        <w:t xml:space="preserve">    ln_emp firm_age foreign_own i.country i.</w:t>
+      </w:r>
+      <w:r>
+        <w:rPr>
+          <w:rStyle w:val="FunctionTok"/>
+        </w:rPr>
+        <w:t xml:space="preserve">year</w:t>
+      </w:r>
+      <w:r>
+        <w:rPr>
+          <w:rStyle w:val="NormalTok"/>
+        </w:rPr>
+        <w:t xml:space="preserve">, </w:t>
+      </w:r>
+      <w:r>
+        <w:rPr>
+          <w:rStyle w:val="CommentTok"/>
+        </w:rPr>
+        <w:t xml:space="preserve">///</w:t>
+      </w:r>
+      <w:r>
+        <w:br/>
+      </w:r>
+      <w:r>
+        <w:rPr>
+          <w:rStyle w:val="NormalTok"/>
+        </w:rPr>
+        <w:t xml:space="preserve">    </w:t>
+      </w:r>
+      <w:r>
+        <w:rPr>
+          <w:rStyle w:val="KeywordTok"/>
+        </w:rPr>
+        <w:t xml:space="preserve">vce</w:t>
+      </w:r>
+      <w:r>
+        <w:rPr>
+          <w:rStyle w:val="NormalTok"/>
+        </w:rPr>
+        <w:t xml:space="preserve">(</w:t>
+      </w:r>
+      <w:r>
+        <w:rPr>
+          <w:rStyle w:val="KeywordTok"/>
+        </w:rPr>
+        <w:t xml:space="preserve">cluster</w:t>
+      </w:r>
+      <w:r>
+        <w:rPr>
+          <w:rStyle w:val="NormalTok"/>
+        </w:rPr>
+        <w:t xml:space="preserve"> cluster_id)</w:t>
+      </w:r>
+      <w:r>
+        <w:br/>
+      </w:r>
+      <w:r>
+        <w:br/>
+      </w:r>
+      <w:r>
+        <w:rPr>
+          <w:rStyle w:val="NormalTok"/>
+        </w:rPr>
+        <w:t xml:space="preserve">* H4b: học vấn</w:t>
+      </w:r>
+      <w:r>
+        <w:br/>
+      </w:r>
+      <w:r>
+        <w:rPr>
+          <w:rStyle w:val="KeywordTok"/>
+        </w:rPr>
+        <w:t xml:space="preserve">reg</w:t>
+      </w:r>
+      <w:r>
+        <w:rPr>
+          <w:rStyle w:val="NormalTok"/>
+        </w:rPr>
+        <w:t xml:space="preserve"> ln_lp fsts_c fsts_c2 educ_manager c.fsts_c#c.educ_manager </w:t>
+      </w:r>
+      <w:r>
+        <w:rPr>
+          <w:rStyle w:val="CommentTok"/>
+        </w:rPr>
+        <w:t xml:space="preserve">///</w:t>
+      </w:r>
+      <w:r>
+        <w:br/>
+      </w:r>
+      <w:r>
+        <w:rPr>
+          <w:rStyle w:val="NormalTok"/>
+        </w:rPr>
+        <w:t xml:space="preserve">    ln_emp firm_age foreign_own i.country i.</w:t>
+      </w:r>
+      <w:r>
+        <w:rPr>
+          <w:rStyle w:val="FunctionTok"/>
+        </w:rPr>
+        <w:t xml:space="preserve">year</w:t>
+      </w:r>
+      <w:r>
+        <w:rPr>
+          <w:rStyle w:val="NormalTok"/>
+        </w:rPr>
+        <w:t xml:space="preserve">, </w:t>
+      </w:r>
+      <w:r>
+        <w:rPr>
+          <w:rStyle w:val="CommentTok"/>
+        </w:rPr>
+        <w:t xml:space="preserve">///</w:t>
+      </w:r>
+      <w:r>
+        <w:br/>
+      </w:r>
+      <w:r>
+        <w:rPr>
+          <w:rStyle w:val="NormalTok"/>
+        </w:rPr>
+        <w:t xml:space="preserve">    </w:t>
+      </w:r>
+      <w:r>
+        <w:rPr>
+          <w:rStyle w:val="KeywordTok"/>
+        </w:rPr>
+        <w:t xml:space="preserve">vce</w:t>
+      </w:r>
+      <w:r>
+        <w:rPr>
+          <w:rStyle w:val="NormalTok"/>
+        </w:rPr>
+        <w:t xml:space="preserve">(</w:t>
+      </w:r>
+      <w:r>
+        <w:rPr>
+          <w:rStyle w:val="KeywordTok"/>
+        </w:rPr>
+        <w:t xml:space="preserve">cluster</w:t>
+      </w:r>
+      <w:r>
+        <w:rPr>
+          <w:rStyle w:val="NormalTok"/>
+        </w:rPr>
+        <w:t xml:space="preserve"> cluster_id)</w:t>
+      </w:r>
+      <w:r>
+        <w:br/>
+      </w:r>
+      <w:r>
+        <w:br/>
+      </w:r>
+      <w:r>
+        <w:rPr>
+          <w:rStyle w:val="NormalTok"/>
+        </w:rPr>
+        <w:t xml:space="preserve">* H4c: giới tính (exploratory, </w:t>
+      </w:r>
+      <w:r>
+        <w:rPr>
+          <w:rStyle w:val="KeywordTok"/>
+        </w:rPr>
+        <w:t xml:space="preserve">two</w:t>
+      </w:r>
+      <w:r>
+        <w:rPr>
+          <w:rStyle w:val="NormalTok"/>
+        </w:rPr>
+        <w:t xml:space="preserve">-sided — không đặt kỳ vọng)</w:t>
+      </w:r>
+      <w:r>
+        <w:br/>
+      </w:r>
+      <w:r>
+        <w:rPr>
+          <w:rStyle w:val="KeywordTok"/>
+        </w:rPr>
+        <w:t xml:space="preserve">reg</w:t>
+      </w:r>
+      <w:r>
+        <w:rPr>
+          <w:rStyle w:val="NormalTok"/>
+        </w:rPr>
+        <w:t xml:space="preserve"> ln_lp fsts_c fsts_c2 gender_manager c.fsts_c#c.gender_manager </w:t>
+      </w:r>
+      <w:r>
+        <w:rPr>
+          <w:rStyle w:val="CommentTok"/>
+        </w:rPr>
+        <w:t xml:space="preserve">///</w:t>
+      </w:r>
+      <w:r>
+        <w:br/>
+      </w:r>
+      <w:r>
+        <w:rPr>
+          <w:rStyle w:val="NormalTok"/>
+        </w:rPr>
+        <w:t xml:space="preserve">    ln_emp firm_age foreign_own i.country i.</w:t>
+      </w:r>
+      <w:r>
+        <w:rPr>
+          <w:rStyle w:val="FunctionTok"/>
+        </w:rPr>
+        <w:t xml:space="preserve">year</w:t>
+      </w:r>
+      <w:r>
+        <w:rPr>
+          <w:rStyle w:val="NormalTok"/>
+        </w:rPr>
+        <w:t xml:space="preserve">, </w:t>
+      </w:r>
+      <w:r>
+        <w:rPr>
+          <w:rStyle w:val="CommentTok"/>
+        </w:rPr>
+        <w:t xml:space="preserve">///</w:t>
+      </w:r>
+      <w:r>
+        <w:br/>
+      </w:r>
+      <w:r>
+        <w:rPr>
+          <w:rStyle w:val="NormalTok"/>
+        </w:rPr>
+        <w:t xml:space="preserve">    </w:t>
+      </w:r>
+      <w:r>
+        <w:rPr>
+          <w:rStyle w:val="KeywordTok"/>
+        </w:rPr>
+        <w:t xml:space="preserve">vce</w:t>
+      </w:r>
+      <w:r>
+        <w:rPr>
+          <w:rStyle w:val="NormalTok"/>
+        </w:rPr>
+        <w:t xml:space="preserve">(</w:t>
+      </w:r>
+      <w:r>
+        <w:rPr>
+          <w:rStyle w:val="KeywordTok"/>
+        </w:rPr>
+        <w:t xml:space="preserve">cluster</w:t>
+      </w:r>
+      <w:r>
+        <w:rPr>
+          <w:rStyle w:val="NormalTok"/>
+        </w:rPr>
+        <w:t xml:space="preserve"> cluster_id)</w:t>
+      </w:r>
+      <w:r>
+        <w:br/>
+      </w:r>
+      <w:r>
+        <w:br/>
+      </w:r>
+      <w:r>
+        <w:rPr>
+          <w:rStyle w:val="NormalTok"/>
+        </w:rPr>
+        <w:t xml:space="preserve">* === Lind-Mehlum utest sau mỗi mô hình có FSTS² ===</w:t>
+      </w:r>
+      <w:r>
+        <w:br/>
+      </w:r>
+      <w:r>
+        <w:rPr>
+          <w:rStyle w:val="NormalTok"/>
+        </w:rPr>
+        <w:t xml:space="preserve">* (cài đặt: </w:t>
+      </w:r>
+      <w:r>
+        <w:rPr>
+          <w:rStyle w:val="KeywordTok"/>
+        </w:rPr>
+        <w:t xml:space="preserve">ssc</w:t>
+      </w:r>
+      <w:r>
+        <w:rPr>
+          <w:rStyle w:val="NormalTok"/>
+        </w:rPr>
+        <w:t xml:space="preserve"> install utest)</w:t>
+      </w:r>
+      <w:r>
+        <w:br/>
+      </w:r>
+      <w:r>
+        <w:rPr>
+          <w:rStyle w:val="NormalTok"/>
+        </w:rPr>
+        <w:t xml:space="preserve">utest fsts_c fsts_c2</w:t>
+      </w:r>
+      <w:r>
+        <w:br/>
+      </w:r>
+      <w:r>
+        <w:br/>
+      </w:r>
+      <w:r>
+        <w:rPr>
+          <w:rStyle w:val="NormalTok"/>
+        </w:rPr>
+        <w:t xml:space="preserve">* === Kiểm tra số </w:t>
+      </w:r>
+      <w:r>
+        <w:rPr>
+          <w:rStyle w:val="KeywordTok"/>
+        </w:rPr>
+        <w:t xml:space="preserve">cluster</w:t>
+      </w:r>
+      <w:r>
+        <w:rPr>
+          <w:rStyle w:val="NormalTok"/>
+        </w:rPr>
+        <w:t xml:space="preserve"> ===</w:t>
+      </w:r>
+      <w:r>
+        <w:br/>
+      </w:r>
+      <w:r>
+        <w:rPr>
+          <w:rStyle w:val="NormalTok"/>
+        </w:rPr>
+        <w:t xml:space="preserve">* Số </w:t>
+      </w:r>
+      <w:r>
+        <w:rPr>
+          <w:rStyle w:val="KeywordTok"/>
+        </w:rPr>
+        <w:t xml:space="preserve">cluster</w:t>
+      </w:r>
+      <w:r>
+        <w:rPr>
+          <w:rStyle w:val="NormalTok"/>
+        </w:rPr>
+        <w:t xml:space="preserve"> tối thiểu khuyến nghị: ≥ 50 (Cameron &amp; Miller, 2015)</w:t>
+      </w:r>
+      <w:r>
+        <w:br/>
+      </w:r>
+      <w:r>
+        <w:rPr>
+          <w:rStyle w:val="NormalTok"/>
+        </w:rPr>
+        <w:t xml:space="preserve">* Pool 47 quốc gia × 5 ngành chính ≈ 235 </w:t>
+      </w:r>
+      <w:r>
+        <w:rPr>
+          <w:rStyle w:val="KeywordTok"/>
+        </w:rPr>
+        <w:t xml:space="preserve">cluster</w:t>
+      </w:r>
+      <w:r>
+        <w:rPr>
+          <w:rStyle w:val="NormalTok"/>
+        </w:rPr>
+        <w:t xml:space="preserve"> → thỏa mãn</w:t>
+      </w:r>
+      <w:r>
+        <w:br/>
+      </w:r>
+      <w:r>
+        <w:rPr>
+          <w:rStyle w:val="KeywordTok"/>
+        </w:rPr>
+        <w:t xml:space="preserve">tab</w:t>
+      </w:r>
+      <w:r>
+        <w:rPr>
+          <w:rStyle w:val="NormalTok"/>
+        </w:rPr>
+        <w:t xml:space="preserve"> cluster_id </w:t>
+      </w:r>
+      <w:r>
+        <w:rPr>
+          <w:rStyle w:val="KeywordTok"/>
+        </w:rPr>
+        <w:t xml:space="preserve">if</w:t>
+      </w:r>
+      <w:r>
+        <w:rPr>
+          <w:rStyle w:val="NormalTok"/>
+        </w:rPr>
+        <w:t xml:space="preserve"> </w:t>
+      </w:r>
+      <w:r>
+        <w:rPr>
+          <w:rStyle w:val="FunctionTok"/>
+        </w:rPr>
+        <w:t xml:space="preserve">e</w:t>
+      </w:r>
+      <w:r>
+        <w:rPr>
+          <w:rStyle w:val="NormalTok"/>
+        </w:rPr>
+        <w:t xml:space="preserve">(</w:t>
+      </w:r>
+      <w:r>
+        <w:rPr>
+          <w:rStyle w:val="KeywordTok"/>
+        </w:rPr>
+        <w:t xml:space="preserve">sample</w:t>
+      </w:r>
+      <w:r>
+        <w:rPr>
+          <w:rStyle w:val="NormalTok"/>
+        </w:rPr>
+        <w:t xml:space="preserve">) == 1, </w:t>
+      </w:r>
+      <w:r>
+        <w:rPr>
+          <w:rStyle w:val="KeywordTok"/>
+        </w:rPr>
+        <w:t xml:space="preserve">sum</w:t>
+      </w:r>
+      <w:r>
+        <w:rPr>
+          <w:rStyle w:val="NormalTok"/>
+        </w:rPr>
+        <w:t xml:space="preserve">(ln_lp)</w:t>
+      </w:r>
+    </w:p>
+    <w:p>
+      <w:pPr>
+        <w:pStyle w:val="FirstParagraph"/>
+      </w:pPr>
+      <w:r>
+        <w:rPr>
+          <w:bCs/>
+          <w:b/>
+        </w:rPr>
+        <w:t xml:space="preserve">Lưu ý kỹ thuật</w:t>
+      </w:r>
+      <w:r>
+        <w:t xml:space="preserve">:</w:t>
+      </w:r>
+      <w:r>
+        <w:t xml:space="preserve"> </w:t>
+      </w:r>
+      <w:r>
+        <w:rPr>
+          <w:rStyle w:val="VerbatimChar"/>
+        </w:rPr>
+        <w:t xml:space="preserve">vce(cluster cluster_id)</w:t>
+      </w:r>
+      <w:r>
+        <w:t xml:space="preserve"> </w:t>
+      </w:r>
+      <w:r>
+        <w:t xml:space="preserve">điều chỉnh cho tương quan trong cùng nhóm quốc gia-ngành (intra-cluster correlation), khác với HC1 ở chỗ cho phép phương sai không đồng nhất lẫn tương quan trong cluster. Kết quả kỳ vọng: SE có thể tăng lên so với HC1 trong các cluster có nhiều doanh nghiệp tương tự (ví dụ, nhóm Ấn Độ sản xuất). Hệ số điểm ước lượng (point estimates) không thay đổi.</w:t>
+      </w:r>
+    </w:p>
+    <w:p>
+      <w:pPr>
+        <w:pStyle w:val="BodyText"/>
+      </w:pPr>
+      <w:r>
+        <w:rPr>
+          <w:bCs/>
+          <w:b/>
+        </w:rPr>
+        <w:t xml:space="preserve">Tham chiếu</w:t>
+      </w:r>
+      <w:r>
+        <w:t xml:space="preserve">: Cameron, A. C., &amp; Miller, D. L. (2015). A practitioner's guide to cluster-robust inference.</w:t>
+      </w:r>
+      <w:r>
+        <w:t xml:space="preserve"> </w:t>
+      </w:r>
+      <w:r>
+        <w:rPr>
+          <w:iCs/>
+          <w:i/>
+        </w:rPr>
+        <w:t xml:space="preserve">Journal of Human Resources, 50</w:t>
+      </w:r>
+      <w:r>
+        <w:t xml:space="preserve">(2), 317–372.</w:t>
+      </w:r>
+    </w:p>
     <w:bookmarkEnd w:id="128"/>
     <w:bookmarkEnd w:id="129"/>
+    <w:bookmarkEnd w:id="130"/>
     <w:sectPr>
       <w:pgSz w:h="16838" w:w="11906"/>
       <w:pgMar w:bottom="1134" w:left="1701" w:right="1134" w:top="1134"/>

</xml_diff>